<commit_message>
TS 5.1 Sanskrit Krama Paatam
</commit_message>
<xml_diff>
--- a/TS-Kramam/TS-5.1/TS 5.1 Sanskrit Krama Paatam Corrections.docx
+++ b/TS-Kramam/TS-5.1/TS 5.1 Sanskrit Krama Paatam Corrections.docx
@@ -1,6 +1,6 @@
 
 <file path=word/document.xml><?xml version="1.0" encoding="utf-8"?>
-<w:document xmlns:wpc="http://schemas.microsoft.com/office/word/2010/wordprocessingCanvas" xmlns:cx="http://schemas.microsoft.com/office/drawing/2014/chartex" xmlns:cx1="http://schemas.microsoft.com/office/drawing/2015/9/8/chartex" xmlns:mc="http://schemas.openxmlformats.org/markup-compatibility/2006" xmlns:o="urn:schemas-microsoft-com:office:office" xmlns:r="http://schemas.openxmlformats.org/officeDocument/2006/relationships" xmlns:m="http://schemas.openxmlformats.org/officeDocument/2006/math" xmlns:v="urn:schemas-microsoft-com:vml" xmlns:wp14="http://schemas.microsoft.com/office/word/2010/wordprocessingDrawing" xmlns:wp="http://schemas.openxmlformats.org/drawingml/2006/wordprocessingDrawing" xmlns:w10="urn:schemas-microsoft-com:office:word" xmlns:w="http://schemas.openxmlformats.org/wordprocessingml/2006/main" xmlns:w14="http://schemas.microsoft.com/office/word/2010/wordml" xmlns:w15="http://schemas.microsoft.com/office/word/2012/wordml" xmlns:w16se="http://schemas.microsoft.com/office/word/2015/wordml/symex" xmlns:wpg="http://schemas.microsoft.com/office/word/2010/wordprocessingGroup" xmlns:wpi="http://schemas.microsoft.com/office/word/2010/wordprocessingInk" xmlns:wne="http://schemas.microsoft.com/office/word/2006/wordml" xmlns:wps="http://schemas.microsoft.com/office/word/2010/wordprocessingShape" mc:Ignorable="w14 w15 w16se wp14">
+<w:document xmlns:wpc="http://schemas.microsoft.com/office/word/2010/wordprocessingCanvas" xmlns:cx="http://schemas.microsoft.com/office/drawing/2014/chartex" xmlns:cx1="http://schemas.microsoft.com/office/drawing/2015/9/8/chartex" xmlns:cx2="http://schemas.microsoft.com/office/drawing/2015/10/21/chartex" xmlns:cx3="http://schemas.microsoft.com/office/drawing/2016/5/9/chartex" xmlns:cx4="http://schemas.microsoft.com/office/drawing/2016/5/10/chartex" xmlns:cx5="http://schemas.microsoft.com/office/drawing/2016/5/11/chartex" xmlns:cx6="http://schemas.microsoft.com/office/drawing/2016/5/12/chartex" xmlns:cx7="http://schemas.microsoft.com/office/drawing/2016/5/13/chartex" xmlns:cx8="http://schemas.microsoft.com/office/drawing/2016/5/14/chartex" xmlns:mc="http://schemas.openxmlformats.org/markup-compatibility/2006" xmlns:aink="http://schemas.microsoft.com/office/drawing/2016/ink" xmlns:am3d="http://schemas.microsoft.com/office/drawing/2017/model3d" xmlns:o="urn:schemas-microsoft-com:office:office" xmlns:oel="http://schemas.microsoft.com/office/2019/extlst" xmlns:r="http://schemas.openxmlformats.org/officeDocument/2006/relationships" xmlns:m="http://schemas.openxmlformats.org/officeDocument/2006/math" xmlns:v="urn:schemas-microsoft-com:vml" xmlns:wp14="http://schemas.microsoft.com/office/word/2010/wordprocessingDrawing" xmlns:wp="http://schemas.openxmlformats.org/drawingml/2006/wordprocessingDrawing" xmlns:w10="urn:schemas-microsoft-com:office:word" xmlns:w="http://schemas.openxmlformats.org/wordprocessingml/2006/main" xmlns:w14="http://schemas.microsoft.com/office/word/2010/wordml" xmlns:w15="http://schemas.microsoft.com/office/word/2012/wordml" xmlns:w16cex="http://schemas.microsoft.com/office/word/2018/wordml/cex" xmlns:w16cid="http://schemas.microsoft.com/office/word/2016/wordml/cid" xmlns:w16="http://schemas.microsoft.com/office/word/2018/wordml" xmlns:w16du="http://schemas.microsoft.com/office/word/2023/wordml/word16du" xmlns:w16sdtdh="http://schemas.microsoft.com/office/word/2020/wordml/sdtdatahash" xmlns:w16sdtfl="http://schemas.microsoft.com/office/word/2024/wordml/sdtformatlock" xmlns:w16se="http://schemas.microsoft.com/office/word/2015/wordml/symex" xmlns:wpg="http://schemas.microsoft.com/office/word/2010/wordprocessingGroup" xmlns:wpi="http://schemas.microsoft.com/office/word/2010/wordprocessingInk" xmlns:wne="http://schemas.microsoft.com/office/word/2006/wordml" xmlns:wps="http://schemas.microsoft.com/office/word/2010/wordprocessingShape" mc:Ignorable="w14 w15 w16se w16cid w16 w16cex w16sdtdh w16sdtfl w16du wp14">
   <w:body>
     <w:p>
       <w:pPr>
@@ -8,13 +8,12 @@
         <w:rPr>
           <w:b/>
           <w:bCs/>
+          <w:color w:val="EE0000"/>
           <w:sz w:val="32"/>
           <w:szCs w:val="32"/>
           <w:u w:val="single"/>
         </w:rPr>
       </w:pPr>
-      <w:bookmarkStart w:id="0" w:name="_GoBack"/>
-      <w:bookmarkEnd w:id="0"/>
       <w:r>
         <w:rPr>
           <w:b/>
@@ -85,18 +84,19 @@
         </w:rPr>
         <w:t xml:space="preserve">Observed till </w:t>
       </w:r>
-      <w:bookmarkStart w:id="1" w:name="_Hlk113214516"/>
+      <w:proofErr w:type="spellStart"/>
       <w:r>
         <w:rPr>
           <w:b/>
           <w:bCs/>
+          <w:color w:val="EE0000"/>
           <w:sz w:val="32"/>
           <w:szCs w:val="32"/>
           <w:u w:val="single"/>
         </w:rPr>
-        <w:t>30th Sep 2022</w:t>
+        <w:t>xxxxxxxxx</w:t>
       </w:r>
-      <w:bookmarkEnd w:id="1"/>
+      <w:proofErr w:type="spellEnd"/>
     </w:p>
     <w:p>
       <w:pPr>
@@ -260,48 +260,18 @@
                 <w:b/>
                 <w:color w:val="000000"/>
                 <w:sz w:val="28"/>
-                <w:szCs w:val="32"/>
-              </w:rPr>
-            </w:pPr>
-            <w:r>
-              <w:rPr>
-                <w:rFonts w:cs="Arial"/>
-                <w:b/>
-                <w:color w:val="000000"/>
-                <w:sz w:val="28"/>
-                <w:szCs w:val="32"/>
-              </w:rPr>
-              <w:t>T.S.</w:t>
-            </w:r>
-            <w:r>
-              <w:rPr>
-                <w:rFonts w:cs="Arial"/>
-                <w:b/>
-                <w:color w:val="000000"/>
-                <w:sz w:val="28"/>
-                <w:szCs w:val="32"/>
-              </w:rPr>
-              <w:t>5.1.1.2</w:t>
-            </w:r>
-            <w:r>
-              <w:rPr>
-                <w:rFonts w:cs="Arial"/>
-                <w:b/>
-                <w:color w:val="000000"/>
-                <w:sz w:val="28"/>
-                <w:szCs w:val="32"/>
-              </w:rPr>
-              <w:t xml:space="preserve"> </w:t>
-            </w:r>
-            <w:r>
-              <w:rPr>
-                <w:rFonts w:cs="Arial"/>
-                <w:b/>
-                <w:color w:val="000000"/>
-                <w:sz w:val="28"/>
-                <w:szCs w:val="32"/>
-              </w:rPr>
-              <w:t>– Kramam</w:t>
+                <w:szCs w:val="28"/>
+              </w:rPr>
+            </w:pPr>
+            <w:r>
+              <w:rPr>
+                <w:rFonts w:cs="Arial"/>
+                <w:b/>
+                <w:color w:val="000000"/>
+                <w:sz w:val="28"/>
+                <w:szCs w:val="28"/>
+              </w:rPr>
+              <w:t>T.S.5.1.2.1 – Kramam</w:t>
             </w:r>
           </w:p>
           <w:p>
@@ -320,16 +290,16 @@
                 <w:b/>
                 <w:color w:val="000000"/>
                 <w:sz w:val="28"/>
-                <w:szCs w:val="32"/>
-              </w:rPr>
-            </w:pPr>
-            <w:r>
-              <w:rPr>
-                <w:rFonts w:cs="Arial"/>
-                <w:b/>
-                <w:color w:val="000000"/>
-                <w:sz w:val="28"/>
-                <w:szCs w:val="32"/>
+                <w:szCs w:val="28"/>
+              </w:rPr>
+            </w:pPr>
+            <w:r>
+              <w:rPr>
+                <w:rFonts w:cs="Arial"/>
+                <w:b/>
+                <w:color w:val="000000"/>
+                <w:sz w:val="28"/>
+                <w:szCs w:val="28"/>
               </w:rPr>
               <w:t xml:space="preserve">Krama Vaakyam No.– </w:t>
             </w:r>
@@ -339,9 +309,9 @@
                 <w:b/>
                 <w:color w:val="000000"/>
                 <w:sz w:val="28"/>
-                <w:szCs w:val="32"/>
-              </w:rPr>
-              <w:t>8</w:t>
+                <w:szCs w:val="28"/>
+              </w:rPr>
+              <w:t>11</w:t>
             </w:r>
           </w:p>
           <w:p>
@@ -369,37 +339,19 @@
                 <w:b/>
                 <w:color w:val="000000"/>
                 <w:sz w:val="28"/>
-                <w:szCs w:val="32"/>
-              </w:rPr>
-              <w:t>Panchaati No</w:t>
-            </w:r>
-            <w:r>
-              <w:rPr>
-                <w:rFonts w:cs="Arial"/>
-                <w:b/>
-                <w:color w:val="000000"/>
-                <w:szCs w:val="32"/>
-              </w:rPr>
-              <w:t>. -</w:t>
-            </w:r>
-            <w:r>
-              <w:rPr>
-                <w:rFonts w:cs="Arial"/>
-                <w:b/>
-                <w:color w:val="000000"/>
-                <w:szCs w:val="32"/>
-              </w:rPr>
-              <w:t xml:space="preserve"> </w:t>
-            </w:r>
-            <w:r>
-              <w:rPr>
-                <w:rFonts w:cs="Arial"/>
-                <w:b/>
-                <w:color w:val="000000"/>
-                <w:sz w:val="28"/>
-                <w:szCs w:val="32"/>
-              </w:rPr>
-              <w:t>2</w:t>
+                <w:szCs w:val="28"/>
+              </w:rPr>
+              <w:t xml:space="preserve">Panchaati No. - </w:t>
+            </w:r>
+            <w:r>
+              <w:rPr>
+                <w:rFonts w:cs="Arial"/>
+                <w:b/>
+                <w:color w:val="000000"/>
+                <w:sz w:val="28"/>
+                <w:szCs w:val="28"/>
+              </w:rPr>
+              <w:t>5</w:t>
             </w:r>
           </w:p>
         </w:tc>
@@ -421,96 +373,72 @@
                 <w:szCs w:val="40"/>
               </w:rPr>
             </w:pPr>
-            <w:proofErr w:type="spellStart"/>
-            <w:r>
-              <w:rPr>
-                <w:rFonts w:ascii="BRH Devanagari Extra" w:hAnsi="BRH Devanagari Extra" w:cs="BRH Devanagari Extra"/>
-                <w:color w:val="000000"/>
-                <w:sz w:val="40"/>
-                <w:szCs w:val="40"/>
-              </w:rPr>
-              <w:t>eÉÑ</w:t>
-            </w:r>
-            <w:proofErr w:type="spellEnd"/>
-            <w:r>
-              <w:rPr>
-                <w:rFonts w:ascii="BRH Malayalam Extra" w:hAnsi="BRH Malayalam Extra" w:cs="BRH Devanagari Extra"/>
-                <w:color w:val="000000"/>
-                <w:sz w:val="32"/>
-                <w:szCs w:val="40"/>
-              </w:rPr>
-              <w:t>–</w:t>
-            </w:r>
-            <w:proofErr w:type="spellStart"/>
-            <w:r>
-              <w:rPr>
-                <w:rFonts w:ascii="BRH Devanagari Extra" w:hAnsi="BRH Devanagari Extra" w:cs="BRH Devanagari Extra"/>
-                <w:color w:val="000000"/>
-                <w:sz w:val="40"/>
-                <w:szCs w:val="40"/>
-              </w:rPr>
-              <w:t>WÒû</w:t>
-            </w:r>
-            <w:proofErr w:type="spellEnd"/>
-            <w:r>
-              <w:rPr>
-                <w:rFonts w:ascii="BRH Malayalam Extra" w:hAnsi="BRH Malayalam Extra" w:cs="BRH Devanagari Extra"/>
-                <w:color w:val="000000"/>
-                <w:sz w:val="32"/>
-                <w:szCs w:val="40"/>
-              </w:rPr>
-              <w:t>–</w:t>
-            </w:r>
-            <w:proofErr w:type="spellStart"/>
-            <w:r>
-              <w:rPr>
-                <w:rFonts w:ascii="BRH Devanagari Extra" w:hAnsi="BRH Devanagari Extra" w:cs="BRH Devanagari Extra"/>
-                <w:color w:val="000000"/>
-                <w:sz w:val="40"/>
-                <w:szCs w:val="40"/>
-              </w:rPr>
-              <w:t>rÉÉ</w:t>
-            </w:r>
-            <w:proofErr w:type="spellEnd"/>
-            <w:r>
-              <w:rPr>
-                <w:rFonts w:ascii="BRH Malayalam Extra" w:hAnsi="BRH Malayalam Extra" w:cs="BRH Devanagari Extra"/>
-                <w:color w:val="000000"/>
-                <w:sz w:val="32"/>
-                <w:szCs w:val="40"/>
-              </w:rPr>
-              <w:t>–</w:t>
-            </w:r>
-            <w:proofErr w:type="spellStart"/>
-            <w:r>
-              <w:rPr>
-                <w:rFonts w:ascii="BRH Devanagari Extra" w:hAnsi="BRH Devanagari Extra" w:cs="BRH Devanagari Extra"/>
-                <w:color w:val="000000"/>
-                <w:sz w:val="40"/>
-                <w:szCs w:val="40"/>
-              </w:rPr>
-              <w:t>SÉWÒûþiÉÏÍpÉÈ</w:t>
-            </w:r>
-            <w:proofErr w:type="spellEnd"/>
-            <w:r>
-              <w:rPr>
-                <w:rFonts w:ascii="BRH Devanagari Extra" w:hAnsi="BRH Devanagari Extra" w:cs="BRH Devanagari Extra"/>
-                <w:color w:val="000000"/>
-                <w:sz w:val="40"/>
-                <w:szCs w:val="40"/>
-              </w:rPr>
-              <w:t xml:space="preserve"> | </w:t>
-            </w:r>
-            <w:proofErr w:type="spellStart"/>
-            <w:r>
-              <w:rPr>
-                <w:rFonts w:ascii="BRH Devanagari Extra" w:hAnsi="BRH Devanagari Extra" w:cs="BRH Devanagari Extra"/>
-                <w:color w:val="000000"/>
-                <w:sz w:val="40"/>
-                <w:szCs w:val="40"/>
-              </w:rPr>
-              <w:t>AÉWÒûþiÉÏ</w:t>
-            </w:r>
+            <w:r>
+              <w:rPr>
+                <w:rFonts w:ascii="BRH Devanagari Extra" w:hAnsi="BRH Devanagari Extra" w:cs="BRH Devanagari Extra"/>
+                <w:color w:val="000000"/>
+                <w:sz w:val="40"/>
+                <w:szCs w:val="40"/>
+              </w:rPr>
+              <w:t>A</w:t>
+            </w:r>
+            <w:r>
+              <w:rPr>
+                <w:rFonts w:ascii="BRH Malayalam Extra" w:hAnsi="BRH Malayalam Extra" w:cs="BRH Devanagari Extra"/>
+                <w:color w:val="000000"/>
+                <w:sz w:val="32"/>
+                <w:szCs w:val="40"/>
+              </w:rPr>
+              <w:t>–</w:t>
+            </w:r>
+            <w:r>
+              <w:rPr>
+                <w:rFonts w:ascii="BRH Devanagari Extra" w:hAnsi="BRH Devanagari Extra" w:cs="BRH Devanagari Extra"/>
+                <w:color w:val="000000"/>
+                <w:sz w:val="40"/>
+                <w:szCs w:val="40"/>
+              </w:rPr>
+              <w:t>aÉ×</w:t>
+            </w:r>
+            <w:r>
+              <w:rPr>
+                <w:rFonts w:ascii="BRH Malayalam Extra" w:hAnsi="BRH Malayalam Extra" w:cs="BRH Devanagari Extra"/>
+                <w:color w:val="000000"/>
+                <w:sz w:val="32"/>
+                <w:szCs w:val="40"/>
+              </w:rPr>
+              <w:t>–</w:t>
+            </w:r>
+            <w:proofErr w:type="spellStart"/>
+            <w:r>
+              <w:rPr>
+                <w:rFonts w:ascii="BRH Devanagari Extra" w:hAnsi="BRH Devanagari Extra" w:cs="BRH Devanagari Extra"/>
+                <w:color w:val="000000"/>
+                <w:sz w:val="40"/>
+                <w:szCs w:val="40"/>
+              </w:rPr>
+              <w:t>phÉ</w:t>
+            </w:r>
+            <w:proofErr w:type="spellEnd"/>
+            <w:r>
+              <w:rPr>
+                <w:rFonts w:ascii="BRH Malayalam Extra" w:hAnsi="BRH Malayalam Extra" w:cs="BRH Devanagari Extra"/>
+                <w:color w:val="000000"/>
+                <w:sz w:val="32"/>
+                <w:szCs w:val="40"/>
+              </w:rPr>
+              <w:t>–</w:t>
+            </w:r>
+            <w:r>
+              <w:rPr>
+                <w:rFonts w:ascii="BRH Devanagari Extra" w:hAnsi="BRH Devanagari Extra" w:cs="BRH Devanagari Extra"/>
+                <w:color w:val="000000"/>
+                <w:sz w:val="40"/>
+                <w:szCs w:val="40"/>
+              </w:rPr>
+              <w:t xml:space="preserve">lÉç </w:t>
+            </w:r>
+            <w:proofErr w:type="spellStart"/>
             <w:r>
               <w:rPr>
                 <w:rFonts w:ascii="BRH Devanagari Extra" w:hAnsi="BRH Devanagari Extra" w:cs="BRH Devanagari Extra"/>
@@ -519,27 +447,92 @@
                 <w:szCs w:val="40"/>
                 <w:highlight w:val="yellow"/>
               </w:rPr>
-              <w:t>ÍpÉ</w:t>
-            </w:r>
-            <w:proofErr w:type="spellEnd"/>
-            <w:r>
-              <w:rPr>
-                <w:rFonts w:ascii="BRH Malayalam Extra" w:hAnsi="BRH Malayalam Extra" w:cs="BRH Devanagari Extra"/>
-                <w:color w:val="000000"/>
-                <w:sz w:val="32"/>
-                <w:szCs w:val="40"/>
-              </w:rPr>
-              <w:t>–</w:t>
-            </w:r>
-            <w:proofErr w:type="spellStart"/>
-            <w:r>
-              <w:rPr>
-                <w:rFonts w:ascii="BRH Devanagari Extra" w:hAnsi="BRH Devanagari Extra" w:cs="BRH Devanagari Extra"/>
-                <w:color w:val="000000"/>
-                <w:sz w:val="40"/>
-                <w:szCs w:val="40"/>
-              </w:rPr>
-              <w:t>UåuÉ</w:t>
+              <w:t>UzÉþ</w:t>
+            </w:r>
+            <w:r>
+              <w:rPr>
+                <w:rFonts w:ascii="BRH Devanagari Extra" w:hAnsi="BRH Devanagari Extra" w:cs="BRH Devanagari Extra"/>
+                <w:color w:val="000000"/>
+                <w:sz w:val="40"/>
+                <w:szCs w:val="40"/>
+              </w:rPr>
+              <w:t>lÉÉqÉç</w:t>
+            </w:r>
+            <w:proofErr w:type="spellEnd"/>
+            <w:r>
+              <w:rPr>
+                <w:rFonts w:ascii="BRH Devanagari Extra" w:hAnsi="BRH Devanagari Extra" w:cs="BRH Devanagari Extra"/>
+                <w:color w:val="000000"/>
+                <w:sz w:val="40"/>
+                <w:szCs w:val="40"/>
+              </w:rPr>
+              <w:t xml:space="preserve"> | U</w:t>
+            </w:r>
+            <w:r>
+              <w:rPr>
+                <w:rFonts w:ascii="BRH Malayalam Extra" w:hAnsi="BRH Malayalam Extra" w:cs="BRH Devanagari Extra"/>
+                <w:color w:val="000000"/>
+                <w:sz w:val="32"/>
+                <w:szCs w:val="40"/>
+              </w:rPr>
+              <w:t>–</w:t>
+            </w:r>
+            <w:r>
+              <w:rPr>
+                <w:rFonts w:ascii="BRH Devanagari Extra" w:hAnsi="BRH Devanagari Extra" w:cs="BRH Devanagari Extra"/>
+                <w:color w:val="000000"/>
+                <w:sz w:val="40"/>
+                <w:szCs w:val="40"/>
+              </w:rPr>
+              <w:t>zÉ</w:t>
+            </w:r>
+            <w:r>
+              <w:rPr>
+                <w:rFonts w:ascii="BRH Malayalam Extra" w:hAnsi="BRH Malayalam Extra" w:cs="BRH Devanagari Extra"/>
+                <w:color w:val="000000"/>
+                <w:sz w:val="32"/>
+                <w:szCs w:val="40"/>
+              </w:rPr>
+              <w:t>–</w:t>
+            </w:r>
+            <w:proofErr w:type="spellStart"/>
+            <w:r>
+              <w:rPr>
+                <w:rFonts w:ascii="BRH Devanagari Extra" w:hAnsi="BRH Devanagari Extra" w:cs="BRH Devanagari Extra"/>
+                <w:color w:val="000000"/>
+                <w:sz w:val="40"/>
+                <w:szCs w:val="40"/>
+              </w:rPr>
+              <w:t>lÉÉqÉ</w:t>
+            </w:r>
+            <w:proofErr w:type="spellEnd"/>
+            <w:r>
+              <w:rPr>
+                <w:rFonts w:ascii="BRH Devanagari Extra" w:hAnsi="BRH Devanagari Extra" w:cs="BRH Devanagari Extra"/>
+                <w:color w:val="000000"/>
+                <w:sz w:val="40"/>
+                <w:szCs w:val="40"/>
+              </w:rPr>
+              <w:t>×</w:t>
+            </w:r>
+            <w:r>
+              <w:rPr>
+                <w:rFonts w:ascii="BRH Malayalam Extra" w:hAnsi="BRH Malayalam Extra" w:cs="BRH Devanagari Extra"/>
+                <w:color w:val="000000"/>
+                <w:sz w:val="32"/>
+                <w:szCs w:val="40"/>
+              </w:rPr>
+              <w:t>–</w:t>
+            </w:r>
+            <w:proofErr w:type="spellStart"/>
+            <w:r>
+              <w:rPr>
+                <w:rFonts w:ascii="BRH Devanagari Extra" w:hAnsi="BRH Devanagari Extra" w:cs="BRH Devanagari Extra"/>
+                <w:color w:val="000000"/>
+                <w:sz w:val="40"/>
+                <w:szCs w:val="40"/>
+              </w:rPr>
+              <w:t>iÉxrÉþ</w:t>
             </w:r>
             <w:proofErr w:type="spellEnd"/>
             <w:r>
@@ -571,7 +564,3009 @@
                 <w:szCs w:val="40"/>
               </w:rPr>
             </w:pPr>
-            <w:proofErr w:type="spellStart"/>
+            <w:r>
+              <w:rPr>
+                <w:rFonts w:ascii="BRH Devanagari Extra" w:hAnsi="BRH Devanagari Extra" w:cs="BRH Devanagari Extra"/>
+                <w:color w:val="000000"/>
+                <w:sz w:val="40"/>
+                <w:szCs w:val="40"/>
+              </w:rPr>
+              <w:t>A</w:t>
+            </w:r>
+            <w:r>
+              <w:rPr>
+                <w:rFonts w:ascii="BRH Malayalam Extra" w:hAnsi="BRH Malayalam Extra" w:cs="BRH Devanagari Extra"/>
+                <w:color w:val="000000"/>
+                <w:sz w:val="32"/>
+                <w:szCs w:val="40"/>
+              </w:rPr>
+              <w:t>–</w:t>
+            </w:r>
+            <w:r>
+              <w:rPr>
+                <w:rFonts w:ascii="BRH Devanagari Extra" w:hAnsi="BRH Devanagari Extra" w:cs="BRH Devanagari Extra"/>
+                <w:color w:val="000000"/>
+                <w:sz w:val="40"/>
+                <w:szCs w:val="40"/>
+              </w:rPr>
+              <w:t>aÉ×</w:t>
+            </w:r>
+            <w:r>
+              <w:rPr>
+                <w:rFonts w:ascii="BRH Malayalam Extra" w:hAnsi="BRH Malayalam Extra" w:cs="BRH Devanagari Extra"/>
+                <w:color w:val="000000"/>
+                <w:sz w:val="32"/>
+                <w:szCs w:val="40"/>
+              </w:rPr>
+              <w:t>–</w:t>
+            </w:r>
+            <w:proofErr w:type="spellStart"/>
+            <w:r>
+              <w:rPr>
+                <w:rFonts w:ascii="BRH Devanagari Extra" w:hAnsi="BRH Devanagari Extra" w:cs="BRH Devanagari Extra"/>
+                <w:color w:val="000000"/>
+                <w:sz w:val="40"/>
+                <w:szCs w:val="40"/>
+              </w:rPr>
+              <w:t>phÉ</w:t>
+            </w:r>
+            <w:proofErr w:type="spellEnd"/>
+            <w:r>
+              <w:rPr>
+                <w:rFonts w:ascii="BRH Malayalam Extra" w:hAnsi="BRH Malayalam Extra" w:cs="BRH Devanagari Extra"/>
+                <w:color w:val="000000"/>
+                <w:sz w:val="32"/>
+                <w:szCs w:val="40"/>
+              </w:rPr>
+              <w:t>–</w:t>
+            </w:r>
+            <w:r>
+              <w:rPr>
+                <w:rFonts w:ascii="BRH Devanagari Extra" w:hAnsi="BRH Devanagari Extra" w:cs="BRH Devanagari Extra"/>
+                <w:color w:val="000000"/>
+                <w:sz w:val="40"/>
+                <w:szCs w:val="40"/>
+              </w:rPr>
+              <w:t xml:space="preserve">lÉç </w:t>
+            </w:r>
+            <w:r>
+              <w:rPr>
+                <w:rFonts w:ascii="BRH Devanagari Extra" w:hAnsi="BRH Devanagari Extra" w:cs="BRH Devanagari Extra"/>
+                <w:color w:val="000000"/>
+                <w:sz w:val="40"/>
+                <w:szCs w:val="40"/>
+                <w:highlight w:val="green"/>
+              </w:rPr>
+              <w:t>U</w:t>
+            </w:r>
+            <w:r>
+              <w:rPr>
+                <w:rFonts w:ascii="BRH Malayalam Extra" w:hAnsi="BRH Malayalam Extra" w:cs="BRH Devanagari Extra"/>
+                <w:color w:val="000000"/>
+                <w:sz w:val="32"/>
+                <w:szCs w:val="40"/>
+                <w:highlight w:val="green"/>
+              </w:rPr>
+              <w:t>–</w:t>
+            </w:r>
+            <w:r>
+              <w:rPr>
+                <w:rFonts w:ascii="BRH Devanagari Extra" w:hAnsi="BRH Devanagari Extra" w:cs="BRH Devanagari Extra"/>
+                <w:color w:val="000000"/>
+                <w:sz w:val="40"/>
+                <w:szCs w:val="40"/>
+                <w:highlight w:val="green"/>
+              </w:rPr>
+              <w:t>zÉ</w:t>
+            </w:r>
+            <w:r>
+              <w:rPr>
+                <w:rFonts w:ascii="BRH Malayalam Extra" w:hAnsi="BRH Malayalam Extra" w:cs="BRH Devanagari Extra"/>
+                <w:color w:val="000000"/>
+                <w:sz w:val="32"/>
+                <w:szCs w:val="40"/>
+                <w:highlight w:val="green"/>
+              </w:rPr>
+              <w:t>–</w:t>
+            </w:r>
+            <w:proofErr w:type="spellStart"/>
+            <w:r>
+              <w:rPr>
+                <w:rFonts w:ascii="BRH Devanagari Extra" w:hAnsi="BRH Devanagari Extra" w:cs="BRH Devanagari Extra"/>
+                <w:color w:val="000000"/>
+                <w:sz w:val="40"/>
+                <w:szCs w:val="40"/>
+                <w:highlight w:val="green"/>
+              </w:rPr>
+              <w:t>l</w:t>
+            </w:r>
+            <w:r>
+              <w:rPr>
+                <w:rFonts w:ascii="BRH Devanagari Extra" w:hAnsi="BRH Devanagari Extra" w:cs="BRH Devanagari Extra"/>
+                <w:color w:val="000000"/>
+                <w:sz w:val="40"/>
+                <w:szCs w:val="40"/>
+              </w:rPr>
+              <w:t>ÉÉqÉç</w:t>
+            </w:r>
+            <w:proofErr w:type="spellEnd"/>
+            <w:r>
+              <w:rPr>
+                <w:rFonts w:ascii="BRH Devanagari Extra" w:hAnsi="BRH Devanagari Extra" w:cs="BRH Devanagari Extra"/>
+                <w:color w:val="000000"/>
+                <w:sz w:val="40"/>
+                <w:szCs w:val="40"/>
+              </w:rPr>
+              <w:t xml:space="preserve"> | U</w:t>
+            </w:r>
+            <w:r>
+              <w:rPr>
+                <w:rFonts w:ascii="BRH Malayalam Extra" w:hAnsi="BRH Malayalam Extra" w:cs="BRH Devanagari Extra"/>
+                <w:color w:val="000000"/>
+                <w:sz w:val="32"/>
+                <w:szCs w:val="40"/>
+              </w:rPr>
+              <w:t>–</w:t>
+            </w:r>
+            <w:r>
+              <w:rPr>
+                <w:rFonts w:ascii="BRH Devanagari Extra" w:hAnsi="BRH Devanagari Extra" w:cs="BRH Devanagari Extra"/>
+                <w:color w:val="000000"/>
+                <w:sz w:val="40"/>
+                <w:szCs w:val="40"/>
+              </w:rPr>
+              <w:t>zÉ</w:t>
+            </w:r>
+            <w:r>
+              <w:rPr>
+                <w:rFonts w:ascii="BRH Malayalam Extra" w:hAnsi="BRH Malayalam Extra" w:cs="BRH Devanagari Extra"/>
+                <w:color w:val="000000"/>
+                <w:sz w:val="32"/>
+                <w:szCs w:val="40"/>
+              </w:rPr>
+              <w:t>–</w:t>
+            </w:r>
+            <w:proofErr w:type="spellStart"/>
+            <w:r>
+              <w:rPr>
+                <w:rFonts w:ascii="BRH Devanagari Extra" w:hAnsi="BRH Devanagari Extra" w:cs="BRH Devanagari Extra"/>
+                <w:color w:val="000000"/>
+                <w:sz w:val="40"/>
+                <w:szCs w:val="40"/>
+              </w:rPr>
+              <w:t>lÉÉqÉ</w:t>
+            </w:r>
+            <w:proofErr w:type="spellEnd"/>
+            <w:r>
+              <w:rPr>
+                <w:rFonts w:ascii="BRH Devanagari Extra" w:hAnsi="BRH Devanagari Extra" w:cs="BRH Devanagari Extra"/>
+                <w:color w:val="000000"/>
+                <w:sz w:val="40"/>
+                <w:szCs w:val="40"/>
+              </w:rPr>
+              <w:t>×</w:t>
+            </w:r>
+            <w:r>
+              <w:rPr>
+                <w:rFonts w:ascii="BRH Malayalam Extra" w:hAnsi="BRH Malayalam Extra" w:cs="BRH Devanagari Extra"/>
+                <w:color w:val="000000"/>
+                <w:sz w:val="32"/>
+                <w:szCs w:val="40"/>
+              </w:rPr>
+              <w:t>–</w:t>
+            </w:r>
+            <w:proofErr w:type="spellStart"/>
+            <w:r>
+              <w:rPr>
+                <w:rFonts w:ascii="BRH Devanagari Extra" w:hAnsi="BRH Devanagari Extra" w:cs="BRH Devanagari Extra"/>
+                <w:color w:val="000000"/>
+                <w:sz w:val="40"/>
+                <w:szCs w:val="40"/>
+              </w:rPr>
+              <w:t>iÉxrÉþ</w:t>
+            </w:r>
+            <w:proofErr w:type="spellEnd"/>
+            <w:r>
+              <w:rPr>
+                <w:rFonts w:ascii="BRH Devanagari Extra" w:hAnsi="BRH Devanagari Extra" w:cs="BRH Devanagari Extra"/>
+                <w:color w:val="000000"/>
+                <w:sz w:val="40"/>
+                <w:szCs w:val="40"/>
+              </w:rPr>
+              <w:t xml:space="preserve"> |</w:t>
+            </w:r>
+          </w:p>
+        </w:tc>
+      </w:tr>
+      <w:tr>
+        <w:trPr>
+          <w:trHeight w:val="962"/>
+        </w:trPr>
+        <w:tc>
+          <w:tcPr>
+            <w:tcW w:w="3906" w:type="dxa"/>
+          </w:tcPr>
+          <w:p>
+            <w:pPr>
+              <w:widowControl w:val="0"/>
+              <w:tabs>
+                <w:tab w:val="left" w:pos="993"/>
+              </w:tabs>
+              <w:autoSpaceDE w:val="0"/>
+              <w:autoSpaceDN w:val="0"/>
+              <w:adjustRightInd w:val="0"/>
+              <w:spacing w:before="0" w:line="252" w:lineRule="auto"/>
+              <w:ind w:right="297"/>
+              <w:rPr>
+                <w:rFonts w:cs="Arial"/>
+                <w:b/>
+                <w:color w:val="000000"/>
+                <w:sz w:val="28"/>
+                <w:szCs w:val="28"/>
+              </w:rPr>
+            </w:pPr>
+            <w:r>
+              <w:rPr>
+                <w:rFonts w:cs="Arial"/>
+                <w:b/>
+                <w:color w:val="000000"/>
+                <w:sz w:val="28"/>
+                <w:szCs w:val="28"/>
+              </w:rPr>
+              <w:t>T.S.5.1.2.</w:t>
+            </w:r>
+            <w:r>
+              <w:rPr>
+                <w:rFonts w:cs="Arial"/>
+                <w:b/>
+                <w:color w:val="000000"/>
+                <w:sz w:val="28"/>
+                <w:szCs w:val="28"/>
+              </w:rPr>
+              <w:t>2</w:t>
+            </w:r>
+            <w:r>
+              <w:rPr>
+                <w:rFonts w:cs="Arial"/>
+                <w:b/>
+                <w:color w:val="000000"/>
+                <w:sz w:val="28"/>
+                <w:szCs w:val="28"/>
+              </w:rPr>
+              <w:t xml:space="preserve"> – Kramam</w:t>
+            </w:r>
+          </w:p>
+          <w:p>
+            <w:pPr>
+              <w:widowControl w:val="0"/>
+              <w:tabs>
+                <w:tab w:val="left" w:pos="993"/>
+              </w:tabs>
+              <w:autoSpaceDE w:val="0"/>
+              <w:autoSpaceDN w:val="0"/>
+              <w:adjustRightInd w:val="0"/>
+              <w:spacing w:before="0" w:line="252" w:lineRule="auto"/>
+              <w:ind w:right="297"/>
+              <w:rPr>
+                <w:rFonts w:cs="Arial"/>
+                <w:b/>
+                <w:color w:val="000000"/>
+                <w:sz w:val="28"/>
+                <w:szCs w:val="28"/>
+              </w:rPr>
+            </w:pPr>
+            <w:r>
+              <w:rPr>
+                <w:rFonts w:cs="Arial"/>
+                <w:b/>
+                <w:color w:val="000000"/>
+                <w:sz w:val="28"/>
+                <w:szCs w:val="28"/>
+              </w:rPr>
+              <w:t xml:space="preserve">Krama Vaakyam No.– </w:t>
+            </w:r>
+            <w:r>
+              <w:rPr>
+                <w:rFonts w:cs="Arial"/>
+                <w:b/>
+                <w:color w:val="000000"/>
+                <w:sz w:val="28"/>
+                <w:szCs w:val="28"/>
+              </w:rPr>
+              <w:t>40,41,42</w:t>
+            </w:r>
+          </w:p>
+          <w:p>
+            <w:pPr>
+              <w:widowControl w:val="0"/>
+              <w:tabs>
+                <w:tab w:val="left" w:pos="993"/>
+              </w:tabs>
+              <w:autoSpaceDE w:val="0"/>
+              <w:autoSpaceDN w:val="0"/>
+              <w:adjustRightInd w:val="0"/>
+              <w:spacing w:before="0" w:line="252" w:lineRule="auto"/>
+              <w:ind w:right="297"/>
+              <w:rPr>
+                <w:rFonts w:cs="Arial"/>
+                <w:b/>
+                <w:color w:val="000000"/>
+                <w:sz w:val="28"/>
+                <w:szCs w:val="28"/>
+              </w:rPr>
+            </w:pPr>
+            <w:r>
+              <w:rPr>
+                <w:rFonts w:cs="Arial"/>
+                <w:b/>
+                <w:color w:val="000000"/>
+                <w:sz w:val="28"/>
+                <w:szCs w:val="28"/>
+              </w:rPr>
+              <w:t xml:space="preserve">Panchaati No. - </w:t>
+            </w:r>
+            <w:r>
+              <w:rPr>
+                <w:rFonts w:cs="Arial"/>
+                <w:b/>
+                <w:color w:val="000000"/>
+                <w:sz w:val="28"/>
+                <w:szCs w:val="28"/>
+              </w:rPr>
+              <w:t>6</w:t>
+            </w:r>
+          </w:p>
+        </w:tc>
+        <w:tc>
+          <w:tcPr>
+            <w:tcW w:w="5103" w:type="dxa"/>
+          </w:tcPr>
+          <w:p>
+            <w:pPr>
+              <w:widowControl w:val="0"/>
+              <w:autoSpaceDE w:val="0"/>
+              <w:autoSpaceDN w:val="0"/>
+              <w:adjustRightInd w:val="0"/>
+              <w:spacing w:before="0" w:line="240" w:lineRule="auto"/>
+              <w:rPr>
+                <w:rFonts w:ascii="BRH Devanagari Extra" w:hAnsi="BRH Devanagari Extra" w:cs="BRH Devanagari Extra"/>
+                <w:color w:val="000000"/>
+                <w:sz w:val="40"/>
+                <w:szCs w:val="40"/>
+              </w:rPr>
+            </w:pPr>
+            <w:r>
+              <w:rPr>
+                <w:rFonts w:ascii="BRH Devanagari Extra" w:hAnsi="BRH Devanagari Extra" w:cs="BRH Devanagari Extra"/>
+                <w:color w:val="000000"/>
+                <w:sz w:val="40"/>
+                <w:szCs w:val="40"/>
+              </w:rPr>
+              <w:t>pÉ</w:t>
+            </w:r>
+            <w:r>
+              <w:rPr>
+                <w:rFonts w:ascii="BRH Malayalam Extra" w:hAnsi="BRH Malayalam Extra" w:cs="BRH Devanagari Extra"/>
+                <w:color w:val="000000"/>
+                <w:sz w:val="32"/>
+                <w:szCs w:val="40"/>
+              </w:rPr>
+              <w:t>–</w:t>
+            </w:r>
+            <w:r>
+              <w:rPr>
+                <w:rFonts w:ascii="BRH Devanagari Extra" w:hAnsi="BRH Devanagari Extra" w:cs="BRH Devanagari Extra"/>
+                <w:color w:val="000000"/>
+                <w:sz w:val="40"/>
+                <w:szCs w:val="40"/>
+              </w:rPr>
+              <w:t>U</w:t>
+            </w:r>
+            <w:r>
+              <w:rPr>
+                <w:rFonts w:ascii="BRH Malayalam Extra" w:hAnsi="BRH Malayalam Extra" w:cs="BRH Devanagari Extra"/>
+                <w:color w:val="000000"/>
+                <w:sz w:val="32"/>
+                <w:szCs w:val="40"/>
+              </w:rPr>
+              <w:t>–</w:t>
+            </w:r>
+            <w:proofErr w:type="spellStart"/>
+            <w:r>
+              <w:rPr>
+                <w:rFonts w:ascii="BRH Devanagari Extra" w:hAnsi="BRH Devanagari Extra" w:cs="BRH Devanagari Extra"/>
+                <w:color w:val="000000"/>
+                <w:sz w:val="40"/>
+                <w:szCs w:val="40"/>
+              </w:rPr>
+              <w:t>irÉlÉÑþÌuÉ</w:t>
+            </w:r>
+            <w:r>
+              <w:rPr>
+                <w:rFonts w:ascii="BRH Devanagari Extra" w:hAnsi="BRH Devanagari Extra" w:cs="BRH Devanagari Extra"/>
+                <w:color w:val="000000"/>
+                <w:sz w:val="40"/>
+                <w:szCs w:val="40"/>
+                <w:highlight w:val="yellow"/>
+              </w:rPr>
+              <w:t>irÉæ</w:t>
+            </w:r>
+            <w:proofErr w:type="spellEnd"/>
+            <w:r>
+              <w:rPr>
+                <w:rFonts w:ascii="BRH Devanagari Extra" w:hAnsi="BRH Devanagari Extra" w:cs="BRH Devanagari Extra"/>
+                <w:color w:val="000000"/>
+                <w:sz w:val="40"/>
+                <w:szCs w:val="40"/>
+              </w:rPr>
+              <w:t xml:space="preserve"> | </w:t>
+            </w:r>
+            <w:proofErr w:type="spellStart"/>
+            <w:r>
+              <w:rPr>
+                <w:rFonts w:ascii="BRH Devanagari Extra" w:hAnsi="BRH Devanagari Extra" w:cs="BRH Devanagari Extra"/>
+                <w:color w:val="000000"/>
+                <w:sz w:val="40"/>
+                <w:szCs w:val="40"/>
+              </w:rPr>
+              <w:t>AlÉÑþÌuÉ</w:t>
+            </w:r>
+            <w:r>
+              <w:rPr>
+                <w:rFonts w:ascii="BRH Devanagari Extra" w:hAnsi="BRH Devanagari Extra" w:cs="BRH Devanagari Extra"/>
+                <w:color w:val="000000"/>
+                <w:sz w:val="40"/>
+                <w:szCs w:val="40"/>
+                <w:highlight w:val="yellow"/>
+              </w:rPr>
+              <w:t>irÉæ</w:t>
+            </w:r>
+            <w:proofErr w:type="spellEnd"/>
+            <w:r>
+              <w:rPr>
+                <w:rFonts w:ascii="BRH Devanagari Extra" w:hAnsi="BRH Devanagari Extra" w:cs="BRH Devanagari Extra"/>
+                <w:color w:val="000000"/>
+                <w:sz w:val="40"/>
+                <w:szCs w:val="40"/>
+              </w:rPr>
+              <w:t xml:space="preserve"> </w:t>
+            </w:r>
+            <w:proofErr w:type="spellStart"/>
+            <w:r>
+              <w:rPr>
+                <w:rFonts w:ascii="BRH Devanagari Extra" w:hAnsi="BRH Devanagari Extra" w:cs="BRH Devanagari Extra"/>
+                <w:color w:val="000000"/>
+                <w:sz w:val="40"/>
+                <w:szCs w:val="40"/>
+              </w:rPr>
+              <w:t>mÉÉmÉuÉxrÉ</w:t>
+            </w:r>
+            <w:proofErr w:type="spellEnd"/>
+            <w:r>
+              <w:rPr>
+                <w:rFonts w:ascii="BRH Malayalam Extra" w:hAnsi="BRH Malayalam Extra" w:cs="BRH Devanagari Extra"/>
+                <w:color w:val="000000"/>
+                <w:sz w:val="32"/>
+                <w:szCs w:val="40"/>
+              </w:rPr>
+              <w:t>–</w:t>
+            </w:r>
+            <w:proofErr w:type="spellStart"/>
+            <w:r>
+              <w:rPr>
+                <w:rFonts w:ascii="BRH Devanagari Extra" w:hAnsi="BRH Devanagari Extra" w:cs="BRH Devanagari Extra"/>
+                <w:color w:val="000000"/>
+                <w:sz w:val="40"/>
+                <w:szCs w:val="40"/>
+              </w:rPr>
+              <w:t>xÉqÉç</w:t>
+            </w:r>
+            <w:proofErr w:type="spellEnd"/>
+            <w:r>
+              <w:rPr>
+                <w:rFonts w:ascii="BRH Devanagari Extra" w:hAnsi="BRH Devanagari Extra" w:cs="BRH Devanagari Extra"/>
+                <w:color w:val="000000"/>
+                <w:sz w:val="40"/>
+                <w:szCs w:val="40"/>
+              </w:rPr>
+              <w:t xml:space="preserve"> | </w:t>
+            </w:r>
+            <w:proofErr w:type="spellStart"/>
+            <w:r>
+              <w:rPr>
+                <w:rFonts w:ascii="BRH Devanagari Extra" w:hAnsi="BRH Devanagari Extra" w:cs="BRH Devanagari Extra"/>
+                <w:color w:val="000000"/>
+                <w:sz w:val="40"/>
+                <w:szCs w:val="40"/>
+              </w:rPr>
+              <w:t>AlÉÑþÌuÉ</w:t>
+            </w:r>
+            <w:r>
+              <w:rPr>
+                <w:rFonts w:ascii="BRH Devanagari Extra" w:hAnsi="BRH Devanagari Extra" w:cs="BRH Devanagari Extra"/>
+                <w:color w:val="000000"/>
+                <w:sz w:val="40"/>
+                <w:szCs w:val="40"/>
+                <w:highlight w:val="yellow"/>
+              </w:rPr>
+              <w:t>irÉÉ</w:t>
+            </w:r>
+            <w:proofErr w:type="spellEnd"/>
+            <w:r>
+              <w:rPr>
+                <w:rFonts w:ascii="BRH Malayalam Extra" w:hAnsi="BRH Malayalam Extra" w:cs="BRH Devanagari Extra"/>
+                <w:color w:val="000000"/>
+                <w:sz w:val="32"/>
+                <w:szCs w:val="40"/>
+                <w:highlight w:val="yellow"/>
+              </w:rPr>
+              <w:t>–</w:t>
+            </w:r>
+            <w:r>
+              <w:rPr>
+                <w:rFonts w:ascii="BRH Devanagari Extra" w:hAnsi="BRH Devanagari Extra" w:cs="BRH Devanagari Extra"/>
+                <w:color w:val="000000"/>
+                <w:sz w:val="40"/>
+                <w:szCs w:val="40"/>
+              </w:rPr>
+              <w:t xml:space="preserve"> </w:t>
+            </w:r>
+            <w:proofErr w:type="spellStart"/>
+            <w:r>
+              <w:rPr>
+                <w:rFonts w:ascii="BRH Devanagari Extra" w:hAnsi="BRH Devanagari Extra" w:cs="BRH Devanagari Extra"/>
+                <w:color w:val="000000"/>
+                <w:sz w:val="40"/>
+                <w:szCs w:val="40"/>
+              </w:rPr>
+              <w:t>CirÉlÉÑþ</w:t>
+            </w:r>
+            <w:proofErr w:type="spellEnd"/>
+            <w:r>
+              <w:rPr>
+                <w:rFonts w:ascii="BRH Devanagari Extra" w:hAnsi="BRH Devanagari Extra" w:cs="BRH Devanagari Extra"/>
+                <w:color w:val="000000"/>
+                <w:sz w:val="40"/>
+                <w:szCs w:val="40"/>
+              </w:rPr>
+              <w:t xml:space="preserve"> - </w:t>
+            </w:r>
+            <w:proofErr w:type="spellStart"/>
+            <w:r>
+              <w:rPr>
+                <w:rFonts w:ascii="BRH Devanagari Extra" w:hAnsi="BRH Devanagari Extra" w:cs="BRH Devanagari Extra"/>
+                <w:color w:val="000000"/>
+                <w:sz w:val="40"/>
+                <w:szCs w:val="40"/>
+              </w:rPr>
+              <w:t>ÌuÉ</w:t>
+            </w:r>
+            <w:proofErr w:type="spellEnd"/>
+            <w:r>
+              <w:rPr>
+                <w:rFonts w:ascii="BRH Malayalam Extra" w:hAnsi="BRH Malayalam Extra" w:cs="BRH Devanagari Extra"/>
+                <w:color w:val="000000"/>
+                <w:sz w:val="32"/>
+                <w:szCs w:val="40"/>
+                <w:highlight w:val="yellow"/>
+              </w:rPr>
+              <w:t>–</w:t>
+            </w:r>
+            <w:proofErr w:type="spellStart"/>
+            <w:r>
+              <w:rPr>
+                <w:rFonts w:ascii="BRH Devanagari Extra" w:hAnsi="BRH Devanagari Extra" w:cs="BRH Devanagari Extra"/>
+                <w:color w:val="000000"/>
+                <w:sz w:val="40"/>
+                <w:szCs w:val="40"/>
+                <w:highlight w:val="yellow"/>
+              </w:rPr>
+              <w:t>irÉæ</w:t>
+            </w:r>
+            <w:proofErr w:type="spellEnd"/>
+            <w:r>
+              <w:rPr>
+                <w:rFonts w:ascii="BRH Malayalam Extra" w:hAnsi="BRH Malayalam Extra" w:cs="BRH Devanagari Extra"/>
+                <w:color w:val="000000"/>
+                <w:sz w:val="32"/>
+                <w:szCs w:val="40"/>
+                <w:highlight w:val="yellow"/>
+              </w:rPr>
+              <w:t>–</w:t>
+            </w:r>
+            <w:r>
+              <w:rPr>
+                <w:rFonts w:ascii="BRH Devanagari Extra" w:hAnsi="BRH Devanagari Extra" w:cs="BRH Devanagari Extra"/>
+                <w:color w:val="000000"/>
+                <w:sz w:val="40"/>
+                <w:szCs w:val="40"/>
+              </w:rPr>
+              <w:t xml:space="preserve"> |</w:t>
+            </w:r>
+          </w:p>
+        </w:tc>
+        <w:tc>
+          <w:tcPr>
+            <w:tcW w:w="5386" w:type="dxa"/>
+          </w:tcPr>
+          <w:p>
+            <w:pPr>
+              <w:widowControl w:val="0"/>
+              <w:autoSpaceDE w:val="0"/>
+              <w:autoSpaceDN w:val="0"/>
+              <w:adjustRightInd w:val="0"/>
+              <w:spacing w:before="0" w:line="240" w:lineRule="auto"/>
+              <w:rPr>
+                <w:rFonts w:ascii="BRH Devanagari Extra" w:hAnsi="BRH Devanagari Extra" w:cs="BRH Devanagari Extra"/>
+                <w:color w:val="000000"/>
+                <w:sz w:val="40"/>
+                <w:szCs w:val="40"/>
+              </w:rPr>
+            </w:pPr>
+            <w:r>
+              <w:rPr>
+                <w:rFonts w:ascii="BRH Devanagari Extra" w:hAnsi="BRH Devanagari Extra" w:cs="BRH Devanagari Extra"/>
+                <w:color w:val="000000"/>
+                <w:sz w:val="40"/>
+                <w:szCs w:val="40"/>
+              </w:rPr>
+              <w:t>pÉ</w:t>
+            </w:r>
+            <w:r>
+              <w:rPr>
+                <w:rFonts w:ascii="BRH Malayalam Extra" w:hAnsi="BRH Malayalam Extra" w:cs="BRH Devanagari Extra"/>
+                <w:color w:val="000000"/>
+                <w:sz w:val="32"/>
+                <w:szCs w:val="40"/>
+              </w:rPr>
+              <w:t>–</w:t>
+            </w:r>
+            <w:r>
+              <w:rPr>
+                <w:rFonts w:ascii="BRH Devanagari Extra" w:hAnsi="BRH Devanagari Extra" w:cs="BRH Devanagari Extra"/>
+                <w:color w:val="000000"/>
+                <w:sz w:val="40"/>
+                <w:szCs w:val="40"/>
+              </w:rPr>
+              <w:t>U</w:t>
+            </w:r>
+            <w:r>
+              <w:rPr>
+                <w:rFonts w:ascii="BRH Malayalam Extra" w:hAnsi="BRH Malayalam Extra" w:cs="BRH Devanagari Extra"/>
+                <w:color w:val="000000"/>
+                <w:sz w:val="32"/>
+                <w:szCs w:val="40"/>
+              </w:rPr>
+              <w:t>–</w:t>
+            </w:r>
+            <w:proofErr w:type="spellStart"/>
+            <w:r>
+              <w:rPr>
+                <w:rFonts w:ascii="BRH Devanagari Extra" w:hAnsi="BRH Devanagari Extra" w:cs="BRH Devanagari Extra"/>
+                <w:color w:val="000000"/>
+                <w:sz w:val="40"/>
+                <w:szCs w:val="40"/>
+              </w:rPr>
+              <w:t>irÉlÉÑþÌuÉ</w:t>
+            </w:r>
+            <w:r>
+              <w:rPr>
+                <w:rFonts w:ascii="BRH Devanagari Extra" w:hAnsi="BRH Devanagari Extra" w:cs="BRH Devanagari Extra"/>
+                <w:color w:val="000000"/>
+                <w:sz w:val="40"/>
+                <w:szCs w:val="40"/>
+                <w:highlight w:val="green"/>
+              </w:rPr>
+              <w:t>iirÉæ</w:t>
+            </w:r>
+            <w:proofErr w:type="spellEnd"/>
+            <w:r>
+              <w:rPr>
+                <w:rFonts w:ascii="BRH Devanagari Extra" w:hAnsi="BRH Devanagari Extra" w:cs="BRH Devanagari Extra"/>
+                <w:color w:val="000000"/>
+                <w:sz w:val="40"/>
+                <w:szCs w:val="40"/>
+              </w:rPr>
+              <w:t xml:space="preserve"> | </w:t>
+            </w:r>
+            <w:proofErr w:type="spellStart"/>
+            <w:r>
+              <w:rPr>
+                <w:rFonts w:ascii="BRH Devanagari Extra" w:hAnsi="BRH Devanagari Extra" w:cs="BRH Devanagari Extra"/>
+                <w:color w:val="000000"/>
+                <w:sz w:val="40"/>
+                <w:szCs w:val="40"/>
+              </w:rPr>
+              <w:t>AlÉÑþÌuÉ</w:t>
+            </w:r>
+            <w:r>
+              <w:rPr>
+                <w:rFonts w:ascii="BRH Devanagari Extra" w:hAnsi="BRH Devanagari Extra" w:cs="BRH Devanagari Extra"/>
+                <w:color w:val="000000"/>
+                <w:sz w:val="40"/>
+                <w:szCs w:val="40"/>
+                <w:highlight w:val="green"/>
+              </w:rPr>
+              <w:t>iirÉæ</w:t>
+            </w:r>
+            <w:proofErr w:type="spellEnd"/>
+            <w:r>
+              <w:rPr>
+                <w:rFonts w:ascii="BRH Devanagari Extra" w:hAnsi="BRH Devanagari Extra" w:cs="BRH Devanagari Extra"/>
+                <w:color w:val="000000"/>
+                <w:sz w:val="40"/>
+                <w:szCs w:val="40"/>
+              </w:rPr>
+              <w:t xml:space="preserve"> </w:t>
+            </w:r>
+            <w:proofErr w:type="spellStart"/>
+            <w:r>
+              <w:rPr>
+                <w:rFonts w:ascii="BRH Devanagari Extra" w:hAnsi="BRH Devanagari Extra" w:cs="BRH Devanagari Extra"/>
+                <w:color w:val="000000"/>
+                <w:sz w:val="40"/>
+                <w:szCs w:val="40"/>
+              </w:rPr>
+              <w:t>mÉÉmÉuÉxrÉ</w:t>
+            </w:r>
+            <w:proofErr w:type="spellEnd"/>
+            <w:r>
+              <w:rPr>
+                <w:rFonts w:ascii="BRH Malayalam Extra" w:hAnsi="BRH Malayalam Extra" w:cs="BRH Devanagari Extra"/>
+                <w:color w:val="000000"/>
+                <w:sz w:val="32"/>
+                <w:szCs w:val="40"/>
+              </w:rPr>
+              <w:t>–</w:t>
+            </w:r>
+            <w:proofErr w:type="spellStart"/>
+            <w:r>
+              <w:rPr>
+                <w:rFonts w:ascii="BRH Devanagari Extra" w:hAnsi="BRH Devanagari Extra" w:cs="BRH Devanagari Extra"/>
+                <w:color w:val="000000"/>
+                <w:sz w:val="40"/>
+                <w:szCs w:val="40"/>
+              </w:rPr>
+              <w:t>xÉqÉç</w:t>
+            </w:r>
+            <w:proofErr w:type="spellEnd"/>
+            <w:r>
+              <w:rPr>
+                <w:rFonts w:ascii="BRH Devanagari Extra" w:hAnsi="BRH Devanagari Extra" w:cs="BRH Devanagari Extra"/>
+                <w:color w:val="000000"/>
+                <w:sz w:val="40"/>
+                <w:szCs w:val="40"/>
+              </w:rPr>
+              <w:t xml:space="preserve"> | </w:t>
+            </w:r>
+            <w:proofErr w:type="spellStart"/>
+            <w:r>
+              <w:rPr>
+                <w:rFonts w:ascii="BRH Devanagari Extra" w:hAnsi="BRH Devanagari Extra" w:cs="BRH Devanagari Extra"/>
+                <w:color w:val="000000"/>
+                <w:sz w:val="40"/>
+                <w:szCs w:val="40"/>
+              </w:rPr>
+              <w:t>AlÉÑþÌuÉ</w:t>
+            </w:r>
+            <w:r>
+              <w:rPr>
+                <w:rFonts w:ascii="BRH Devanagari Extra" w:hAnsi="BRH Devanagari Extra" w:cs="BRH Devanagari Extra"/>
+                <w:color w:val="000000"/>
+                <w:sz w:val="40"/>
+                <w:szCs w:val="40"/>
+                <w:highlight w:val="green"/>
+              </w:rPr>
+              <w:t>iirÉÉ</w:t>
+            </w:r>
+            <w:proofErr w:type="spellEnd"/>
+            <w:r>
+              <w:rPr>
+                <w:rFonts w:ascii="BRH Malayalam Extra" w:hAnsi="BRH Malayalam Extra" w:cs="BRH Devanagari Extra"/>
+                <w:color w:val="000000"/>
+                <w:sz w:val="32"/>
+                <w:szCs w:val="40"/>
+                <w:highlight w:val="green"/>
+              </w:rPr>
+              <w:t>–</w:t>
+            </w:r>
+            <w:r>
+              <w:rPr>
+                <w:rFonts w:ascii="BRH Devanagari Extra" w:hAnsi="BRH Devanagari Extra" w:cs="BRH Devanagari Extra"/>
+                <w:color w:val="000000"/>
+                <w:sz w:val="40"/>
+                <w:szCs w:val="40"/>
+              </w:rPr>
+              <w:t xml:space="preserve"> </w:t>
+            </w:r>
+            <w:proofErr w:type="spellStart"/>
+            <w:r>
+              <w:rPr>
+                <w:rFonts w:ascii="BRH Devanagari Extra" w:hAnsi="BRH Devanagari Extra" w:cs="BRH Devanagari Extra"/>
+                <w:color w:val="000000"/>
+                <w:sz w:val="40"/>
+                <w:szCs w:val="40"/>
+              </w:rPr>
+              <w:t>CirÉlÉÑþ</w:t>
+            </w:r>
+            <w:proofErr w:type="spellEnd"/>
+            <w:r>
+              <w:rPr>
+                <w:rFonts w:ascii="BRH Devanagari Extra" w:hAnsi="BRH Devanagari Extra" w:cs="BRH Devanagari Extra"/>
+                <w:color w:val="000000"/>
+                <w:sz w:val="40"/>
+                <w:szCs w:val="40"/>
+              </w:rPr>
+              <w:t xml:space="preserve"> - </w:t>
+            </w:r>
+            <w:proofErr w:type="spellStart"/>
+            <w:r>
+              <w:rPr>
+                <w:rFonts w:ascii="BRH Devanagari Extra" w:hAnsi="BRH Devanagari Extra" w:cs="BRH Devanagari Extra"/>
+                <w:color w:val="000000"/>
+                <w:sz w:val="40"/>
+                <w:szCs w:val="40"/>
+              </w:rPr>
+              <w:t>ÌuÉ</w:t>
+            </w:r>
+            <w:proofErr w:type="spellEnd"/>
+            <w:r>
+              <w:rPr>
+                <w:rFonts w:ascii="BRH Malayalam Extra" w:hAnsi="BRH Malayalam Extra" w:cs="BRH Devanagari Extra"/>
+                <w:color w:val="000000"/>
+                <w:sz w:val="32"/>
+                <w:szCs w:val="40"/>
+                <w:highlight w:val="green"/>
+              </w:rPr>
+              <w:t>–</w:t>
+            </w:r>
+            <w:proofErr w:type="spellStart"/>
+            <w:r>
+              <w:rPr>
+                <w:rFonts w:ascii="BRH Devanagari Extra" w:hAnsi="BRH Devanagari Extra" w:cs="BRH Devanagari Extra"/>
+                <w:color w:val="000000"/>
+                <w:sz w:val="40"/>
+                <w:szCs w:val="40"/>
+                <w:highlight w:val="green"/>
+              </w:rPr>
+              <w:t>iirÉæ</w:t>
+            </w:r>
+            <w:proofErr w:type="spellEnd"/>
+            <w:r>
+              <w:rPr>
+                <w:rFonts w:ascii="BRH Malayalam Extra" w:hAnsi="BRH Malayalam Extra" w:cs="BRH Devanagari Extra"/>
+                <w:color w:val="000000"/>
+                <w:sz w:val="32"/>
+                <w:szCs w:val="40"/>
+                <w:highlight w:val="green"/>
+              </w:rPr>
+              <w:t>–</w:t>
+            </w:r>
+            <w:r>
+              <w:rPr>
+                <w:rFonts w:ascii="BRH Devanagari Extra" w:hAnsi="BRH Devanagari Extra" w:cs="BRH Devanagari Extra"/>
+                <w:color w:val="000000"/>
+                <w:sz w:val="40"/>
+                <w:szCs w:val="40"/>
+              </w:rPr>
+              <w:t xml:space="preserve"> |</w:t>
+            </w:r>
+          </w:p>
+        </w:tc>
+      </w:tr>
+      <w:tr>
+        <w:trPr>
+          <w:trHeight w:val="962"/>
+        </w:trPr>
+        <w:tc>
+          <w:tcPr>
+            <w:tcW w:w="3906" w:type="dxa"/>
+          </w:tcPr>
+          <w:p>
+            <w:pPr>
+              <w:widowControl w:val="0"/>
+              <w:tabs>
+                <w:tab w:val="left" w:pos="993"/>
+              </w:tabs>
+              <w:autoSpaceDE w:val="0"/>
+              <w:autoSpaceDN w:val="0"/>
+              <w:adjustRightInd w:val="0"/>
+              <w:spacing w:before="0" w:line="252" w:lineRule="auto"/>
+              <w:ind w:right="297"/>
+              <w:rPr>
+                <w:rFonts w:cs="Arial"/>
+                <w:b/>
+                <w:color w:val="000000"/>
+                <w:sz w:val="28"/>
+                <w:szCs w:val="28"/>
+              </w:rPr>
+            </w:pPr>
+            <w:r>
+              <w:rPr>
+                <w:rFonts w:cs="Arial"/>
+                <w:b/>
+                <w:color w:val="000000"/>
+                <w:sz w:val="28"/>
+                <w:szCs w:val="28"/>
+              </w:rPr>
+              <w:t>T.S.5.1.2.</w:t>
+            </w:r>
+            <w:r>
+              <w:rPr>
+                <w:rFonts w:cs="Arial"/>
+                <w:b/>
+                <w:color w:val="000000"/>
+                <w:sz w:val="28"/>
+                <w:szCs w:val="28"/>
+              </w:rPr>
+              <w:t>4</w:t>
+            </w:r>
+            <w:r>
+              <w:rPr>
+                <w:rFonts w:cs="Arial"/>
+                <w:b/>
+                <w:color w:val="000000"/>
+                <w:sz w:val="28"/>
+                <w:szCs w:val="28"/>
+              </w:rPr>
+              <w:t xml:space="preserve"> – Kramam</w:t>
+            </w:r>
+          </w:p>
+          <w:p>
+            <w:pPr>
+              <w:widowControl w:val="0"/>
+              <w:tabs>
+                <w:tab w:val="left" w:pos="993"/>
+              </w:tabs>
+              <w:autoSpaceDE w:val="0"/>
+              <w:autoSpaceDN w:val="0"/>
+              <w:adjustRightInd w:val="0"/>
+              <w:spacing w:before="0" w:line="252" w:lineRule="auto"/>
+              <w:ind w:right="297"/>
+              <w:rPr>
+                <w:rFonts w:cs="Arial"/>
+                <w:b/>
+                <w:color w:val="000000"/>
+                <w:sz w:val="28"/>
+                <w:szCs w:val="28"/>
+              </w:rPr>
+            </w:pPr>
+            <w:r>
+              <w:rPr>
+                <w:rFonts w:cs="Arial"/>
+                <w:b/>
+                <w:color w:val="000000"/>
+                <w:sz w:val="28"/>
+                <w:szCs w:val="28"/>
+              </w:rPr>
+              <w:t xml:space="preserve">Krama Vaakyam No.– </w:t>
+            </w:r>
+            <w:r>
+              <w:rPr>
+                <w:rFonts w:cs="Arial"/>
+                <w:b/>
+                <w:color w:val="000000"/>
+                <w:sz w:val="28"/>
+                <w:szCs w:val="28"/>
+              </w:rPr>
+              <w:t>2</w:t>
+            </w:r>
+          </w:p>
+          <w:p>
+            <w:pPr>
+              <w:widowControl w:val="0"/>
+              <w:tabs>
+                <w:tab w:val="left" w:pos="993"/>
+              </w:tabs>
+              <w:autoSpaceDE w:val="0"/>
+              <w:autoSpaceDN w:val="0"/>
+              <w:adjustRightInd w:val="0"/>
+              <w:spacing w:before="0" w:line="252" w:lineRule="auto"/>
+              <w:ind w:right="297"/>
+              <w:rPr>
+                <w:rFonts w:cs="Arial"/>
+                <w:b/>
+                <w:color w:val="000000"/>
+                <w:sz w:val="28"/>
+                <w:szCs w:val="28"/>
+              </w:rPr>
+            </w:pPr>
+            <w:r>
+              <w:rPr>
+                <w:rFonts w:cs="Arial"/>
+                <w:b/>
+                <w:color w:val="000000"/>
+                <w:sz w:val="28"/>
+                <w:szCs w:val="28"/>
+              </w:rPr>
+              <w:t xml:space="preserve">Panchaati No. - </w:t>
+            </w:r>
+            <w:r>
+              <w:rPr>
+                <w:rFonts w:cs="Arial"/>
+                <w:b/>
+                <w:color w:val="000000"/>
+                <w:sz w:val="28"/>
+                <w:szCs w:val="28"/>
+              </w:rPr>
+              <w:t>8</w:t>
+            </w:r>
+          </w:p>
+        </w:tc>
+        <w:tc>
+          <w:tcPr>
+            <w:tcW w:w="5103" w:type="dxa"/>
+          </w:tcPr>
+          <w:p>
+            <w:pPr>
+              <w:widowControl w:val="0"/>
+              <w:autoSpaceDE w:val="0"/>
+              <w:autoSpaceDN w:val="0"/>
+              <w:adjustRightInd w:val="0"/>
+              <w:spacing w:before="0" w:line="240" w:lineRule="auto"/>
+              <w:rPr>
+                <w:rFonts w:ascii="BRH Devanagari Extra" w:hAnsi="BRH Devanagari Extra" w:cs="BRH Devanagari Extra"/>
+                <w:color w:val="000000"/>
+                <w:sz w:val="40"/>
+                <w:szCs w:val="40"/>
+              </w:rPr>
+            </w:pPr>
+            <w:r>
+              <w:rPr>
+                <w:rFonts w:ascii="BRH Devanagari Extra" w:hAnsi="BRH Devanagari Extra" w:cs="BRH Devanagari Extra"/>
+                <w:color w:val="000000"/>
+                <w:sz w:val="40"/>
+                <w:szCs w:val="40"/>
+              </w:rPr>
+              <w:t>L</w:t>
+            </w:r>
+            <w:r>
+              <w:rPr>
+                <w:rFonts w:ascii="BRH Malayalam Extra" w:hAnsi="BRH Malayalam Extra" w:cs="BRH Devanagari Extra"/>
+                <w:color w:val="000000"/>
+                <w:sz w:val="32"/>
+                <w:szCs w:val="40"/>
+              </w:rPr>
+              <w:t>–</w:t>
+            </w:r>
+            <w:r>
+              <w:rPr>
+                <w:rFonts w:ascii="BRH Devanagari Extra" w:hAnsi="BRH Devanagari Extra" w:cs="BRH Devanagari Extra"/>
+                <w:color w:val="000000"/>
+                <w:sz w:val="40"/>
+                <w:szCs w:val="40"/>
+              </w:rPr>
+              <w:t>uÉ mÉ</w:t>
+            </w:r>
+            <w:r>
+              <w:rPr>
+                <w:rFonts w:ascii="BRH Malayalam Extra" w:hAnsi="BRH Malayalam Extra" w:cs="BRH Devanagari Extra"/>
+                <w:color w:val="000000"/>
+                <w:sz w:val="32"/>
+                <w:szCs w:val="40"/>
+              </w:rPr>
+              <w:t>–</w:t>
+            </w:r>
+            <w:proofErr w:type="spellStart"/>
+            <w:r>
+              <w:rPr>
+                <w:rFonts w:ascii="BRH Devanagari Extra" w:hAnsi="BRH Devanagari Extra" w:cs="BRH Devanagari Extra"/>
+                <w:color w:val="000000"/>
+                <w:sz w:val="40"/>
+                <w:szCs w:val="40"/>
+              </w:rPr>
+              <w:t>zÉÔlÉç</w:t>
+            </w:r>
+            <w:proofErr w:type="spellEnd"/>
+            <w:r>
+              <w:rPr>
+                <w:rFonts w:ascii="BRH Devanagari Extra" w:hAnsi="BRH Devanagari Extra" w:cs="BRH Devanagari Extra"/>
+                <w:color w:val="000000"/>
+                <w:sz w:val="40"/>
+                <w:szCs w:val="40"/>
+              </w:rPr>
+              <w:t xml:space="preserve"> | m</w:t>
+            </w:r>
+            <w:r>
+              <w:rPr>
+                <w:rFonts w:ascii="BRH Devanagari Extra" w:hAnsi="BRH Devanagari Extra" w:cs="BRH Devanagari Extra"/>
+                <w:color w:val="000000"/>
+                <w:sz w:val="40"/>
+                <w:szCs w:val="40"/>
+                <w:highlight w:val="yellow"/>
+              </w:rPr>
+              <w:t>É</w:t>
+            </w:r>
+            <w:r>
+              <w:rPr>
+                <w:rFonts w:ascii="BRH Malayalam Extra" w:hAnsi="BRH Malayalam Extra" w:cs="BRH Devanagari Extra"/>
+                <w:color w:val="000000"/>
+                <w:sz w:val="32"/>
+                <w:szCs w:val="40"/>
+                <w:highlight w:val="yellow"/>
+              </w:rPr>
+              <w:t>–</w:t>
+            </w:r>
+            <w:proofErr w:type="spellStart"/>
+            <w:r>
+              <w:rPr>
+                <w:rFonts w:ascii="BRH Devanagari Extra" w:hAnsi="BRH Devanagari Extra" w:cs="BRH Devanagari Extra"/>
+                <w:color w:val="000000"/>
+                <w:sz w:val="40"/>
+                <w:szCs w:val="40"/>
+                <w:highlight w:val="yellow"/>
+              </w:rPr>
+              <w:t>zÉÑ</w:t>
+            </w:r>
+            <w:r>
+              <w:rPr>
+                <w:rFonts w:ascii="BRH Devanagari Extra" w:hAnsi="BRH Devanagari Extra" w:cs="BRH Devanagari Extra"/>
+                <w:color w:val="000000"/>
+                <w:sz w:val="40"/>
+                <w:szCs w:val="40"/>
+              </w:rPr>
+              <w:t>lÉç</w:t>
+            </w:r>
+            <w:proofErr w:type="spellEnd"/>
+            <w:r>
+              <w:rPr>
+                <w:rFonts w:ascii="BRH Devanagari Extra" w:hAnsi="BRH Devanagari Extra" w:cs="BRH Devanagari Extra"/>
+                <w:color w:val="000000"/>
+                <w:sz w:val="40"/>
+                <w:szCs w:val="40"/>
+              </w:rPr>
+              <w:t xml:space="preserve"> ÌlÉ</w:t>
+            </w:r>
+            <w:r>
+              <w:rPr>
+                <w:rFonts w:ascii="BRH Malayalam Extra" w:hAnsi="BRH Malayalam Extra" w:cs="BRH Devanagari Extra"/>
+                <w:color w:val="000000"/>
+                <w:sz w:val="32"/>
+                <w:szCs w:val="40"/>
+              </w:rPr>
+              <w:t>–</w:t>
+            </w:r>
+            <w:proofErr w:type="spellStart"/>
+            <w:r>
+              <w:rPr>
+                <w:rFonts w:ascii="BRH Devanagari Extra" w:hAnsi="BRH Devanagari Extra" w:cs="BRH Devanagari Extra"/>
+                <w:color w:val="000000"/>
+                <w:sz w:val="40"/>
+                <w:szCs w:val="40"/>
+              </w:rPr>
+              <w:t>rÉÉïcrÉþ</w:t>
+            </w:r>
+            <w:proofErr w:type="spellEnd"/>
+            <w:r>
+              <w:rPr>
+                <w:rFonts w:ascii="BRH Devanagari Extra" w:hAnsi="BRH Devanagari Extra" w:cs="BRH Devanagari Extra"/>
+                <w:color w:val="000000"/>
+                <w:sz w:val="40"/>
+                <w:szCs w:val="40"/>
+              </w:rPr>
+              <w:t xml:space="preserve"> |</w:t>
+            </w:r>
+          </w:p>
+        </w:tc>
+        <w:tc>
+          <w:tcPr>
+            <w:tcW w:w="5386" w:type="dxa"/>
+          </w:tcPr>
+          <w:p>
+            <w:pPr>
+              <w:widowControl w:val="0"/>
+              <w:autoSpaceDE w:val="0"/>
+              <w:autoSpaceDN w:val="0"/>
+              <w:adjustRightInd w:val="0"/>
+              <w:spacing w:before="0" w:line="240" w:lineRule="auto"/>
+              <w:rPr>
+                <w:rFonts w:ascii="BRH Devanagari Extra" w:hAnsi="BRH Devanagari Extra" w:cs="BRH Devanagari Extra"/>
+                <w:color w:val="000000"/>
+                <w:sz w:val="40"/>
+                <w:szCs w:val="40"/>
+              </w:rPr>
+            </w:pPr>
+            <w:r>
+              <w:rPr>
+                <w:rFonts w:ascii="BRH Devanagari Extra" w:hAnsi="BRH Devanagari Extra" w:cs="BRH Devanagari Extra"/>
+                <w:color w:val="000000"/>
+                <w:sz w:val="40"/>
+                <w:szCs w:val="40"/>
+              </w:rPr>
+              <w:t>L</w:t>
+            </w:r>
+            <w:r>
+              <w:rPr>
+                <w:rFonts w:ascii="BRH Malayalam Extra" w:hAnsi="BRH Malayalam Extra" w:cs="BRH Devanagari Extra"/>
+                <w:color w:val="000000"/>
+                <w:sz w:val="32"/>
+                <w:szCs w:val="40"/>
+              </w:rPr>
+              <w:t>–</w:t>
+            </w:r>
+            <w:r>
+              <w:rPr>
+                <w:rFonts w:ascii="BRH Devanagari Extra" w:hAnsi="BRH Devanagari Extra" w:cs="BRH Devanagari Extra"/>
+                <w:color w:val="000000"/>
+                <w:sz w:val="40"/>
+                <w:szCs w:val="40"/>
+              </w:rPr>
+              <w:t>uÉ mÉ</w:t>
+            </w:r>
+            <w:r>
+              <w:rPr>
+                <w:rFonts w:ascii="BRH Malayalam Extra" w:hAnsi="BRH Malayalam Extra" w:cs="BRH Devanagari Extra"/>
+                <w:color w:val="000000"/>
+                <w:sz w:val="32"/>
+                <w:szCs w:val="40"/>
+              </w:rPr>
+              <w:t>–</w:t>
+            </w:r>
+            <w:proofErr w:type="spellStart"/>
+            <w:r>
+              <w:rPr>
+                <w:rFonts w:ascii="BRH Devanagari Extra" w:hAnsi="BRH Devanagari Extra" w:cs="BRH Devanagari Extra"/>
+                <w:color w:val="000000"/>
+                <w:sz w:val="40"/>
+                <w:szCs w:val="40"/>
+              </w:rPr>
+              <w:t>zÉÔlÉç</w:t>
+            </w:r>
+            <w:proofErr w:type="spellEnd"/>
+            <w:r>
+              <w:rPr>
+                <w:rFonts w:ascii="BRH Devanagari Extra" w:hAnsi="BRH Devanagari Extra" w:cs="BRH Devanagari Extra"/>
+                <w:color w:val="000000"/>
+                <w:sz w:val="40"/>
+                <w:szCs w:val="40"/>
+              </w:rPr>
+              <w:t xml:space="preserve"> | mÉ</w:t>
+            </w:r>
+            <w:r>
+              <w:rPr>
+                <w:rFonts w:ascii="BRH Malayalam Extra" w:hAnsi="BRH Malayalam Extra" w:cs="BRH Devanagari Extra"/>
+                <w:color w:val="000000"/>
+                <w:sz w:val="32"/>
+                <w:szCs w:val="40"/>
+                <w:highlight w:val="green"/>
+              </w:rPr>
+              <w:t>–</w:t>
+            </w:r>
+            <w:proofErr w:type="spellStart"/>
+            <w:r>
+              <w:rPr>
+                <w:rFonts w:ascii="BRH Devanagari Extra" w:hAnsi="BRH Devanagari Extra" w:cs="BRH Devanagari Extra"/>
+                <w:color w:val="000000"/>
+                <w:sz w:val="40"/>
+                <w:szCs w:val="40"/>
+                <w:highlight w:val="green"/>
+              </w:rPr>
+              <w:t>zÉ</w:t>
+            </w:r>
+            <w:r>
+              <w:rPr>
+                <w:rFonts w:ascii="BRH Devanagari Extra" w:hAnsi="BRH Devanagari Extra" w:cs="BRH Devanagari Extra"/>
+                <w:color w:val="000000"/>
+                <w:sz w:val="40"/>
+                <w:szCs w:val="40"/>
+              </w:rPr>
+              <w:t>ÔlÉç</w:t>
+            </w:r>
+            <w:proofErr w:type="spellEnd"/>
+            <w:r>
+              <w:rPr>
+                <w:rFonts w:ascii="BRH Devanagari Extra" w:hAnsi="BRH Devanagari Extra" w:cs="BRH Devanagari Extra"/>
+                <w:color w:val="000000"/>
+                <w:sz w:val="40"/>
+                <w:szCs w:val="40"/>
+              </w:rPr>
+              <w:t xml:space="preserve"> ÌlÉ</w:t>
+            </w:r>
+            <w:r>
+              <w:rPr>
+                <w:rFonts w:ascii="BRH Malayalam Extra" w:hAnsi="BRH Malayalam Extra" w:cs="BRH Devanagari Extra"/>
+                <w:color w:val="000000"/>
+                <w:sz w:val="32"/>
+                <w:szCs w:val="40"/>
+              </w:rPr>
+              <w:t>–</w:t>
+            </w:r>
+            <w:proofErr w:type="spellStart"/>
+            <w:r>
+              <w:rPr>
+                <w:rFonts w:ascii="BRH Devanagari Extra" w:hAnsi="BRH Devanagari Extra" w:cs="BRH Devanagari Extra"/>
+                <w:color w:val="000000"/>
+                <w:sz w:val="40"/>
+                <w:szCs w:val="40"/>
+              </w:rPr>
+              <w:t>rÉÉïcrÉþ</w:t>
+            </w:r>
+            <w:proofErr w:type="spellEnd"/>
+            <w:r>
+              <w:rPr>
+                <w:rFonts w:ascii="BRH Devanagari Extra" w:hAnsi="BRH Devanagari Extra" w:cs="BRH Devanagari Extra"/>
+                <w:color w:val="000000"/>
+                <w:sz w:val="40"/>
+                <w:szCs w:val="40"/>
+              </w:rPr>
+              <w:t xml:space="preserve"> |</w:t>
+            </w:r>
+          </w:p>
+        </w:tc>
+      </w:tr>
+      <w:tr>
+        <w:trPr>
+          <w:trHeight w:val="962"/>
+        </w:trPr>
+        <w:tc>
+          <w:tcPr>
+            <w:tcW w:w="3906" w:type="dxa"/>
+          </w:tcPr>
+          <w:p>
+            <w:pPr>
+              <w:widowControl w:val="0"/>
+              <w:tabs>
+                <w:tab w:val="left" w:pos="993"/>
+              </w:tabs>
+              <w:autoSpaceDE w:val="0"/>
+              <w:autoSpaceDN w:val="0"/>
+              <w:adjustRightInd w:val="0"/>
+              <w:spacing w:before="0" w:line="252" w:lineRule="auto"/>
+              <w:ind w:right="297"/>
+              <w:rPr>
+                <w:rFonts w:cs="Arial"/>
+                <w:b/>
+                <w:color w:val="000000"/>
+                <w:sz w:val="28"/>
+                <w:szCs w:val="28"/>
+              </w:rPr>
+            </w:pPr>
+            <w:r>
+              <w:rPr>
+                <w:rFonts w:cs="Arial"/>
+                <w:b/>
+                <w:color w:val="000000"/>
+                <w:sz w:val="28"/>
+                <w:szCs w:val="28"/>
+              </w:rPr>
+              <w:t>T.S.5.1.2.</w:t>
+            </w:r>
+            <w:r>
+              <w:rPr>
+                <w:rFonts w:cs="Arial"/>
+                <w:b/>
+                <w:color w:val="000000"/>
+                <w:sz w:val="28"/>
+                <w:szCs w:val="28"/>
+              </w:rPr>
+              <w:t>4</w:t>
+            </w:r>
+            <w:r>
+              <w:rPr>
+                <w:rFonts w:cs="Arial"/>
+                <w:b/>
+                <w:color w:val="000000"/>
+                <w:sz w:val="28"/>
+                <w:szCs w:val="28"/>
+              </w:rPr>
+              <w:t xml:space="preserve"> – Kramam</w:t>
+            </w:r>
+          </w:p>
+          <w:p>
+            <w:pPr>
+              <w:widowControl w:val="0"/>
+              <w:tabs>
+                <w:tab w:val="left" w:pos="993"/>
+              </w:tabs>
+              <w:autoSpaceDE w:val="0"/>
+              <w:autoSpaceDN w:val="0"/>
+              <w:adjustRightInd w:val="0"/>
+              <w:spacing w:before="0" w:line="252" w:lineRule="auto"/>
+              <w:ind w:right="297"/>
+              <w:rPr>
+                <w:rFonts w:cstheme="minorBidi"/>
+                <w:b/>
+                <w:color w:val="000000"/>
+                <w:sz w:val="28"/>
+                <w:szCs w:val="28"/>
+                <w:lang w:val="en-IN" w:bidi="ta-IN"/>
+              </w:rPr>
+            </w:pPr>
+            <w:r>
+              <w:rPr>
+                <w:rFonts w:cs="Arial"/>
+                <w:b/>
+                <w:color w:val="000000"/>
+                <w:sz w:val="28"/>
+                <w:szCs w:val="28"/>
+              </w:rPr>
+              <w:t xml:space="preserve">Krama Vaakyam No.– </w:t>
+            </w:r>
+            <w:r>
+              <w:rPr>
+                <w:rFonts w:cs="Arial"/>
+                <w:b/>
+                <w:color w:val="000000"/>
+                <w:sz w:val="28"/>
+                <w:szCs w:val="28"/>
+                <w:lang w:val="en-IN"/>
+              </w:rPr>
+              <w:t>41</w:t>
+            </w:r>
+          </w:p>
+          <w:p>
+            <w:pPr>
+              <w:widowControl w:val="0"/>
+              <w:tabs>
+                <w:tab w:val="left" w:pos="993"/>
+              </w:tabs>
+              <w:autoSpaceDE w:val="0"/>
+              <w:autoSpaceDN w:val="0"/>
+              <w:adjustRightInd w:val="0"/>
+              <w:spacing w:before="0" w:line="252" w:lineRule="auto"/>
+              <w:ind w:right="297"/>
+              <w:rPr>
+                <w:rFonts w:cs="Arial"/>
+                <w:b/>
+                <w:color w:val="000000"/>
+                <w:sz w:val="28"/>
+                <w:szCs w:val="28"/>
+              </w:rPr>
+            </w:pPr>
+            <w:r>
+              <w:rPr>
+                <w:rFonts w:cs="Arial"/>
+                <w:b/>
+                <w:color w:val="000000"/>
+                <w:sz w:val="28"/>
+                <w:szCs w:val="28"/>
+              </w:rPr>
+              <w:t xml:space="preserve">Panchaati No. - </w:t>
+            </w:r>
+            <w:r>
+              <w:rPr>
+                <w:rFonts w:cs="Arial"/>
+                <w:b/>
+                <w:color w:val="000000"/>
+                <w:sz w:val="28"/>
+                <w:szCs w:val="28"/>
+              </w:rPr>
+              <w:t>8</w:t>
+            </w:r>
+          </w:p>
+        </w:tc>
+        <w:tc>
+          <w:tcPr>
+            <w:tcW w:w="5103" w:type="dxa"/>
+          </w:tcPr>
+          <w:p>
+            <w:pPr>
+              <w:widowControl w:val="0"/>
+              <w:autoSpaceDE w:val="0"/>
+              <w:autoSpaceDN w:val="0"/>
+              <w:adjustRightInd w:val="0"/>
+              <w:spacing w:before="0" w:line="240" w:lineRule="auto"/>
+              <w:rPr>
+                <w:rFonts w:ascii="BRH Devanagari Extra" w:hAnsi="BRH Devanagari Extra" w:cs="BRH Devanagari Extra"/>
+                <w:color w:val="000000"/>
+                <w:sz w:val="40"/>
+                <w:szCs w:val="40"/>
+              </w:rPr>
+            </w:pPr>
+            <w:proofErr w:type="spellStart"/>
+            <w:r>
+              <w:rPr>
+                <w:rFonts w:ascii="BRH Devanagari Extra" w:hAnsi="BRH Devanagari Extra" w:cs="BRH Devanagari Extra"/>
+                <w:color w:val="000000"/>
+                <w:sz w:val="40"/>
+                <w:szCs w:val="40"/>
+              </w:rPr>
+              <w:t>AcNåûþÌWû</w:t>
+            </w:r>
+            <w:proofErr w:type="spellEnd"/>
+            <w:r>
+              <w:rPr>
+                <w:rFonts w:ascii="BRH Devanagari Extra" w:hAnsi="BRH Devanagari Extra" w:cs="BRH Devanagari Extra"/>
+                <w:color w:val="000000"/>
+                <w:sz w:val="40"/>
+                <w:szCs w:val="40"/>
+              </w:rPr>
+              <w:t xml:space="preserve"> | </w:t>
+            </w:r>
+            <w:r>
+              <w:rPr>
+                <w:rFonts w:ascii="BRH Devanagari Extra" w:hAnsi="BRH Devanagari Extra" w:cs="BRH Devanagari Extra"/>
+                <w:color w:val="000000"/>
+                <w:sz w:val="40"/>
+                <w:szCs w:val="40"/>
+                <w:highlight w:val="yellow"/>
+              </w:rPr>
+              <w:t>L</w:t>
+            </w:r>
+            <w:r>
+              <w:rPr>
+                <w:rFonts w:ascii="BRH Malayalam Extra" w:hAnsi="BRH Malayalam Extra" w:cs="BRH Devanagari Extra"/>
+                <w:color w:val="000000"/>
+                <w:sz w:val="32"/>
+                <w:szCs w:val="40"/>
+                <w:highlight w:val="yellow"/>
+              </w:rPr>
+              <w:t>–</w:t>
+            </w:r>
+            <w:proofErr w:type="spellStart"/>
+            <w:r>
+              <w:rPr>
+                <w:rFonts w:ascii="BRH Devanagari Extra" w:hAnsi="BRH Devanagari Extra" w:cs="BRH Devanagari Extra"/>
+                <w:color w:val="000000"/>
+                <w:sz w:val="40"/>
+                <w:szCs w:val="40"/>
+              </w:rPr>
+              <w:t>WûÏÌiÉþ</w:t>
+            </w:r>
+            <w:proofErr w:type="spellEnd"/>
+            <w:r>
+              <w:rPr>
+                <w:rFonts w:ascii="BRH Devanagari Extra" w:hAnsi="BRH Devanagari Extra" w:cs="BRH Devanagari Extra"/>
+                <w:color w:val="000000"/>
+                <w:sz w:val="40"/>
+                <w:szCs w:val="40"/>
+              </w:rPr>
+              <w:t xml:space="preserve"> |</w:t>
+            </w:r>
+          </w:p>
+        </w:tc>
+        <w:tc>
+          <w:tcPr>
+            <w:tcW w:w="5386" w:type="dxa"/>
+          </w:tcPr>
+          <w:p>
+            <w:pPr>
+              <w:widowControl w:val="0"/>
+              <w:autoSpaceDE w:val="0"/>
+              <w:autoSpaceDN w:val="0"/>
+              <w:adjustRightInd w:val="0"/>
+              <w:spacing w:before="0" w:line="240" w:lineRule="auto"/>
+              <w:rPr>
+                <w:rFonts w:ascii="BRH Devanagari Extra" w:hAnsi="BRH Devanagari Extra" w:cs="BRH Devanagari Extra"/>
+                <w:color w:val="000000"/>
+                <w:sz w:val="40"/>
+                <w:szCs w:val="40"/>
+              </w:rPr>
+            </w:pPr>
+            <w:proofErr w:type="spellStart"/>
+            <w:r>
+              <w:rPr>
+                <w:rFonts w:ascii="BRH Devanagari Extra" w:hAnsi="BRH Devanagari Extra" w:cs="BRH Devanagari Extra"/>
+                <w:color w:val="000000"/>
+                <w:sz w:val="40"/>
+                <w:szCs w:val="40"/>
+              </w:rPr>
+              <w:t>AcNåûþÌWû</w:t>
+            </w:r>
+            <w:proofErr w:type="spellEnd"/>
+            <w:r>
+              <w:rPr>
+                <w:rFonts w:ascii="BRH Devanagari Extra" w:hAnsi="BRH Devanagari Extra" w:cs="BRH Devanagari Extra"/>
+                <w:color w:val="000000"/>
+                <w:sz w:val="40"/>
+                <w:szCs w:val="40"/>
+              </w:rPr>
+              <w:t xml:space="preserve"> | </w:t>
+            </w:r>
+            <w:r>
+              <w:rPr>
+                <w:rFonts w:ascii="BRH Devanagari Extra" w:hAnsi="BRH Devanagari Extra" w:cs="BRH Devanagari Extra"/>
+                <w:color w:val="000000"/>
+                <w:sz w:val="40"/>
+                <w:szCs w:val="40"/>
+                <w:highlight w:val="green"/>
+              </w:rPr>
+              <w:t>C</w:t>
+            </w:r>
+            <w:r>
+              <w:rPr>
+                <w:rFonts w:ascii="BRH Malayalam Extra" w:hAnsi="BRH Malayalam Extra" w:cs="BRH Devanagari Extra"/>
+                <w:color w:val="000000"/>
+                <w:sz w:val="32"/>
+                <w:szCs w:val="40"/>
+                <w:highlight w:val="green"/>
+              </w:rPr>
+              <w:t>–</w:t>
+            </w:r>
+            <w:proofErr w:type="spellStart"/>
+            <w:r>
+              <w:rPr>
+                <w:rFonts w:ascii="BRH Devanagari Extra" w:hAnsi="BRH Devanagari Extra" w:cs="BRH Devanagari Extra"/>
+                <w:color w:val="000000"/>
+                <w:sz w:val="40"/>
+                <w:szCs w:val="40"/>
+              </w:rPr>
+              <w:t>WûÏÌiÉþ</w:t>
+            </w:r>
+            <w:proofErr w:type="spellEnd"/>
+            <w:r>
+              <w:rPr>
+                <w:rFonts w:ascii="BRH Devanagari Extra" w:hAnsi="BRH Devanagari Extra" w:cs="BRH Devanagari Extra"/>
+                <w:color w:val="000000"/>
+                <w:sz w:val="40"/>
+                <w:szCs w:val="40"/>
+              </w:rPr>
+              <w:t xml:space="preserve"> |</w:t>
+            </w:r>
+          </w:p>
+        </w:tc>
+      </w:tr>
+      <w:tr>
+        <w:trPr>
+          <w:trHeight w:val="962"/>
+        </w:trPr>
+        <w:tc>
+          <w:tcPr>
+            <w:tcW w:w="3906" w:type="dxa"/>
+          </w:tcPr>
+          <w:p>
+            <w:pPr>
+              <w:widowControl w:val="0"/>
+              <w:tabs>
+                <w:tab w:val="left" w:pos="993"/>
+              </w:tabs>
+              <w:autoSpaceDE w:val="0"/>
+              <w:autoSpaceDN w:val="0"/>
+              <w:adjustRightInd w:val="0"/>
+              <w:spacing w:before="0" w:line="252" w:lineRule="auto"/>
+              <w:ind w:right="297"/>
+              <w:rPr>
+                <w:rFonts w:cs="Arial"/>
+                <w:b/>
+                <w:color w:val="000000"/>
+                <w:sz w:val="28"/>
+                <w:szCs w:val="28"/>
+              </w:rPr>
+            </w:pPr>
+            <w:r>
+              <w:rPr>
+                <w:rFonts w:cs="Arial"/>
+                <w:b/>
+                <w:color w:val="000000"/>
+                <w:sz w:val="28"/>
+                <w:szCs w:val="28"/>
+              </w:rPr>
+              <w:t>T.S.5.1.</w:t>
+            </w:r>
+            <w:r>
+              <w:rPr>
+                <w:rFonts w:cs="Arial"/>
+                <w:b/>
+                <w:color w:val="000000"/>
+                <w:sz w:val="28"/>
+                <w:szCs w:val="28"/>
+              </w:rPr>
+              <w:t>6</w:t>
+            </w:r>
+            <w:r>
+              <w:rPr>
+                <w:rFonts w:cs="Arial"/>
+                <w:b/>
+                <w:color w:val="000000"/>
+                <w:sz w:val="28"/>
+                <w:szCs w:val="28"/>
+              </w:rPr>
+              <w:t>.</w:t>
+            </w:r>
+            <w:r>
+              <w:rPr>
+                <w:rFonts w:cs="Arial"/>
+                <w:b/>
+                <w:color w:val="000000"/>
+                <w:sz w:val="28"/>
+                <w:szCs w:val="28"/>
+              </w:rPr>
+              <w:t>4</w:t>
+            </w:r>
+            <w:r>
+              <w:rPr>
+                <w:rFonts w:cs="Arial"/>
+                <w:b/>
+                <w:color w:val="000000"/>
+                <w:sz w:val="28"/>
+                <w:szCs w:val="28"/>
+              </w:rPr>
+              <w:t xml:space="preserve"> – Kramam</w:t>
+            </w:r>
+          </w:p>
+          <w:p>
+            <w:pPr>
+              <w:widowControl w:val="0"/>
+              <w:tabs>
+                <w:tab w:val="left" w:pos="993"/>
+              </w:tabs>
+              <w:autoSpaceDE w:val="0"/>
+              <w:autoSpaceDN w:val="0"/>
+              <w:adjustRightInd w:val="0"/>
+              <w:spacing w:before="0" w:line="252" w:lineRule="auto"/>
+              <w:ind w:right="297"/>
+              <w:rPr>
+                <w:rFonts w:cstheme="minorBidi"/>
+                <w:b/>
+                <w:color w:val="000000"/>
+                <w:sz w:val="28"/>
+                <w:szCs w:val="28"/>
+                <w:lang w:val="en-IN" w:bidi="ta-IN"/>
+              </w:rPr>
+            </w:pPr>
+            <w:r>
+              <w:rPr>
+                <w:rFonts w:cs="Arial"/>
+                <w:b/>
+                <w:color w:val="000000"/>
+                <w:sz w:val="28"/>
+                <w:szCs w:val="28"/>
+              </w:rPr>
+              <w:t xml:space="preserve">Krama Vaakyam No.– </w:t>
+            </w:r>
+            <w:r>
+              <w:rPr>
+                <w:rFonts w:cs="Arial"/>
+                <w:b/>
+                <w:color w:val="000000"/>
+                <w:sz w:val="28"/>
+                <w:szCs w:val="28"/>
+              </w:rPr>
+              <w:t>1</w:t>
+            </w:r>
+            <w:r>
+              <w:rPr>
+                <w:rFonts w:cs="Arial"/>
+                <w:b/>
+                <w:color w:val="000000"/>
+                <w:sz w:val="28"/>
+                <w:szCs w:val="28"/>
+                <w:lang w:val="en-IN"/>
+              </w:rPr>
+              <w:t>1</w:t>
+            </w:r>
+          </w:p>
+          <w:p>
+            <w:pPr>
+              <w:widowControl w:val="0"/>
+              <w:tabs>
+                <w:tab w:val="left" w:pos="993"/>
+              </w:tabs>
+              <w:autoSpaceDE w:val="0"/>
+              <w:autoSpaceDN w:val="0"/>
+              <w:adjustRightInd w:val="0"/>
+              <w:spacing w:before="0" w:line="252" w:lineRule="auto"/>
+              <w:ind w:right="297"/>
+              <w:rPr>
+                <w:rFonts w:cs="Arial"/>
+                <w:b/>
+                <w:color w:val="000000"/>
+                <w:sz w:val="28"/>
+                <w:szCs w:val="28"/>
+              </w:rPr>
+            </w:pPr>
+            <w:r>
+              <w:rPr>
+                <w:rFonts w:cs="Arial"/>
+                <w:b/>
+                <w:color w:val="000000"/>
+                <w:sz w:val="28"/>
+                <w:szCs w:val="28"/>
+              </w:rPr>
+              <w:t xml:space="preserve">Panchaati No. - </w:t>
+            </w:r>
+            <w:r>
+              <w:rPr>
+                <w:rFonts w:cs="Arial"/>
+                <w:b/>
+                <w:color w:val="000000"/>
+                <w:sz w:val="28"/>
+                <w:szCs w:val="28"/>
+              </w:rPr>
+              <w:t>34</w:t>
+            </w:r>
+          </w:p>
+        </w:tc>
+        <w:tc>
+          <w:tcPr>
+            <w:tcW w:w="5103" w:type="dxa"/>
+          </w:tcPr>
+          <w:p>
+            <w:pPr>
+              <w:widowControl w:val="0"/>
+              <w:autoSpaceDE w:val="0"/>
+              <w:autoSpaceDN w:val="0"/>
+              <w:adjustRightInd w:val="0"/>
+              <w:spacing w:before="0" w:line="240" w:lineRule="auto"/>
+              <w:rPr>
+                <w:rFonts w:ascii="BRH Devanagari Extra" w:hAnsi="BRH Devanagari Extra" w:cs="BRH Devanagari Extra"/>
+                <w:color w:val="000000"/>
+                <w:sz w:val="40"/>
+                <w:szCs w:val="40"/>
+              </w:rPr>
+            </w:pPr>
+            <w:proofErr w:type="spellStart"/>
+            <w:r>
+              <w:rPr>
+                <w:rFonts w:ascii="BRH Devanagari Extra" w:hAnsi="BRH Devanagari Extra" w:cs="BRH Devanagari Extra"/>
+                <w:color w:val="000000"/>
+                <w:sz w:val="40"/>
+                <w:szCs w:val="40"/>
+              </w:rPr>
+              <w:t>AluÉ</w:t>
+            </w:r>
+            <w:proofErr w:type="spellEnd"/>
+            <w:r>
+              <w:rPr>
+                <w:rFonts w:ascii="BRH Malayalam Extra" w:hAnsi="BRH Malayalam Extra" w:cs="BRH Devanagari Extra"/>
+                <w:color w:val="000000"/>
+                <w:sz w:val="32"/>
+                <w:szCs w:val="40"/>
+              </w:rPr>
+              <w:t>–</w:t>
+            </w:r>
+            <w:proofErr w:type="spellStart"/>
+            <w:r>
+              <w:rPr>
+                <w:rFonts w:ascii="BRH Devanagari Extra" w:hAnsi="BRH Devanagari Extra" w:cs="BRH Devanagari Extra"/>
+                <w:color w:val="000000"/>
+                <w:sz w:val="40"/>
+                <w:szCs w:val="40"/>
+              </w:rPr>
+              <w:t>lrÉæÈ</w:t>
+            </w:r>
+            <w:proofErr w:type="spellEnd"/>
+            <w:r>
+              <w:rPr>
+                <w:rFonts w:ascii="BRH Devanagari Extra" w:hAnsi="BRH Devanagari Extra" w:cs="BRH Devanagari Extra"/>
+                <w:color w:val="000000"/>
+                <w:sz w:val="40"/>
+                <w:szCs w:val="40"/>
+              </w:rPr>
+              <w:t xml:space="preserve"> | A</w:t>
+            </w:r>
+            <w:r>
+              <w:rPr>
+                <w:rFonts w:ascii="BRH Malayalam Extra" w:hAnsi="BRH Malayalam Extra" w:cs="BRH Devanagari Extra"/>
+                <w:color w:val="000000"/>
+                <w:sz w:val="32"/>
+                <w:szCs w:val="40"/>
+              </w:rPr>
+              <w:t>–</w:t>
+            </w:r>
+            <w:proofErr w:type="spellStart"/>
+            <w:r>
+              <w:rPr>
+                <w:rFonts w:ascii="BRH Devanagari Extra" w:hAnsi="BRH Devanagari Extra" w:cs="BRH Devanagari Extra"/>
+                <w:color w:val="000000"/>
+                <w:sz w:val="40"/>
+                <w:szCs w:val="40"/>
+                <w:highlight w:val="yellow"/>
+              </w:rPr>
+              <w:t>luÉ</w:t>
+            </w:r>
+            <w:proofErr w:type="spellEnd"/>
+            <w:r>
+              <w:rPr>
+                <w:rFonts w:ascii="BRH Malayalam Extra" w:hAnsi="BRH Malayalam Extra" w:cs="BRH Devanagari Extra"/>
+                <w:color w:val="000000"/>
+                <w:sz w:val="32"/>
+                <w:szCs w:val="40"/>
+                <w:highlight w:val="yellow"/>
+              </w:rPr>
+              <w:t>–</w:t>
+            </w:r>
+            <w:proofErr w:type="spellStart"/>
+            <w:r>
+              <w:rPr>
+                <w:rFonts w:ascii="BRH Devanagari Extra" w:hAnsi="BRH Devanagari Extra" w:cs="BRH Devanagari Extra"/>
+                <w:color w:val="000000"/>
+                <w:sz w:val="40"/>
+                <w:szCs w:val="40"/>
+                <w:highlight w:val="yellow"/>
+              </w:rPr>
+              <w:t>lrÉæUç</w:t>
+            </w:r>
+            <w:proofErr w:type="spellEnd"/>
+            <w:r>
+              <w:rPr>
+                <w:rFonts w:ascii="BRH Devanagari Extra" w:hAnsi="BRH Devanagari Extra" w:cs="BRH Devanagari Extra"/>
+                <w:color w:val="000000"/>
+                <w:sz w:val="40"/>
+                <w:szCs w:val="40"/>
+              </w:rPr>
+              <w:t xml:space="preserve"> </w:t>
+            </w:r>
+            <w:proofErr w:type="spellStart"/>
+            <w:r>
+              <w:rPr>
+                <w:rFonts w:ascii="BRH Devanagari Extra" w:hAnsi="BRH Devanagari Extra" w:cs="BRH Devanagari Extra"/>
+                <w:color w:val="000000"/>
+                <w:sz w:val="40"/>
+                <w:szCs w:val="40"/>
+              </w:rPr>
+              <w:t>qÉþl§ÉrÉiÉå</w:t>
+            </w:r>
+            <w:proofErr w:type="spellEnd"/>
+            <w:r>
+              <w:rPr>
+                <w:rFonts w:ascii="BRH Devanagari Extra" w:hAnsi="BRH Devanagari Extra" w:cs="BRH Devanagari Extra"/>
+                <w:color w:val="000000"/>
+                <w:sz w:val="40"/>
+                <w:szCs w:val="40"/>
+              </w:rPr>
+              <w:t xml:space="preserve"> |</w:t>
+            </w:r>
+          </w:p>
+        </w:tc>
+        <w:tc>
+          <w:tcPr>
+            <w:tcW w:w="5386" w:type="dxa"/>
+          </w:tcPr>
+          <w:p>
+            <w:pPr>
+              <w:widowControl w:val="0"/>
+              <w:autoSpaceDE w:val="0"/>
+              <w:autoSpaceDN w:val="0"/>
+              <w:adjustRightInd w:val="0"/>
+              <w:spacing w:before="0" w:line="240" w:lineRule="auto"/>
+              <w:rPr>
+                <w:rFonts w:ascii="BRH Devanagari Extra" w:hAnsi="BRH Devanagari Extra" w:cs="BRH Devanagari Extra"/>
+                <w:color w:val="000000"/>
+                <w:sz w:val="40"/>
+                <w:szCs w:val="40"/>
+              </w:rPr>
+            </w:pPr>
+            <w:proofErr w:type="spellStart"/>
+            <w:r>
+              <w:rPr>
+                <w:rFonts w:ascii="BRH Devanagari Extra" w:hAnsi="BRH Devanagari Extra" w:cs="BRH Devanagari Extra"/>
+                <w:color w:val="000000"/>
+                <w:sz w:val="40"/>
+                <w:szCs w:val="40"/>
+              </w:rPr>
+              <w:t>AluÉ</w:t>
+            </w:r>
+            <w:proofErr w:type="spellEnd"/>
+            <w:r>
+              <w:rPr>
+                <w:rFonts w:ascii="BRH Malayalam Extra" w:hAnsi="BRH Malayalam Extra" w:cs="BRH Devanagari Extra"/>
+                <w:color w:val="000000"/>
+                <w:sz w:val="32"/>
+                <w:szCs w:val="40"/>
+              </w:rPr>
+              <w:t>–</w:t>
+            </w:r>
+            <w:proofErr w:type="spellStart"/>
+            <w:r>
+              <w:rPr>
+                <w:rFonts w:ascii="BRH Devanagari Extra" w:hAnsi="BRH Devanagari Extra" w:cs="BRH Devanagari Extra"/>
+                <w:color w:val="000000"/>
+                <w:sz w:val="40"/>
+                <w:szCs w:val="40"/>
+              </w:rPr>
+              <w:t>lrÉæÈ</w:t>
+            </w:r>
+            <w:proofErr w:type="spellEnd"/>
+            <w:r>
+              <w:rPr>
+                <w:rFonts w:ascii="BRH Devanagari Extra" w:hAnsi="BRH Devanagari Extra" w:cs="BRH Devanagari Extra"/>
+                <w:color w:val="000000"/>
+                <w:sz w:val="40"/>
+                <w:szCs w:val="40"/>
+              </w:rPr>
+              <w:t xml:space="preserve"> | </w:t>
+            </w:r>
+            <w:r>
+              <w:rPr>
+                <w:rFonts w:ascii="BRH Devanagari Extra" w:hAnsi="BRH Devanagari Extra" w:cs="BRH Devanagari Extra"/>
+                <w:color w:val="000000"/>
+                <w:sz w:val="40"/>
+                <w:szCs w:val="40"/>
+                <w:highlight w:val="green"/>
+              </w:rPr>
+              <w:t>A</w:t>
+            </w:r>
+            <w:r>
+              <w:rPr>
+                <w:rFonts w:ascii="BRH Malayalam Extra" w:hAnsi="BRH Malayalam Extra" w:cs="BRH Devanagari Extra"/>
+                <w:color w:val="000000"/>
+                <w:sz w:val="32"/>
+                <w:szCs w:val="40"/>
+                <w:highlight w:val="green"/>
+              </w:rPr>
+              <w:t>–</w:t>
+            </w:r>
+            <w:proofErr w:type="spellStart"/>
+            <w:r>
+              <w:rPr>
+                <w:rFonts w:ascii="BRH Devanagari Extra" w:hAnsi="BRH Devanagari Extra" w:cs="BRH Devanagari Extra"/>
+                <w:color w:val="000000"/>
+                <w:sz w:val="40"/>
+                <w:szCs w:val="40"/>
+                <w:highlight w:val="green"/>
+              </w:rPr>
+              <w:t>lrÉæU</w:t>
+            </w:r>
+            <w:r>
+              <w:rPr>
+                <w:rFonts w:ascii="BRH Devanagari Extra" w:hAnsi="BRH Devanagari Extra" w:cs="BRH Devanagari Extra"/>
+                <w:color w:val="000000"/>
+                <w:sz w:val="40"/>
+                <w:szCs w:val="40"/>
+              </w:rPr>
+              <w:t>ç</w:t>
+            </w:r>
+            <w:proofErr w:type="spellEnd"/>
+            <w:r>
+              <w:rPr>
+                <w:rFonts w:ascii="BRH Devanagari Extra" w:hAnsi="BRH Devanagari Extra" w:cs="BRH Devanagari Extra"/>
+                <w:color w:val="000000"/>
+                <w:sz w:val="40"/>
+                <w:szCs w:val="40"/>
+              </w:rPr>
+              <w:t xml:space="preserve"> </w:t>
+            </w:r>
+            <w:proofErr w:type="spellStart"/>
+            <w:r>
+              <w:rPr>
+                <w:rFonts w:ascii="BRH Devanagari Extra" w:hAnsi="BRH Devanagari Extra" w:cs="BRH Devanagari Extra"/>
+                <w:color w:val="000000"/>
+                <w:sz w:val="40"/>
+                <w:szCs w:val="40"/>
+              </w:rPr>
+              <w:t>qÉþl§ÉrÉiÉå</w:t>
+            </w:r>
+            <w:proofErr w:type="spellEnd"/>
+            <w:r>
+              <w:rPr>
+                <w:rFonts w:ascii="BRH Devanagari Extra" w:hAnsi="BRH Devanagari Extra" w:cs="BRH Devanagari Extra"/>
+                <w:color w:val="000000"/>
+                <w:sz w:val="40"/>
+                <w:szCs w:val="40"/>
+              </w:rPr>
+              <w:t xml:space="preserve"> |</w:t>
+            </w:r>
+          </w:p>
+        </w:tc>
+      </w:tr>
+      <w:tr>
+        <w:trPr>
+          <w:trHeight w:val="962"/>
+        </w:trPr>
+        <w:tc>
+          <w:tcPr>
+            <w:tcW w:w="3906" w:type="dxa"/>
+          </w:tcPr>
+          <w:p>
+            <w:pPr>
+              <w:widowControl w:val="0"/>
+              <w:tabs>
+                <w:tab w:val="left" w:pos="993"/>
+              </w:tabs>
+              <w:autoSpaceDE w:val="0"/>
+              <w:autoSpaceDN w:val="0"/>
+              <w:adjustRightInd w:val="0"/>
+              <w:spacing w:before="0" w:line="252" w:lineRule="auto"/>
+              <w:ind w:right="297"/>
+              <w:rPr>
+                <w:rFonts w:cs="Arial"/>
+                <w:b/>
+                <w:color w:val="000000"/>
+                <w:sz w:val="28"/>
+                <w:szCs w:val="28"/>
+              </w:rPr>
+            </w:pPr>
+            <w:r>
+              <w:rPr>
+                <w:rFonts w:cs="Arial"/>
+                <w:b/>
+                <w:color w:val="000000"/>
+                <w:sz w:val="28"/>
+                <w:szCs w:val="28"/>
+              </w:rPr>
+              <w:t>T.S.5.1.</w:t>
+            </w:r>
+            <w:r>
+              <w:rPr>
+                <w:rFonts w:cs="Arial"/>
+                <w:b/>
+                <w:color w:val="000000"/>
+                <w:sz w:val="28"/>
+                <w:szCs w:val="28"/>
+              </w:rPr>
+              <w:t>9.3</w:t>
+            </w:r>
+            <w:r>
+              <w:rPr>
+                <w:rFonts w:cs="Arial"/>
+                <w:b/>
+                <w:color w:val="000000"/>
+                <w:sz w:val="28"/>
+                <w:szCs w:val="28"/>
+              </w:rPr>
+              <w:t xml:space="preserve"> – Kramam</w:t>
+            </w:r>
+          </w:p>
+          <w:p>
+            <w:pPr>
+              <w:widowControl w:val="0"/>
+              <w:tabs>
+                <w:tab w:val="left" w:pos="993"/>
+              </w:tabs>
+              <w:autoSpaceDE w:val="0"/>
+              <w:autoSpaceDN w:val="0"/>
+              <w:adjustRightInd w:val="0"/>
+              <w:spacing w:before="0" w:line="252" w:lineRule="auto"/>
+              <w:ind w:right="297"/>
+              <w:rPr>
+                <w:rFonts w:cstheme="minorBidi"/>
+                <w:b/>
+                <w:color w:val="000000"/>
+                <w:sz w:val="28"/>
+                <w:szCs w:val="28"/>
+                <w:lang w:val="en-IN" w:bidi="ta-IN"/>
+              </w:rPr>
+            </w:pPr>
+            <w:r>
+              <w:rPr>
+                <w:rFonts w:cs="Arial"/>
+                <w:b/>
+                <w:color w:val="000000"/>
+                <w:sz w:val="28"/>
+                <w:szCs w:val="28"/>
+              </w:rPr>
+              <w:t xml:space="preserve">Krama Vaakyam No.– </w:t>
+            </w:r>
+            <w:r>
+              <w:rPr>
+                <w:rFonts w:cs="Arial"/>
+                <w:b/>
+                <w:color w:val="000000"/>
+                <w:sz w:val="28"/>
+                <w:szCs w:val="28"/>
+              </w:rPr>
+              <w:t>37,38</w:t>
+            </w:r>
+          </w:p>
+          <w:p>
+            <w:pPr>
+              <w:widowControl w:val="0"/>
+              <w:tabs>
+                <w:tab w:val="left" w:pos="993"/>
+              </w:tabs>
+              <w:autoSpaceDE w:val="0"/>
+              <w:autoSpaceDN w:val="0"/>
+              <w:adjustRightInd w:val="0"/>
+              <w:spacing w:before="0" w:line="252" w:lineRule="auto"/>
+              <w:ind w:right="297"/>
+              <w:rPr>
+                <w:rFonts w:cs="Arial"/>
+                <w:b/>
+                <w:color w:val="000000"/>
+                <w:sz w:val="28"/>
+                <w:szCs w:val="28"/>
+              </w:rPr>
+            </w:pPr>
+            <w:r>
+              <w:rPr>
+                <w:rFonts w:cs="Arial"/>
+                <w:b/>
+                <w:color w:val="000000"/>
+                <w:sz w:val="28"/>
+                <w:szCs w:val="28"/>
+              </w:rPr>
+              <w:t xml:space="preserve">Panchaati No. - </w:t>
+            </w:r>
+            <w:r>
+              <w:rPr>
+                <w:rFonts w:cs="Arial"/>
+                <w:b/>
+                <w:color w:val="000000"/>
+                <w:sz w:val="28"/>
+                <w:szCs w:val="28"/>
+              </w:rPr>
+              <w:t>47</w:t>
+            </w:r>
+          </w:p>
+        </w:tc>
+        <w:tc>
+          <w:tcPr>
+            <w:tcW w:w="5103" w:type="dxa"/>
+          </w:tcPr>
+          <w:p>
+            <w:pPr>
+              <w:widowControl w:val="0"/>
+              <w:autoSpaceDE w:val="0"/>
+              <w:autoSpaceDN w:val="0"/>
+              <w:adjustRightInd w:val="0"/>
+              <w:spacing w:before="0" w:line="240" w:lineRule="auto"/>
+              <w:rPr>
+                <w:rFonts w:ascii="BRH Devanagari Extra" w:hAnsi="BRH Devanagari Extra" w:cs="BRH Devanagari Extra"/>
+                <w:color w:val="000000"/>
+                <w:sz w:val="40"/>
+                <w:szCs w:val="40"/>
+              </w:rPr>
+            </w:pPr>
+            <w:proofErr w:type="spellStart"/>
+            <w:r>
+              <w:rPr>
+                <w:rFonts w:ascii="BRH Devanagari Extra" w:hAnsi="BRH Devanagari Extra" w:cs="BRH Devanagari Extra"/>
+                <w:color w:val="000000"/>
+                <w:sz w:val="40"/>
+                <w:szCs w:val="40"/>
+              </w:rPr>
+              <w:t>iÉiÉ</w:t>
+            </w:r>
+            <w:proofErr w:type="spellEnd"/>
+            <w:r>
+              <w:rPr>
+                <w:rFonts w:ascii="BRH Malayalam Extra" w:hAnsi="BRH Malayalam Extra" w:cs="BRH Devanagari Extra"/>
+                <w:color w:val="000000"/>
+                <w:sz w:val="32"/>
+                <w:szCs w:val="40"/>
+              </w:rPr>
+              <w:t>–</w:t>
+            </w:r>
+            <w:r>
+              <w:rPr>
+                <w:rFonts w:ascii="BRH Devanagari Extra" w:hAnsi="BRH Devanagari Extra" w:cs="BRH Devanagari Extra"/>
+                <w:color w:val="000000"/>
+                <w:sz w:val="40"/>
+                <w:szCs w:val="40"/>
+              </w:rPr>
+              <w:t xml:space="preserve">È </w:t>
+            </w:r>
+            <w:proofErr w:type="spellStart"/>
+            <w:r>
+              <w:rPr>
+                <w:rFonts w:ascii="BRH Devanagari Extra" w:hAnsi="BRH Devanagari Extra" w:cs="BRH Devanagari Extra"/>
+                <w:color w:val="000000"/>
+                <w:sz w:val="40"/>
+                <w:szCs w:val="40"/>
+              </w:rPr>
+              <w:t>mÉëÉrÉþÍ¶É</w:t>
+            </w:r>
+            <w:r>
+              <w:rPr>
+                <w:rFonts w:ascii="BRH Devanagari Extra" w:hAnsi="BRH Devanagari Extra" w:cs="BRH Devanagari Extra"/>
+                <w:color w:val="000000"/>
+                <w:sz w:val="40"/>
+                <w:szCs w:val="40"/>
+                <w:highlight w:val="yellow"/>
+              </w:rPr>
+              <w:t>ÌiÉÈ</w:t>
+            </w:r>
+            <w:proofErr w:type="spellEnd"/>
+            <w:r>
+              <w:rPr>
+                <w:rFonts w:ascii="BRH Devanagari Extra" w:hAnsi="BRH Devanagari Extra" w:cs="BRH Devanagari Extra"/>
+                <w:color w:val="000000"/>
+                <w:sz w:val="40"/>
+                <w:szCs w:val="40"/>
+              </w:rPr>
+              <w:t xml:space="preserve"> | </w:t>
+            </w:r>
+            <w:proofErr w:type="spellStart"/>
+            <w:r>
+              <w:rPr>
+                <w:rFonts w:ascii="BRH Devanagari Extra" w:hAnsi="BRH Devanagari Extra" w:cs="BRH Devanagari Extra"/>
+                <w:color w:val="000000"/>
+                <w:sz w:val="40"/>
+                <w:szCs w:val="40"/>
+              </w:rPr>
+              <w:t>mÉëÉrÉþÍ¶</w:t>
+            </w:r>
+            <w:r>
+              <w:rPr>
+                <w:rFonts w:ascii="BRH Devanagari Extra" w:hAnsi="BRH Devanagari Extra" w:cs="BRH Devanagari Extra"/>
+                <w:color w:val="000000"/>
+                <w:sz w:val="40"/>
+                <w:szCs w:val="40"/>
+                <w:highlight w:val="yellow"/>
+              </w:rPr>
+              <w:t>ÉÌiÉ</w:t>
+            </w:r>
+            <w:proofErr w:type="spellEnd"/>
+            <w:r>
+              <w:rPr>
+                <w:rFonts w:ascii="BRH Malayalam Extra" w:hAnsi="BRH Malayalam Extra" w:cs="BRH Devanagari Extra"/>
+                <w:color w:val="000000"/>
+                <w:sz w:val="32"/>
+                <w:szCs w:val="40"/>
+                <w:highlight w:val="yellow"/>
+              </w:rPr>
+              <w:t>–</w:t>
+            </w:r>
+            <w:r>
+              <w:rPr>
+                <w:rFonts w:ascii="BRH Devanagari Extra" w:hAnsi="BRH Devanagari Extra" w:cs="BRH Devanagari Extra"/>
+                <w:color w:val="000000"/>
+                <w:sz w:val="40"/>
+                <w:szCs w:val="40"/>
+                <w:highlight w:val="yellow"/>
+              </w:rPr>
+              <w:t>Uç</w:t>
+            </w:r>
+            <w:r>
+              <w:rPr>
+                <w:rFonts w:ascii="BRH Devanagari Extra" w:hAnsi="BRH Devanagari Extra" w:cs="BRH Devanagari Extra"/>
+                <w:color w:val="000000"/>
+                <w:sz w:val="40"/>
+                <w:szCs w:val="40"/>
+              </w:rPr>
+              <w:t xml:space="preserve"> rÉÈ |</w:t>
+            </w:r>
+          </w:p>
+        </w:tc>
+        <w:tc>
+          <w:tcPr>
+            <w:tcW w:w="5386" w:type="dxa"/>
+          </w:tcPr>
+          <w:p>
+            <w:pPr>
+              <w:widowControl w:val="0"/>
+              <w:autoSpaceDE w:val="0"/>
+              <w:autoSpaceDN w:val="0"/>
+              <w:adjustRightInd w:val="0"/>
+              <w:spacing w:before="0" w:line="240" w:lineRule="auto"/>
+              <w:rPr>
+                <w:rFonts w:ascii="BRH Devanagari Extra" w:hAnsi="BRH Devanagari Extra" w:cs="BRH Devanagari Extra"/>
+                <w:color w:val="000000"/>
+                <w:sz w:val="40"/>
+                <w:szCs w:val="40"/>
+              </w:rPr>
+            </w:pPr>
+            <w:proofErr w:type="spellStart"/>
+            <w:r>
+              <w:rPr>
+                <w:rFonts w:ascii="BRH Devanagari Extra" w:hAnsi="BRH Devanagari Extra" w:cs="BRH Devanagari Extra"/>
+                <w:color w:val="000000"/>
+                <w:sz w:val="40"/>
+                <w:szCs w:val="40"/>
+              </w:rPr>
+              <w:t>iÉiÉ</w:t>
+            </w:r>
+            <w:proofErr w:type="spellEnd"/>
+            <w:r>
+              <w:rPr>
+                <w:rFonts w:ascii="BRH Malayalam Extra" w:hAnsi="BRH Malayalam Extra" w:cs="BRH Devanagari Extra"/>
+                <w:color w:val="000000"/>
+                <w:sz w:val="32"/>
+                <w:szCs w:val="40"/>
+              </w:rPr>
+              <w:t>–</w:t>
+            </w:r>
+            <w:r>
+              <w:rPr>
+                <w:rFonts w:ascii="BRH Devanagari Extra" w:hAnsi="BRH Devanagari Extra" w:cs="BRH Devanagari Extra"/>
+                <w:color w:val="000000"/>
+                <w:sz w:val="40"/>
+                <w:szCs w:val="40"/>
+              </w:rPr>
+              <w:t xml:space="preserve">È </w:t>
+            </w:r>
+            <w:proofErr w:type="spellStart"/>
+            <w:r>
+              <w:rPr>
+                <w:rFonts w:ascii="BRH Devanagari Extra" w:hAnsi="BRH Devanagari Extra" w:cs="BRH Devanagari Extra"/>
+                <w:color w:val="000000"/>
+                <w:sz w:val="40"/>
+                <w:szCs w:val="40"/>
+              </w:rPr>
+              <w:t>mÉëÉrÉþÍ¶É</w:t>
+            </w:r>
+            <w:r>
+              <w:rPr>
+                <w:rFonts w:ascii="BRH Devanagari Extra" w:hAnsi="BRH Devanagari Extra" w:cs="BRH Devanagari Extra"/>
+                <w:color w:val="000000"/>
+                <w:sz w:val="40"/>
+                <w:szCs w:val="40"/>
+                <w:highlight w:val="green"/>
+              </w:rPr>
+              <w:t>ÌiiÉÈ</w:t>
+            </w:r>
+            <w:proofErr w:type="spellEnd"/>
+            <w:r>
+              <w:rPr>
+                <w:rFonts w:ascii="BRH Devanagari Extra" w:hAnsi="BRH Devanagari Extra" w:cs="BRH Devanagari Extra"/>
+                <w:color w:val="000000"/>
+                <w:sz w:val="40"/>
+                <w:szCs w:val="40"/>
+              </w:rPr>
+              <w:t xml:space="preserve"> | </w:t>
+            </w:r>
+            <w:proofErr w:type="spellStart"/>
+            <w:r>
+              <w:rPr>
+                <w:rFonts w:ascii="BRH Devanagari Extra" w:hAnsi="BRH Devanagari Extra" w:cs="BRH Devanagari Extra"/>
+                <w:color w:val="000000"/>
+                <w:sz w:val="40"/>
+                <w:szCs w:val="40"/>
+              </w:rPr>
+              <w:t>mÉëÉrÉþÍ¶É</w:t>
+            </w:r>
+            <w:r>
+              <w:rPr>
+                <w:rFonts w:ascii="BRH Devanagari Extra" w:hAnsi="BRH Devanagari Extra" w:cs="BRH Devanagari Extra"/>
+                <w:color w:val="000000"/>
+                <w:sz w:val="40"/>
+                <w:szCs w:val="40"/>
+                <w:highlight w:val="green"/>
+              </w:rPr>
+              <w:t>ÌiiÉ</w:t>
+            </w:r>
+            <w:proofErr w:type="spellEnd"/>
+            <w:r>
+              <w:rPr>
+                <w:rFonts w:ascii="BRH Malayalam Extra" w:hAnsi="BRH Malayalam Extra" w:cs="BRH Devanagari Extra"/>
+                <w:color w:val="000000"/>
+                <w:sz w:val="32"/>
+                <w:szCs w:val="40"/>
+                <w:highlight w:val="green"/>
+              </w:rPr>
+              <w:t>–</w:t>
+            </w:r>
+            <w:r>
+              <w:rPr>
+                <w:rFonts w:ascii="BRH Devanagari Extra" w:hAnsi="BRH Devanagari Extra" w:cs="BRH Devanagari Extra"/>
+                <w:color w:val="000000"/>
+                <w:sz w:val="40"/>
+                <w:szCs w:val="40"/>
+                <w:highlight w:val="green"/>
+              </w:rPr>
+              <w:t>Uç</w:t>
+            </w:r>
+            <w:r>
+              <w:rPr>
+                <w:rFonts w:ascii="BRH Devanagari Extra" w:hAnsi="BRH Devanagari Extra" w:cs="BRH Devanagari Extra"/>
+                <w:color w:val="000000"/>
+                <w:sz w:val="40"/>
+                <w:szCs w:val="40"/>
+              </w:rPr>
+              <w:t xml:space="preserve"> rÉÈ |</w:t>
+            </w:r>
+          </w:p>
+        </w:tc>
+      </w:tr>
+    </w:tbl>
+    <w:p>
+      <w:pPr>
+        <w:jc w:val="center"/>
+        <w:rPr>
+          <w:b/>
+          <w:bCs/>
+          <w:sz w:val="32"/>
+          <w:szCs w:val="32"/>
+          <w:u w:val="single"/>
+        </w:rPr>
+      </w:pPr>
+    </w:p>
+    <w:p>
+      <w:pPr>
+        <w:jc w:val="center"/>
+        <w:rPr>
+          <w:b/>
+          <w:bCs/>
+          <w:sz w:val="32"/>
+          <w:szCs w:val="32"/>
+          <w:u w:val="single"/>
+        </w:rPr>
+      </w:pPr>
+    </w:p>
+    <w:p>
+      <w:pPr>
+        <w:jc w:val="center"/>
+        <w:rPr>
+          <w:b/>
+          <w:bCs/>
+          <w:sz w:val="32"/>
+          <w:szCs w:val="32"/>
+          <w:u w:val="single"/>
+        </w:rPr>
+      </w:pPr>
+    </w:p>
+    <w:p>
+      <w:pPr>
+        <w:jc w:val="center"/>
+        <w:rPr>
+          <w:b/>
+          <w:bCs/>
+          <w:sz w:val="32"/>
+          <w:szCs w:val="32"/>
+          <w:u w:val="single"/>
+        </w:rPr>
+      </w:pPr>
+    </w:p>
+    <w:p>
+      <w:pPr>
+        <w:jc w:val="center"/>
+        <w:rPr>
+          <w:b/>
+          <w:bCs/>
+          <w:sz w:val="32"/>
+          <w:szCs w:val="32"/>
+          <w:u w:val="single"/>
+        </w:rPr>
+      </w:pPr>
+    </w:p>
+    <w:p>
+      <w:pPr>
+        <w:jc w:val="center"/>
+        <w:rPr>
+          <w:b/>
+          <w:bCs/>
+          <w:sz w:val="32"/>
+          <w:szCs w:val="32"/>
+          <w:u w:val="single"/>
+        </w:rPr>
+      </w:pPr>
+    </w:p>
+    <w:p>
+      <w:pPr>
+        <w:jc w:val="center"/>
+        <w:rPr>
+          <w:b/>
+          <w:bCs/>
+          <w:sz w:val="32"/>
+          <w:szCs w:val="32"/>
+          <w:u w:val="single"/>
+        </w:rPr>
+      </w:pPr>
+    </w:p>
+    <w:p>
+      <w:pPr>
+        <w:jc w:val="center"/>
+        <w:rPr>
+          <w:b/>
+          <w:bCs/>
+          <w:sz w:val="32"/>
+          <w:szCs w:val="32"/>
+          <w:u w:val="single"/>
+        </w:rPr>
+      </w:pPr>
+    </w:p>
+    <w:p>
+      <w:pPr>
+        <w:jc w:val="center"/>
+        <w:rPr>
+          <w:b/>
+          <w:bCs/>
+          <w:sz w:val="32"/>
+          <w:szCs w:val="32"/>
+          <w:u w:val="single"/>
+        </w:rPr>
+      </w:pPr>
+    </w:p>
+    <w:p>
+      <w:pPr>
+        <w:jc w:val="center"/>
+        <w:rPr>
+          <w:b/>
+          <w:bCs/>
+          <w:sz w:val="32"/>
+          <w:szCs w:val="32"/>
+          <w:u w:val="single"/>
+        </w:rPr>
+      </w:pPr>
+    </w:p>
+    <w:p>
+      <w:pPr>
+        <w:jc w:val="center"/>
+        <w:rPr>
+          <w:b/>
+          <w:bCs/>
+          <w:sz w:val="32"/>
+          <w:szCs w:val="32"/>
+          <w:u w:val="single"/>
+        </w:rPr>
+      </w:pPr>
+      <w:r>
+        <w:rPr>
+          <w:b/>
+          <w:bCs/>
+          <w:sz w:val="32"/>
+          <w:szCs w:val="32"/>
+          <w:u w:val="single"/>
+        </w:rPr>
+        <w:t xml:space="preserve">TS </w:t>
+      </w:r>
+      <w:r>
+        <w:rPr>
+          <w:b/>
+          <w:bCs/>
+          <w:sz w:val="32"/>
+          <w:szCs w:val="32"/>
+          <w:u w:val="single"/>
+        </w:rPr>
+        <w:t>Krama</w:t>
+      </w:r>
+      <w:r>
+        <w:rPr>
+          <w:b/>
+          <w:bCs/>
+          <w:sz w:val="32"/>
+          <w:szCs w:val="32"/>
+          <w:u w:val="single"/>
+        </w:rPr>
+        <w:t xml:space="preserve"> Paatam – TS </w:t>
+      </w:r>
+      <w:r>
+        <w:rPr>
+          <w:b/>
+          <w:bCs/>
+          <w:sz w:val="32"/>
+          <w:szCs w:val="32"/>
+          <w:u w:val="single"/>
+        </w:rPr>
+        <w:t>5.1 Sanskrit</w:t>
+      </w:r>
+      <w:r>
+        <w:rPr>
+          <w:b/>
+          <w:bCs/>
+          <w:sz w:val="32"/>
+          <w:szCs w:val="32"/>
+          <w:u w:val="single"/>
+        </w:rPr>
+        <w:t xml:space="preserve"> Corrections –</w:t>
+      </w:r>
+      <w:r>
+        <w:rPr>
+          <w:b/>
+          <w:bCs/>
+          <w:sz w:val="32"/>
+          <w:szCs w:val="32"/>
+          <w:u w:val="single"/>
+        </w:rPr>
+        <w:t xml:space="preserve"> </w:t>
+      </w:r>
+      <w:r>
+        <w:rPr>
+          <w:b/>
+          <w:bCs/>
+          <w:sz w:val="32"/>
+          <w:szCs w:val="32"/>
+          <w:u w:val="single"/>
+        </w:rPr>
+        <w:t xml:space="preserve">Observed till </w:t>
+      </w:r>
+      <w:bookmarkStart w:id="0" w:name="_Hlk113214516"/>
+      <w:r>
+        <w:rPr>
+          <w:b/>
+          <w:bCs/>
+          <w:sz w:val="32"/>
+          <w:szCs w:val="32"/>
+          <w:u w:val="single"/>
+        </w:rPr>
+        <w:t>30th Sep 2022</w:t>
+      </w:r>
+      <w:bookmarkEnd w:id="0"/>
+    </w:p>
+    <w:p>
+      <w:pPr>
+        <w:spacing w:before="0" w:line="240" w:lineRule="auto"/>
+        <w:jc w:val="center"/>
+        <w:rPr>
+          <w:b/>
+          <w:bCs/>
+        </w:rPr>
+      </w:pPr>
+      <w:r>
+        <w:rPr>
+          <w:b/>
+          <w:bCs/>
+        </w:rPr>
+        <w:t>(ignore those which are already incorporated in your book’s version and date)</w:t>
+      </w:r>
+    </w:p>
+    <w:tbl>
+      <w:tblPr>
+        <w:tblW w:w="14395" w:type="dxa"/>
+        <w:tblInd w:w="-792" w:type="dxa"/>
+        <w:tblBorders>
+          <w:top w:val="single" w:sz="4" w:space="0" w:color="000000"/>
+          <w:left w:val="single" w:sz="4" w:space="0" w:color="000000"/>
+          <w:bottom w:val="single" w:sz="4" w:space="0" w:color="000000"/>
+          <w:right w:val="single" w:sz="4" w:space="0" w:color="000000"/>
+          <w:insideH w:val="single" w:sz="4" w:space="0" w:color="000000"/>
+          <w:insideV w:val="single" w:sz="4" w:space="0" w:color="000000"/>
+        </w:tblBorders>
+        <w:tblLook w:val="04A0" w:firstRow="1" w:lastRow="0" w:firstColumn="1" w:lastColumn="0" w:noHBand="0" w:noVBand="1"/>
+      </w:tblPr>
+      <w:tblGrid>
+        <w:gridCol w:w="3906"/>
+        <w:gridCol w:w="5103"/>
+        <w:gridCol w:w="5386"/>
+      </w:tblGrid>
+      <w:tr>
+        <w:tc>
+          <w:tcPr>
+            <w:tcW w:w="3906" w:type="dxa"/>
+          </w:tcPr>
+          <w:p>
+            <w:pPr>
+              <w:spacing w:before="0" w:line="240" w:lineRule="auto"/>
+              <w:jc w:val="center"/>
+              <w:rPr>
+                <w:b/>
+                <w:bCs/>
+                <w:sz w:val="32"/>
+                <w:szCs w:val="32"/>
+              </w:rPr>
+            </w:pPr>
+            <w:r>
+              <w:rPr>
+                <w:b/>
+                <w:bCs/>
+                <w:sz w:val="32"/>
+                <w:szCs w:val="32"/>
+              </w:rPr>
+              <w:t>Section, Paragraph</w:t>
+            </w:r>
+          </w:p>
+          <w:p>
+            <w:pPr>
+              <w:spacing w:before="0" w:line="240" w:lineRule="auto"/>
+              <w:jc w:val="center"/>
+              <w:rPr>
+                <w:b/>
+                <w:bCs/>
+                <w:sz w:val="32"/>
+                <w:szCs w:val="32"/>
+              </w:rPr>
+            </w:pPr>
+            <w:r>
+              <w:rPr>
+                <w:b/>
+                <w:bCs/>
+                <w:sz w:val="32"/>
+                <w:szCs w:val="32"/>
+              </w:rPr>
+              <w:t>Reference</w:t>
+            </w:r>
+          </w:p>
+        </w:tc>
+        <w:tc>
+          <w:tcPr>
+            <w:tcW w:w="5103" w:type="dxa"/>
+          </w:tcPr>
+          <w:p>
+            <w:pPr>
+              <w:spacing w:before="0" w:line="240" w:lineRule="auto"/>
+              <w:jc w:val="center"/>
+              <w:rPr>
+                <w:b/>
+                <w:bCs/>
+                <w:sz w:val="32"/>
+                <w:szCs w:val="32"/>
+              </w:rPr>
+            </w:pPr>
+            <w:r>
+              <w:rPr>
+                <w:b/>
+                <w:bCs/>
+                <w:sz w:val="32"/>
+                <w:szCs w:val="32"/>
+              </w:rPr>
+              <w:t>As Printed</w:t>
+            </w:r>
+          </w:p>
+        </w:tc>
+        <w:tc>
+          <w:tcPr>
+            <w:tcW w:w="5386" w:type="dxa"/>
+          </w:tcPr>
+          <w:p>
+            <w:pPr>
+              <w:spacing w:before="0" w:line="240" w:lineRule="auto"/>
+              <w:ind w:right="-18"/>
+              <w:jc w:val="center"/>
+              <w:rPr>
+                <w:b/>
+                <w:bCs/>
+                <w:sz w:val="32"/>
+                <w:szCs w:val="32"/>
+              </w:rPr>
+            </w:pPr>
+            <w:r>
+              <w:rPr>
+                <w:b/>
+                <w:bCs/>
+                <w:sz w:val="32"/>
+                <w:szCs w:val="32"/>
+              </w:rPr>
+              <w:t>To be read as or corrected as</w:t>
+            </w:r>
+          </w:p>
+        </w:tc>
+      </w:tr>
+      <w:tr>
+        <w:trPr>
+          <w:trHeight w:val="962"/>
+        </w:trPr>
+        <w:tc>
+          <w:tcPr>
+            <w:tcW w:w="3906" w:type="dxa"/>
+          </w:tcPr>
+          <w:p>
+            <w:pPr>
+              <w:widowControl w:val="0"/>
+              <w:tabs>
+                <w:tab w:val="left" w:pos="993"/>
+              </w:tabs>
+              <w:autoSpaceDE w:val="0"/>
+              <w:autoSpaceDN w:val="0"/>
+              <w:adjustRightInd w:val="0"/>
+              <w:spacing w:before="0" w:line="252" w:lineRule="auto"/>
+              <w:ind w:right="297"/>
+              <w:rPr>
+                <w:rFonts w:cs="Arial"/>
+                <w:b/>
+                <w:color w:val="000000"/>
+                <w:sz w:val="28"/>
+                <w:szCs w:val="32"/>
+              </w:rPr>
+            </w:pPr>
+            <w:r>
+              <w:rPr>
+                <w:rFonts w:cs="Arial"/>
+                <w:b/>
+                <w:color w:val="000000"/>
+                <w:sz w:val="28"/>
+                <w:szCs w:val="32"/>
+              </w:rPr>
+              <w:t>T.S.</w:t>
+            </w:r>
+            <w:r>
+              <w:rPr>
+                <w:rFonts w:cs="Arial"/>
+                <w:b/>
+                <w:color w:val="000000"/>
+                <w:sz w:val="28"/>
+                <w:szCs w:val="32"/>
+              </w:rPr>
+              <w:t>5.1.1.2</w:t>
+            </w:r>
+            <w:r>
+              <w:rPr>
+                <w:rFonts w:cs="Arial"/>
+                <w:b/>
+                <w:color w:val="000000"/>
+                <w:sz w:val="28"/>
+                <w:szCs w:val="32"/>
+              </w:rPr>
+              <w:t xml:space="preserve"> </w:t>
+            </w:r>
+            <w:r>
+              <w:rPr>
+                <w:rFonts w:cs="Arial"/>
+                <w:b/>
+                <w:color w:val="000000"/>
+                <w:sz w:val="28"/>
+                <w:szCs w:val="32"/>
+              </w:rPr>
+              <w:t>– Kramam</w:t>
+            </w:r>
+          </w:p>
+          <w:p>
+            <w:pPr>
+              <w:widowControl w:val="0"/>
+              <w:tabs>
+                <w:tab w:val="left" w:pos="993"/>
+              </w:tabs>
+              <w:autoSpaceDE w:val="0"/>
+              <w:autoSpaceDN w:val="0"/>
+              <w:adjustRightInd w:val="0"/>
+              <w:spacing w:before="0" w:line="252" w:lineRule="auto"/>
+              <w:ind w:right="297"/>
+              <w:rPr>
+                <w:rFonts w:cs="Arial"/>
+                <w:b/>
+                <w:color w:val="000000"/>
+                <w:sz w:val="28"/>
+                <w:szCs w:val="32"/>
+              </w:rPr>
+            </w:pPr>
+            <w:r>
+              <w:rPr>
+                <w:rFonts w:cs="Arial"/>
+                <w:b/>
+                <w:color w:val="000000"/>
+                <w:sz w:val="28"/>
+                <w:szCs w:val="32"/>
+              </w:rPr>
+              <w:t xml:space="preserve">Krama Vaakyam No.– </w:t>
+            </w:r>
+            <w:r>
+              <w:rPr>
+                <w:rFonts w:cs="Arial"/>
+                <w:b/>
+                <w:color w:val="000000"/>
+                <w:sz w:val="28"/>
+                <w:szCs w:val="32"/>
+              </w:rPr>
+              <w:t>8</w:t>
+            </w:r>
+          </w:p>
+          <w:p>
+            <w:pPr>
+              <w:widowControl w:val="0"/>
+              <w:tabs>
+                <w:tab w:val="left" w:pos="993"/>
+              </w:tabs>
+              <w:autoSpaceDE w:val="0"/>
+              <w:autoSpaceDN w:val="0"/>
+              <w:adjustRightInd w:val="0"/>
+              <w:spacing w:before="0" w:line="252" w:lineRule="auto"/>
+              <w:ind w:right="297"/>
+              <w:rPr>
+                <w:rFonts w:cs="Arial"/>
+                <w:b/>
+                <w:color w:val="000000"/>
+                <w:sz w:val="28"/>
+                <w:szCs w:val="32"/>
+              </w:rPr>
+            </w:pPr>
+            <w:r>
+              <w:rPr>
+                <w:rFonts w:cs="Arial"/>
+                <w:b/>
+                <w:color w:val="000000"/>
+                <w:sz w:val="28"/>
+                <w:szCs w:val="32"/>
+              </w:rPr>
+              <w:t>Panchaati No</w:t>
+            </w:r>
+            <w:r>
+              <w:rPr>
+                <w:rFonts w:cs="Arial"/>
+                <w:b/>
+                <w:color w:val="000000"/>
+                <w:szCs w:val="32"/>
+              </w:rPr>
+              <w:t>. -</w:t>
+            </w:r>
+            <w:r>
+              <w:rPr>
+                <w:rFonts w:cs="Arial"/>
+                <w:b/>
+                <w:color w:val="000000"/>
+                <w:szCs w:val="32"/>
+              </w:rPr>
+              <w:t xml:space="preserve"> </w:t>
+            </w:r>
+            <w:r>
+              <w:rPr>
+                <w:rFonts w:cs="Arial"/>
+                <w:b/>
+                <w:color w:val="000000"/>
+                <w:sz w:val="28"/>
+                <w:szCs w:val="32"/>
+              </w:rPr>
+              <w:t>2</w:t>
+            </w:r>
+          </w:p>
+        </w:tc>
+        <w:tc>
+          <w:tcPr>
+            <w:tcW w:w="5103" w:type="dxa"/>
+          </w:tcPr>
+          <w:p>
+            <w:pPr>
+              <w:widowControl w:val="0"/>
+              <w:autoSpaceDE w:val="0"/>
+              <w:autoSpaceDN w:val="0"/>
+              <w:adjustRightInd w:val="0"/>
+              <w:spacing w:before="0" w:line="240" w:lineRule="auto"/>
+              <w:rPr>
+                <w:rFonts w:ascii="BRH Malayalam Extra" w:hAnsi="BRH Malayalam Extra" w:cs="BRH Malayalam Extra"/>
+                <w:color w:val="000000"/>
+                <w:sz w:val="36"/>
+                <w:szCs w:val="40"/>
+              </w:rPr>
+            </w:pPr>
             <w:r>
               <w:rPr>
                 <w:rFonts w:ascii="BRH Devanagari Extra" w:hAnsi="BRH Devanagari Extra" w:cs="BRH Devanagari Extra"/>
@@ -581,7 +3576,6 @@
               </w:rPr>
               <w:t>eÉÑ</w:t>
             </w:r>
-            <w:proofErr w:type="spellEnd"/>
             <w:r>
               <w:rPr>
                 <w:rFonts w:ascii="BRH Malayalam Extra" w:hAnsi="BRH Malayalam Extra" w:cs="BRH Devanagari Extra"/>
@@ -659,6 +3653,154 @@
                 <w:sz w:val="40"/>
                 <w:szCs w:val="40"/>
               </w:rPr>
+              <w:t>AÉWÒûþiÉÏ</w:t>
+            </w:r>
+            <w:r>
+              <w:rPr>
+                <w:rFonts w:ascii="BRH Devanagari Extra" w:hAnsi="BRH Devanagari Extra" w:cs="BRH Devanagari Extra"/>
+                <w:color w:val="000000"/>
+                <w:sz w:val="40"/>
+                <w:szCs w:val="40"/>
+                <w:highlight w:val="yellow"/>
+              </w:rPr>
+              <w:t>ÍpÉ</w:t>
+            </w:r>
+            <w:proofErr w:type="spellEnd"/>
+            <w:r>
+              <w:rPr>
+                <w:rFonts w:ascii="BRH Malayalam Extra" w:hAnsi="BRH Malayalam Extra" w:cs="BRH Devanagari Extra"/>
+                <w:color w:val="000000"/>
+                <w:sz w:val="32"/>
+                <w:szCs w:val="40"/>
+              </w:rPr>
+              <w:t>–</w:t>
+            </w:r>
+            <w:proofErr w:type="spellStart"/>
+            <w:r>
+              <w:rPr>
+                <w:rFonts w:ascii="BRH Devanagari Extra" w:hAnsi="BRH Devanagari Extra" w:cs="BRH Devanagari Extra"/>
+                <w:color w:val="000000"/>
+                <w:sz w:val="40"/>
+                <w:szCs w:val="40"/>
+              </w:rPr>
+              <w:t>UåuÉ</w:t>
+            </w:r>
+            <w:proofErr w:type="spellEnd"/>
+            <w:r>
+              <w:rPr>
+                <w:rFonts w:ascii="BRH Devanagari Extra" w:hAnsi="BRH Devanagari Extra" w:cs="BRH Devanagari Extra"/>
+                <w:color w:val="000000"/>
+                <w:sz w:val="40"/>
+                <w:szCs w:val="40"/>
+              </w:rPr>
+              <w:t xml:space="preserve"> |</w:t>
+            </w:r>
+          </w:p>
+        </w:tc>
+        <w:tc>
+          <w:tcPr>
+            <w:tcW w:w="5386" w:type="dxa"/>
+          </w:tcPr>
+          <w:p>
+            <w:pPr>
+              <w:widowControl w:val="0"/>
+              <w:autoSpaceDE w:val="0"/>
+              <w:autoSpaceDN w:val="0"/>
+              <w:adjustRightInd w:val="0"/>
+              <w:spacing w:before="0" w:line="240" w:lineRule="auto"/>
+              <w:rPr>
+                <w:rFonts w:ascii="Cambria" w:hAnsi="Cambria" w:cs="BRH Malayalam Extra"/>
+                <w:color w:val="000000"/>
+                <w:sz w:val="36"/>
+                <w:szCs w:val="40"/>
+              </w:rPr>
+            </w:pPr>
+            <w:r>
+              <w:rPr>
+                <w:rFonts w:ascii="BRH Devanagari Extra" w:hAnsi="BRH Devanagari Extra" w:cs="BRH Devanagari Extra"/>
+                <w:color w:val="000000"/>
+                <w:sz w:val="40"/>
+                <w:szCs w:val="40"/>
+              </w:rPr>
+              <w:t>eÉÑ</w:t>
+            </w:r>
+            <w:r>
+              <w:rPr>
+                <w:rFonts w:ascii="BRH Malayalam Extra" w:hAnsi="BRH Malayalam Extra" w:cs="BRH Devanagari Extra"/>
+                <w:color w:val="000000"/>
+                <w:sz w:val="32"/>
+                <w:szCs w:val="40"/>
+              </w:rPr>
+              <w:t>–</w:t>
+            </w:r>
+            <w:proofErr w:type="spellStart"/>
+            <w:r>
+              <w:rPr>
+                <w:rFonts w:ascii="BRH Devanagari Extra" w:hAnsi="BRH Devanagari Extra" w:cs="BRH Devanagari Extra"/>
+                <w:color w:val="000000"/>
+                <w:sz w:val="40"/>
+                <w:szCs w:val="40"/>
+              </w:rPr>
+              <w:t>WÒû</w:t>
+            </w:r>
+            <w:proofErr w:type="spellEnd"/>
+            <w:r>
+              <w:rPr>
+                <w:rFonts w:ascii="BRH Malayalam Extra" w:hAnsi="BRH Malayalam Extra" w:cs="BRH Devanagari Extra"/>
+                <w:color w:val="000000"/>
+                <w:sz w:val="32"/>
+                <w:szCs w:val="40"/>
+              </w:rPr>
+              <w:t>–</w:t>
+            </w:r>
+            <w:proofErr w:type="spellStart"/>
+            <w:r>
+              <w:rPr>
+                <w:rFonts w:ascii="BRH Devanagari Extra" w:hAnsi="BRH Devanagari Extra" w:cs="BRH Devanagari Extra"/>
+                <w:color w:val="000000"/>
+                <w:sz w:val="40"/>
+                <w:szCs w:val="40"/>
+              </w:rPr>
+              <w:t>rÉÉ</w:t>
+            </w:r>
+            <w:proofErr w:type="spellEnd"/>
+            <w:r>
+              <w:rPr>
+                <w:rFonts w:ascii="BRH Malayalam Extra" w:hAnsi="BRH Malayalam Extra" w:cs="BRH Devanagari Extra"/>
+                <w:color w:val="000000"/>
+                <w:sz w:val="32"/>
+                <w:szCs w:val="40"/>
+              </w:rPr>
+              <w:t>–</w:t>
+            </w:r>
+            <w:proofErr w:type="spellStart"/>
+            <w:r>
+              <w:rPr>
+                <w:rFonts w:ascii="BRH Devanagari Extra" w:hAnsi="BRH Devanagari Extra" w:cs="BRH Devanagari Extra"/>
+                <w:color w:val="000000"/>
+                <w:sz w:val="40"/>
+                <w:szCs w:val="40"/>
+              </w:rPr>
+              <w:t>SÉWÒûþiÉÏÍpÉÈ</w:t>
+            </w:r>
+            <w:proofErr w:type="spellEnd"/>
+            <w:r>
+              <w:rPr>
+                <w:rFonts w:ascii="BRH Devanagari Extra" w:hAnsi="BRH Devanagari Extra" w:cs="BRH Devanagari Extra"/>
+                <w:color w:val="000000"/>
+                <w:sz w:val="40"/>
+                <w:szCs w:val="40"/>
+              </w:rPr>
+              <w:t xml:space="preserve"> | </w:t>
+            </w:r>
+            <w:proofErr w:type="spellStart"/>
+            <w:r>
+              <w:rPr>
+                <w:rFonts w:ascii="BRH Devanagari Extra" w:hAnsi="BRH Devanagari Extra" w:cs="BRH Devanagari Extra"/>
+                <w:color w:val="000000"/>
+                <w:sz w:val="40"/>
+                <w:szCs w:val="40"/>
+              </w:rPr>
               <w:t>AÉWÒûþiÉÏÍpÉ</w:t>
             </w:r>
             <w:r>
@@ -681,25 +3823,14 @@
               </w:rPr>
               <w:t>–</w:t>
             </w:r>
-            <w:proofErr w:type="spellStart"/>
-            <w:r>
-              <w:rPr>
-                <w:rFonts w:ascii="BRH Devanagari Extra" w:hAnsi="BRH Devanagari Extra" w:cs="BRH Devanagari Extra"/>
-                <w:color w:val="000000"/>
-                <w:sz w:val="40"/>
-                <w:szCs w:val="40"/>
-              </w:rPr>
-              <w:t>uÉ</w:t>
-            </w:r>
-            <w:proofErr w:type="spellEnd"/>
-            <w:r>
-              <w:rPr>
-                <w:rFonts w:ascii="BRH Devanagari Extra" w:hAnsi="BRH Devanagari Extra" w:cs="BRH Devanagari Extra"/>
-                <w:color w:val="000000"/>
-                <w:sz w:val="40"/>
-                <w:szCs w:val="40"/>
-              </w:rPr>
-              <w:t xml:space="preserve"> |</w:t>
+            <w:r>
+              <w:rPr>
+                <w:rFonts w:ascii="BRH Devanagari Extra" w:hAnsi="BRH Devanagari Extra" w:cs="BRH Devanagari Extra"/>
+                <w:color w:val="000000"/>
+                <w:sz w:val="40"/>
+                <w:szCs w:val="40"/>
+              </w:rPr>
+              <w:t>uÉ |</w:t>
             </w:r>
           </w:p>
         </w:tc>
@@ -1235,7 +4366,6 @@
                 <w:szCs w:val="40"/>
               </w:rPr>
             </w:pPr>
-            <w:proofErr w:type="spellStart"/>
             <w:r>
               <w:rPr>
                 <w:rFonts w:ascii="BRH Devanagari Extra" w:hAnsi="BRH Devanagari Extra" w:cs="BRH Devanagari Extra"/>
@@ -1246,7 +4376,6 @@
               </w:rPr>
               <w:t>uÉ</w:t>
             </w:r>
-            <w:proofErr w:type="spellEnd"/>
             <w:r>
               <w:rPr>
                 <w:rFonts w:ascii="BRH Malayalam Extra" w:hAnsi="BRH Malayalam Extra" w:cs="BRH Devanagari Extra"/>
@@ -1439,6 +4568,7 @@
                 <w:sz w:val="28"/>
                 <w:szCs w:val="32"/>
               </w:rPr>
+              <w:lastRenderedPageBreak/>
               <w:t>T.S.</w:t>
             </w:r>
             <w:r>
@@ -1692,25 +4822,14 @@
               </w:rPr>
               <w:t>–</w:t>
             </w:r>
-            <w:proofErr w:type="spellStart"/>
-            <w:r>
-              <w:rPr>
-                <w:rFonts w:ascii="BRH Devanagari Extra" w:hAnsi="BRH Devanagari Extra" w:cs="BRH Devanagari Extra"/>
-                <w:color w:val="000000"/>
-                <w:sz w:val="40"/>
-                <w:szCs w:val="40"/>
-              </w:rPr>
-              <w:t>uÉ</w:t>
-            </w:r>
-            <w:proofErr w:type="spellEnd"/>
-            <w:r>
-              <w:rPr>
-                <w:rFonts w:ascii="BRH Devanagari Extra" w:hAnsi="BRH Devanagari Extra" w:cs="BRH Devanagari Extra"/>
-                <w:color w:val="000000"/>
-                <w:sz w:val="40"/>
-                <w:szCs w:val="40"/>
-              </w:rPr>
-              <w:t xml:space="preserve"> |</w:t>
+            <w:r>
+              <w:rPr>
+                <w:rFonts w:ascii="BRH Devanagari Extra" w:hAnsi="BRH Devanagari Extra" w:cs="BRH Devanagari Extra"/>
+                <w:color w:val="000000"/>
+                <w:sz w:val="40"/>
+                <w:szCs w:val="40"/>
+              </w:rPr>
+              <w:t>uÉ |</w:t>
             </w:r>
           </w:p>
         </w:tc>
@@ -1829,7 +4948,6 @@
           <w:szCs w:val="32"/>
           <w:u w:val="single"/>
         </w:rPr>
-        <w:lastRenderedPageBreak/>
         <w:t xml:space="preserve">TS </w:t>
       </w:r>
       <w:r>
@@ -2664,6 +5782,7 @@
                 <w:sz w:val="28"/>
                 <w:szCs w:val="32"/>
               </w:rPr>
+              <w:lastRenderedPageBreak/>
               <w:t>T.S.5.1.4.1 – Kramam</w:t>
             </w:r>
           </w:p>
@@ -2845,7 +5964,6 @@
               </w:rPr>
               <w:t>–</w:t>
             </w:r>
-            <w:proofErr w:type="spellStart"/>
             <w:r>
               <w:rPr>
                 <w:rFonts w:ascii="BRH Devanagari Extra" w:hAnsi="BRH Devanagari Extra" w:cs="BRH Devanagari Extra"/>
@@ -2855,35 +5973,23 @@
               </w:rPr>
               <w:t>rÉ</w:t>
             </w:r>
-            <w:proofErr w:type="spellEnd"/>
-            <w:r>
-              <w:rPr>
-                <w:rFonts w:ascii="BRH Malayalam Extra" w:hAnsi="BRH Malayalam Extra" w:cs="BRH Devanagari Extra"/>
-                <w:color w:val="000000"/>
-                <w:sz w:val="32"/>
-                <w:szCs w:val="40"/>
-              </w:rPr>
-              <w:t>–</w:t>
-            </w:r>
-            <w:proofErr w:type="spellStart"/>
-            <w:r>
-              <w:rPr>
-                <w:rFonts w:ascii="BRH Devanagari Extra" w:hAnsi="BRH Devanagari Extra" w:cs="BRH Devanagari Extra"/>
-                <w:color w:val="000000"/>
-                <w:sz w:val="40"/>
-                <w:szCs w:val="40"/>
-              </w:rPr>
-              <w:t>iÉç</w:t>
-            </w:r>
-            <w:proofErr w:type="spellEnd"/>
-            <w:r>
-              <w:rPr>
-                <w:rFonts w:ascii="BRH Devanagari Extra" w:hAnsi="BRH Devanagari Extra" w:cs="BRH Devanagari Extra"/>
-                <w:color w:val="000000"/>
-                <w:sz w:val="40"/>
-                <w:szCs w:val="40"/>
-              </w:rPr>
-              <w:t xml:space="preserve"> </w:t>
+            <w:r>
+              <w:rPr>
+                <w:rFonts w:ascii="BRH Malayalam Extra" w:hAnsi="BRH Malayalam Extra" w:cs="BRH Devanagari Extra"/>
+                <w:color w:val="000000"/>
+                <w:sz w:val="32"/>
+                <w:szCs w:val="40"/>
+              </w:rPr>
+              <w:t>–</w:t>
+            </w:r>
+            <w:r>
+              <w:rPr>
+                <w:rFonts w:ascii="BRH Devanagari Extra" w:hAnsi="BRH Devanagari Extra" w:cs="BRH Devanagari Extra"/>
+                <w:color w:val="000000"/>
+                <w:sz w:val="40"/>
+                <w:szCs w:val="40"/>
+              </w:rPr>
+              <w:t xml:space="preserve">iÉç </w:t>
             </w:r>
             <w:proofErr w:type="spellStart"/>
             <w:r>
@@ -3005,7 +6111,6 @@
               </w:rPr>
               <w:t>–</w:t>
             </w:r>
-            <w:proofErr w:type="spellStart"/>
             <w:r>
               <w:rPr>
                 <w:rFonts w:ascii="BRH Devanagari Extra" w:hAnsi="BRH Devanagari Extra" w:cs="BRH Devanagari Extra"/>
@@ -3015,35 +6120,23 @@
               </w:rPr>
               <w:t>rÉ</w:t>
             </w:r>
-            <w:proofErr w:type="spellEnd"/>
-            <w:r>
-              <w:rPr>
-                <w:rFonts w:ascii="BRH Malayalam Extra" w:hAnsi="BRH Malayalam Extra" w:cs="BRH Devanagari Extra"/>
-                <w:color w:val="000000"/>
-                <w:sz w:val="32"/>
-                <w:szCs w:val="40"/>
-              </w:rPr>
-              <w:t>–</w:t>
-            </w:r>
-            <w:proofErr w:type="spellStart"/>
-            <w:r>
-              <w:rPr>
-                <w:rFonts w:ascii="BRH Devanagari Extra" w:hAnsi="BRH Devanagari Extra" w:cs="BRH Devanagari Extra"/>
-                <w:color w:val="000000"/>
-                <w:sz w:val="40"/>
-                <w:szCs w:val="40"/>
-              </w:rPr>
-              <w:t>iÉç</w:t>
-            </w:r>
-            <w:proofErr w:type="spellEnd"/>
-            <w:r>
-              <w:rPr>
-                <w:rFonts w:ascii="BRH Devanagari Extra" w:hAnsi="BRH Devanagari Extra" w:cs="BRH Devanagari Extra"/>
-                <w:color w:val="000000"/>
-                <w:sz w:val="40"/>
-                <w:szCs w:val="40"/>
-              </w:rPr>
-              <w:t xml:space="preserve"> </w:t>
+            <w:r>
+              <w:rPr>
+                <w:rFonts w:ascii="BRH Malayalam Extra" w:hAnsi="BRH Malayalam Extra" w:cs="BRH Devanagari Extra"/>
+                <w:color w:val="000000"/>
+                <w:sz w:val="32"/>
+                <w:szCs w:val="40"/>
+              </w:rPr>
+              <w:t>–</w:t>
+            </w:r>
+            <w:r>
+              <w:rPr>
+                <w:rFonts w:ascii="BRH Devanagari Extra" w:hAnsi="BRH Devanagari Extra" w:cs="BRH Devanagari Extra"/>
+                <w:color w:val="000000"/>
+                <w:sz w:val="40"/>
+                <w:szCs w:val="40"/>
+              </w:rPr>
+              <w:t xml:space="preserve">iÉç </w:t>
             </w:r>
             <w:proofErr w:type="spellStart"/>
             <w:r>
@@ -3618,19 +6711,8 @@
                 <w:sz w:val="40"/>
                 <w:szCs w:val="40"/>
               </w:rPr>
-              <w:t xml:space="preserve"> lÉþ½ÌiÉ | </w:t>
-            </w:r>
-            <w:proofErr w:type="spellStart"/>
-            <w:r>
-              <w:rPr>
-                <w:rFonts w:ascii="BRH Devanagari Extra" w:hAnsi="BRH Devanagari Extra" w:cs="BRH Devanagari Extra"/>
-                <w:color w:val="000000"/>
-                <w:sz w:val="40"/>
-                <w:szCs w:val="40"/>
-              </w:rPr>
-              <w:t>lÉ</w:t>
-            </w:r>
-            <w:proofErr w:type="spellEnd"/>
+              <w:t xml:space="preserve"> lÉþ½ÌiÉ | lÉ</w:t>
+            </w:r>
             <w:r>
               <w:rPr>
                 <w:rFonts w:ascii="BRH Malayalam Extra" w:hAnsi="BRH Malayalam Extra" w:cs="BRH Devanagari Extra"/>
@@ -3680,25 +6762,14 @@
               </w:rPr>
               <w:t>–</w:t>
             </w:r>
-            <w:proofErr w:type="spellStart"/>
-            <w:r>
-              <w:rPr>
-                <w:rFonts w:ascii="BRH Devanagari Extra" w:hAnsi="BRH Devanagari Extra" w:cs="BRH Devanagari Extra"/>
-                <w:color w:val="000000"/>
-                <w:sz w:val="40"/>
-                <w:szCs w:val="40"/>
-              </w:rPr>
-              <w:t>uÉ</w:t>
-            </w:r>
-            <w:proofErr w:type="spellEnd"/>
-            <w:r>
-              <w:rPr>
-                <w:rFonts w:ascii="BRH Devanagari Extra" w:hAnsi="BRH Devanagari Extra" w:cs="BRH Devanagari Extra"/>
-                <w:color w:val="000000"/>
-                <w:sz w:val="40"/>
-                <w:szCs w:val="40"/>
-              </w:rPr>
-              <w:t xml:space="preserve"> |</w:t>
+            <w:r>
+              <w:rPr>
+                <w:rFonts w:ascii="BRH Devanagari Extra" w:hAnsi="BRH Devanagari Extra" w:cs="BRH Devanagari Extra"/>
+                <w:color w:val="000000"/>
+                <w:sz w:val="40"/>
+                <w:szCs w:val="40"/>
+              </w:rPr>
+              <w:t>uÉ |</w:t>
             </w:r>
           </w:p>
         </w:tc>
@@ -3738,19 +6809,8 @@
                 <w:sz w:val="40"/>
                 <w:szCs w:val="40"/>
               </w:rPr>
-              <w:t xml:space="preserve"> lÉþ½ÌiÉ | </w:t>
-            </w:r>
-            <w:proofErr w:type="spellStart"/>
-            <w:r>
-              <w:rPr>
-                <w:rFonts w:ascii="BRH Devanagari Extra" w:hAnsi="BRH Devanagari Extra" w:cs="BRH Devanagari Extra"/>
-                <w:color w:val="000000"/>
-                <w:sz w:val="40"/>
-                <w:szCs w:val="40"/>
-              </w:rPr>
-              <w:t>lÉ</w:t>
-            </w:r>
-            <w:proofErr w:type="spellEnd"/>
+              <w:t xml:space="preserve"> lÉþ½ÌiÉ | lÉ</w:t>
+            </w:r>
             <w:r>
               <w:rPr>
                 <w:rFonts w:ascii="BRH Malayalam Extra" w:hAnsi="BRH Malayalam Extra" w:cs="BRH Devanagari Extra"/>
@@ -3808,25 +6868,14 @@
               </w:rPr>
               <w:t>–</w:t>
             </w:r>
-            <w:proofErr w:type="spellStart"/>
-            <w:r>
-              <w:rPr>
-                <w:rFonts w:ascii="BRH Devanagari Extra" w:hAnsi="BRH Devanagari Extra" w:cs="BRH Devanagari Extra"/>
-                <w:color w:val="000000"/>
-                <w:sz w:val="40"/>
-                <w:szCs w:val="40"/>
-              </w:rPr>
-              <w:t>uÉ</w:t>
-            </w:r>
-            <w:proofErr w:type="spellEnd"/>
-            <w:r>
-              <w:rPr>
-                <w:rFonts w:ascii="BRH Devanagari Extra" w:hAnsi="BRH Devanagari Extra" w:cs="BRH Devanagari Extra"/>
-                <w:color w:val="000000"/>
-                <w:sz w:val="40"/>
-                <w:szCs w:val="40"/>
-              </w:rPr>
-              <w:t xml:space="preserve"> |</w:t>
+            <w:r>
+              <w:rPr>
+                <w:rFonts w:ascii="BRH Devanagari Extra" w:hAnsi="BRH Devanagari Extra" w:cs="BRH Devanagari Extra"/>
+                <w:color w:val="000000"/>
+                <w:sz w:val="40"/>
+                <w:szCs w:val="40"/>
+              </w:rPr>
+              <w:t>uÉ |</w:t>
             </w:r>
           </w:p>
         </w:tc>
@@ -3977,7 +7026,6 @@
               </w:rPr>
               <w:t>–</w:t>
             </w:r>
-            <w:proofErr w:type="spellStart"/>
             <w:r>
               <w:rPr>
                 <w:rFonts w:ascii="BRH Devanagari Extra" w:hAnsi="BRH Devanagari Extra" w:cs="BRH Devanagari Extra"/>
@@ -3987,7 +7035,6 @@
               </w:rPr>
               <w:t>Wû</w:t>
             </w:r>
-            <w:proofErr w:type="spellEnd"/>
             <w:r>
               <w:rPr>
                 <w:rFonts w:ascii="BRH Malayalam Extra" w:hAnsi="BRH Malayalam Extra" w:cs="BRH Devanagari Extra"/>
@@ -4148,7 +7195,6 @@
               </w:rPr>
               <w:t>–</w:t>
             </w:r>
-            <w:proofErr w:type="spellStart"/>
             <w:r>
               <w:rPr>
                 <w:rFonts w:ascii="BRH Devanagari Extra" w:hAnsi="BRH Devanagari Extra" w:cs="BRH Devanagari Extra"/>
@@ -4158,7 +7204,6 @@
               </w:rPr>
               <w:t>Wû</w:t>
             </w:r>
-            <w:proofErr w:type="spellEnd"/>
             <w:r>
               <w:rPr>
                 <w:rFonts w:ascii="BRH Malayalam Extra" w:hAnsi="BRH Malayalam Extra" w:cs="BRH Devanagari Extra"/>
@@ -4317,7 +7362,6 @@
                 <w:sz w:val="28"/>
                 <w:szCs w:val="32"/>
               </w:rPr>
-              <w:lastRenderedPageBreak/>
               <w:t>T.S.5.1.8.4 – Kramam</w:t>
             </w:r>
           </w:p>
@@ -4578,37 +7622,15 @@
               </w:rPr>
               <w:t>–</w:t>
             </w:r>
-            <w:proofErr w:type="spellStart"/>
-            <w:r>
-              <w:rPr>
-                <w:rFonts w:ascii="BRH Devanagari Extra" w:hAnsi="BRH Devanagari Extra" w:cs="BRH Devanagari Extra"/>
-                <w:color w:val="000000"/>
-                <w:sz w:val="40"/>
-                <w:szCs w:val="40"/>
-              </w:rPr>
-              <w:t>eÉÉ</w:t>
-            </w:r>
-            <w:proofErr w:type="spellEnd"/>
-            <w:r>
-              <w:rPr>
-                <w:rFonts w:ascii="BRH Devanagari Extra" w:hAnsi="BRH Devanagari Extra" w:cs="BRH Devanagari Extra"/>
-                <w:color w:val="000000"/>
-                <w:sz w:val="40"/>
-                <w:szCs w:val="40"/>
-              </w:rPr>
-              <w:t xml:space="preserve"> - </w:t>
-            </w:r>
-            <w:proofErr w:type="spellStart"/>
-            <w:r>
-              <w:rPr>
-                <w:rFonts w:ascii="BRH Devanagari Extra" w:hAnsi="BRH Devanagari Extra" w:cs="BRH Devanagari Extra"/>
-                <w:color w:val="000000"/>
-                <w:sz w:val="40"/>
-                <w:szCs w:val="40"/>
-              </w:rPr>
-              <w:t>mÉ</w:t>
-            </w:r>
-            <w:proofErr w:type="spellEnd"/>
+            <w:r>
+              <w:rPr>
+                <w:rFonts w:ascii="BRH Devanagari Extra" w:hAnsi="BRH Devanagari Extra" w:cs="BRH Devanagari Extra"/>
+                <w:color w:val="000000"/>
+                <w:sz w:val="40"/>
+                <w:szCs w:val="40"/>
+              </w:rPr>
+              <w:t>eÉÉ - mÉ</w:t>
+            </w:r>
             <w:r>
               <w:rPr>
                 <w:rFonts w:ascii="BRH Malayalam Extra" w:hAnsi="BRH Malayalam Extra" w:cs="BRH Devanagari Extra"/>
@@ -4935,37 +7957,15 @@
               </w:rPr>
               <w:t>–</w:t>
             </w:r>
-            <w:proofErr w:type="spellStart"/>
-            <w:r>
-              <w:rPr>
-                <w:rFonts w:ascii="BRH Devanagari Extra" w:hAnsi="BRH Devanagari Extra" w:cs="BRH Devanagari Extra"/>
-                <w:color w:val="000000"/>
-                <w:sz w:val="40"/>
-                <w:szCs w:val="40"/>
-              </w:rPr>
-              <w:t>eÉÉ</w:t>
-            </w:r>
-            <w:proofErr w:type="spellEnd"/>
-            <w:r>
-              <w:rPr>
-                <w:rFonts w:ascii="BRH Devanagari Extra" w:hAnsi="BRH Devanagari Extra" w:cs="BRH Devanagari Extra"/>
-                <w:color w:val="000000"/>
-                <w:sz w:val="40"/>
-                <w:szCs w:val="40"/>
-              </w:rPr>
-              <w:t xml:space="preserve"> - </w:t>
-            </w:r>
-            <w:proofErr w:type="spellStart"/>
-            <w:r>
-              <w:rPr>
-                <w:rFonts w:ascii="BRH Devanagari Extra" w:hAnsi="BRH Devanagari Extra" w:cs="BRH Devanagari Extra"/>
-                <w:color w:val="000000"/>
-                <w:sz w:val="40"/>
-                <w:szCs w:val="40"/>
-              </w:rPr>
-              <w:t>mÉ</w:t>
-            </w:r>
-            <w:proofErr w:type="spellEnd"/>
+            <w:r>
+              <w:rPr>
+                <w:rFonts w:ascii="BRH Devanagari Extra" w:hAnsi="BRH Devanagari Extra" w:cs="BRH Devanagari Extra"/>
+                <w:color w:val="000000"/>
+                <w:sz w:val="40"/>
+                <w:szCs w:val="40"/>
+              </w:rPr>
+              <w:t>eÉÉ - mÉ</w:t>
+            </w:r>
             <w:r>
               <w:rPr>
                 <w:rFonts w:ascii="BRH Malayalam Extra" w:hAnsi="BRH Malayalam Extra" w:cs="BRH Devanagari Extra"/>
@@ -5540,6 +8540,7 @@
                 <w:sz w:val="28"/>
                 <w:szCs w:val="32"/>
               </w:rPr>
+              <w:lastRenderedPageBreak/>
               <w:t>T.S.5.1.9.5 – Kramam</w:t>
             </w:r>
           </w:p>
@@ -6349,47 +9350,34 @@
               </w:rPr>
               <w:t>–</w:t>
             </w:r>
-            <w:proofErr w:type="spellStart"/>
-            <w:r>
-              <w:rPr>
-                <w:rFonts w:ascii="BRH Devanagari Extra" w:hAnsi="BRH Devanagari Extra" w:cs="BRH Devanagari Extra"/>
-                <w:color w:val="000000"/>
-                <w:sz w:val="40"/>
-                <w:szCs w:val="40"/>
+            <w:r>
+              <w:rPr>
+                <w:rFonts w:ascii="BRH Devanagari Extra" w:hAnsi="BRH Devanagari Extra" w:cs="BRH Devanagari Extra"/>
+                <w:color w:val="000000"/>
+                <w:sz w:val="40"/>
+                <w:szCs w:val="40"/>
+              </w:rPr>
+              <w:t>uÉ | L</w:t>
+            </w:r>
+            <w:r>
+              <w:rPr>
+                <w:rFonts w:ascii="BRH Malayalam Extra" w:hAnsi="BRH Malayalam Extra" w:cs="BRH Devanagari Extra"/>
+                <w:color w:val="000000"/>
+                <w:sz w:val="32"/>
+                <w:szCs w:val="40"/>
+              </w:rPr>
+              <w:t>–</w:t>
+            </w:r>
+            <w:r>
+              <w:rPr>
+                <w:rFonts w:ascii="BRH Devanagari Extra" w:hAnsi="BRH Devanagari Extra" w:cs="BRH Devanagari Extra"/>
+                <w:color w:val="000000"/>
+                <w:sz w:val="40"/>
+                <w:szCs w:val="40"/>
+                <w:highlight w:val="yellow"/>
               </w:rPr>
               <w:t>uÉ</w:t>
             </w:r>
-            <w:proofErr w:type="spellEnd"/>
-            <w:r>
-              <w:rPr>
-                <w:rFonts w:ascii="BRH Devanagari Extra" w:hAnsi="BRH Devanagari Extra" w:cs="BRH Devanagari Extra"/>
-                <w:color w:val="000000"/>
-                <w:sz w:val="40"/>
-                <w:szCs w:val="40"/>
-              </w:rPr>
-              <w:t xml:space="preserve"> | L</w:t>
-            </w:r>
-            <w:r>
-              <w:rPr>
-                <w:rFonts w:ascii="BRH Malayalam Extra" w:hAnsi="BRH Malayalam Extra" w:cs="BRH Devanagari Extra"/>
-                <w:color w:val="000000"/>
-                <w:sz w:val="32"/>
-                <w:szCs w:val="40"/>
-              </w:rPr>
-              <w:t>–</w:t>
-            </w:r>
-            <w:proofErr w:type="spellStart"/>
-            <w:r>
-              <w:rPr>
-                <w:rFonts w:ascii="BRH Devanagari Extra" w:hAnsi="BRH Devanagari Extra" w:cs="BRH Devanagari Extra"/>
-                <w:color w:val="000000"/>
-                <w:sz w:val="40"/>
-                <w:szCs w:val="40"/>
-                <w:highlight w:val="yellow"/>
-              </w:rPr>
-              <w:t>uÉ</w:t>
-            </w:r>
-            <w:proofErr w:type="spellEnd"/>
             <w:r>
               <w:rPr>
                 <w:rFonts w:ascii="BRH Malayalam Extra" w:hAnsi="BRH Malayalam Extra" w:cs="BRH Devanagari Extra"/>
@@ -6485,47 +9473,34 @@
               </w:rPr>
               <w:t>–</w:t>
             </w:r>
-            <w:proofErr w:type="spellStart"/>
-            <w:r>
-              <w:rPr>
-                <w:rFonts w:ascii="BRH Devanagari Extra" w:hAnsi="BRH Devanagari Extra" w:cs="BRH Devanagari Extra"/>
-                <w:color w:val="000000"/>
-                <w:sz w:val="40"/>
-                <w:szCs w:val="40"/>
+            <w:r>
+              <w:rPr>
+                <w:rFonts w:ascii="BRH Devanagari Extra" w:hAnsi="BRH Devanagari Extra" w:cs="BRH Devanagari Extra"/>
+                <w:color w:val="000000"/>
+                <w:sz w:val="40"/>
+                <w:szCs w:val="40"/>
+              </w:rPr>
+              <w:t>uÉ | L</w:t>
+            </w:r>
+            <w:r>
+              <w:rPr>
+                <w:rFonts w:ascii="BRH Malayalam Extra" w:hAnsi="BRH Malayalam Extra" w:cs="BRH Devanagari Extra"/>
+                <w:color w:val="000000"/>
+                <w:sz w:val="32"/>
+                <w:szCs w:val="40"/>
+              </w:rPr>
+              <w:t>–</w:t>
+            </w:r>
+            <w:r>
+              <w:rPr>
+                <w:rFonts w:ascii="BRH Devanagari Extra" w:hAnsi="BRH Devanagari Extra" w:cs="BRH Devanagari Extra"/>
+                <w:color w:val="000000"/>
+                <w:sz w:val="40"/>
+                <w:szCs w:val="40"/>
+                <w:highlight w:val="green"/>
               </w:rPr>
               <w:t>uÉ</w:t>
             </w:r>
-            <w:proofErr w:type="spellEnd"/>
-            <w:r>
-              <w:rPr>
-                <w:rFonts w:ascii="BRH Devanagari Extra" w:hAnsi="BRH Devanagari Extra" w:cs="BRH Devanagari Extra"/>
-                <w:color w:val="000000"/>
-                <w:sz w:val="40"/>
-                <w:szCs w:val="40"/>
-              </w:rPr>
-              <w:t xml:space="preserve"> | L</w:t>
-            </w:r>
-            <w:r>
-              <w:rPr>
-                <w:rFonts w:ascii="BRH Malayalam Extra" w:hAnsi="BRH Malayalam Extra" w:cs="BRH Devanagari Extra"/>
-                <w:color w:val="000000"/>
-                <w:sz w:val="32"/>
-                <w:szCs w:val="40"/>
-              </w:rPr>
-              <w:t>–</w:t>
-            </w:r>
-            <w:proofErr w:type="spellStart"/>
-            <w:r>
-              <w:rPr>
-                <w:rFonts w:ascii="BRH Devanagari Extra" w:hAnsi="BRH Devanagari Extra" w:cs="BRH Devanagari Extra"/>
-                <w:color w:val="000000"/>
-                <w:sz w:val="40"/>
-                <w:szCs w:val="40"/>
-                <w:highlight w:val="green"/>
-              </w:rPr>
-              <w:t>uÉ</w:t>
-            </w:r>
-            <w:proofErr w:type="spellEnd"/>
             <w:r>
               <w:rPr>
                 <w:rFonts w:ascii="BRH Devanagari Extra" w:hAnsi="BRH Devanagari Extra" w:cs="BRH Devanagari Extra"/>
@@ -6764,7 +9739,6 @@
           <w:szCs w:val="30"/>
           <w:u w:val="single"/>
         </w:rPr>
-        <w:lastRenderedPageBreak/>
         <w:t xml:space="preserve">TS </w:t>
       </w:r>
       <w:r>
@@ -7121,7 +10095,7 @@
 </file>
 
 <file path=word/endnotes.xml><?xml version="1.0" encoding="utf-8"?>
-<w:endnotes xmlns:wpc="http://schemas.microsoft.com/office/word/2010/wordprocessingCanvas" xmlns:cx="http://schemas.microsoft.com/office/drawing/2014/chartex" xmlns:cx1="http://schemas.microsoft.com/office/drawing/2015/9/8/chartex" xmlns:mc="http://schemas.openxmlformats.org/markup-compatibility/2006" xmlns:o="urn:schemas-microsoft-com:office:office" xmlns:r="http://schemas.openxmlformats.org/officeDocument/2006/relationships" xmlns:m="http://schemas.openxmlformats.org/officeDocument/2006/math" xmlns:v="urn:schemas-microsoft-com:vml" xmlns:wp14="http://schemas.microsoft.com/office/word/2010/wordprocessingDrawing" xmlns:wp="http://schemas.openxmlformats.org/drawingml/2006/wordprocessingDrawing" xmlns:w10="urn:schemas-microsoft-com:office:word" xmlns:w="http://schemas.openxmlformats.org/wordprocessingml/2006/main" xmlns:w14="http://schemas.microsoft.com/office/word/2010/wordml" xmlns:w15="http://schemas.microsoft.com/office/word/2012/wordml" xmlns:w16se="http://schemas.microsoft.com/office/word/2015/wordml/symex" xmlns:wpg="http://schemas.microsoft.com/office/word/2010/wordprocessingGroup" xmlns:wpi="http://schemas.microsoft.com/office/word/2010/wordprocessingInk" xmlns:wne="http://schemas.microsoft.com/office/word/2006/wordml" xmlns:wps="http://schemas.microsoft.com/office/word/2010/wordprocessingShape" mc:Ignorable="w14 w15 w16se wp14">
+<w:endnotes xmlns:wpc="http://schemas.microsoft.com/office/word/2010/wordprocessingCanvas" xmlns:cx="http://schemas.microsoft.com/office/drawing/2014/chartex" xmlns:cx1="http://schemas.microsoft.com/office/drawing/2015/9/8/chartex" xmlns:cx2="http://schemas.microsoft.com/office/drawing/2015/10/21/chartex" xmlns:cx3="http://schemas.microsoft.com/office/drawing/2016/5/9/chartex" xmlns:cx4="http://schemas.microsoft.com/office/drawing/2016/5/10/chartex" xmlns:cx5="http://schemas.microsoft.com/office/drawing/2016/5/11/chartex" xmlns:cx6="http://schemas.microsoft.com/office/drawing/2016/5/12/chartex" xmlns:cx7="http://schemas.microsoft.com/office/drawing/2016/5/13/chartex" xmlns:cx8="http://schemas.microsoft.com/office/drawing/2016/5/14/chartex" xmlns:mc="http://schemas.openxmlformats.org/markup-compatibility/2006" xmlns:aink="http://schemas.microsoft.com/office/drawing/2016/ink" xmlns:am3d="http://schemas.microsoft.com/office/drawing/2017/model3d" xmlns:o="urn:schemas-microsoft-com:office:office" xmlns:oel="http://schemas.microsoft.com/office/2019/extlst" xmlns:r="http://schemas.openxmlformats.org/officeDocument/2006/relationships" xmlns:m="http://schemas.openxmlformats.org/officeDocument/2006/math" xmlns:v="urn:schemas-microsoft-com:vml" xmlns:wp14="http://schemas.microsoft.com/office/word/2010/wordprocessingDrawing" xmlns:wp="http://schemas.openxmlformats.org/drawingml/2006/wordprocessingDrawing" xmlns:w10="urn:schemas-microsoft-com:office:word" xmlns:w="http://schemas.openxmlformats.org/wordprocessingml/2006/main" xmlns:w14="http://schemas.microsoft.com/office/word/2010/wordml" xmlns:w15="http://schemas.microsoft.com/office/word/2012/wordml" xmlns:w16cex="http://schemas.microsoft.com/office/word/2018/wordml/cex" xmlns:w16cid="http://schemas.microsoft.com/office/word/2016/wordml/cid" xmlns:w16="http://schemas.microsoft.com/office/word/2018/wordml" xmlns:w16du="http://schemas.microsoft.com/office/word/2023/wordml/word16du" xmlns:w16sdtdh="http://schemas.microsoft.com/office/word/2020/wordml/sdtdatahash" xmlns:w16sdtfl="http://schemas.microsoft.com/office/word/2024/wordml/sdtformatlock" xmlns:w16se="http://schemas.microsoft.com/office/word/2015/wordml/symex" xmlns:wpg="http://schemas.microsoft.com/office/word/2010/wordprocessingGroup" xmlns:wpi="http://schemas.microsoft.com/office/word/2010/wordprocessingInk" xmlns:wne="http://schemas.microsoft.com/office/word/2006/wordml" xmlns:wps="http://schemas.microsoft.com/office/word/2010/wordprocessingShape" mc:Ignorable="w14 w15 w16se w16cid w16 w16cex w16sdtdh w16sdtfl w16du wp14">
   <w:endnote w:type="separator" w:id="-1">
     <w:p>
       <w:pPr>
@@ -7146,7 +10120,7 @@
 </file>
 
 <file path=word/footer1.xml><?xml version="1.0" encoding="utf-8"?>
-<w:ftr xmlns:wpc="http://schemas.microsoft.com/office/word/2010/wordprocessingCanvas" xmlns:cx="http://schemas.microsoft.com/office/drawing/2014/chartex" xmlns:cx1="http://schemas.microsoft.com/office/drawing/2015/9/8/chartex" xmlns:mc="http://schemas.openxmlformats.org/markup-compatibility/2006" xmlns:o="urn:schemas-microsoft-com:office:office" xmlns:r="http://schemas.openxmlformats.org/officeDocument/2006/relationships" xmlns:m="http://schemas.openxmlformats.org/officeDocument/2006/math" xmlns:v="urn:schemas-microsoft-com:vml" xmlns:wp14="http://schemas.microsoft.com/office/word/2010/wordprocessingDrawing" xmlns:wp="http://schemas.openxmlformats.org/drawingml/2006/wordprocessingDrawing" xmlns:w10="urn:schemas-microsoft-com:office:word" xmlns:w="http://schemas.openxmlformats.org/wordprocessingml/2006/main" xmlns:w14="http://schemas.microsoft.com/office/word/2010/wordml" xmlns:w15="http://schemas.microsoft.com/office/word/2012/wordml" xmlns:w16se="http://schemas.microsoft.com/office/word/2015/wordml/symex" xmlns:wpg="http://schemas.microsoft.com/office/word/2010/wordprocessingGroup" xmlns:wpi="http://schemas.microsoft.com/office/word/2010/wordprocessingInk" xmlns:wne="http://schemas.microsoft.com/office/word/2006/wordml" xmlns:wps="http://schemas.microsoft.com/office/word/2010/wordprocessingShape" mc:Ignorable="w14 w15 w16se wp14">
+<w:ftr xmlns:wpc="http://schemas.microsoft.com/office/word/2010/wordprocessingCanvas" xmlns:cx="http://schemas.microsoft.com/office/drawing/2014/chartex" xmlns:cx1="http://schemas.microsoft.com/office/drawing/2015/9/8/chartex" xmlns:cx2="http://schemas.microsoft.com/office/drawing/2015/10/21/chartex" xmlns:cx3="http://schemas.microsoft.com/office/drawing/2016/5/9/chartex" xmlns:cx4="http://schemas.microsoft.com/office/drawing/2016/5/10/chartex" xmlns:cx5="http://schemas.microsoft.com/office/drawing/2016/5/11/chartex" xmlns:cx6="http://schemas.microsoft.com/office/drawing/2016/5/12/chartex" xmlns:cx7="http://schemas.microsoft.com/office/drawing/2016/5/13/chartex" xmlns:cx8="http://schemas.microsoft.com/office/drawing/2016/5/14/chartex" xmlns:mc="http://schemas.openxmlformats.org/markup-compatibility/2006" xmlns:aink="http://schemas.microsoft.com/office/drawing/2016/ink" xmlns:am3d="http://schemas.microsoft.com/office/drawing/2017/model3d" xmlns:o="urn:schemas-microsoft-com:office:office" xmlns:oel="http://schemas.microsoft.com/office/2019/extlst" xmlns:r="http://schemas.openxmlformats.org/officeDocument/2006/relationships" xmlns:m="http://schemas.openxmlformats.org/officeDocument/2006/math" xmlns:v="urn:schemas-microsoft-com:vml" xmlns:wp14="http://schemas.microsoft.com/office/word/2010/wordprocessingDrawing" xmlns:wp="http://schemas.openxmlformats.org/drawingml/2006/wordprocessingDrawing" xmlns:w10="urn:schemas-microsoft-com:office:word" xmlns:w="http://schemas.openxmlformats.org/wordprocessingml/2006/main" xmlns:w14="http://schemas.microsoft.com/office/word/2010/wordml" xmlns:w15="http://schemas.microsoft.com/office/word/2012/wordml" xmlns:w16cex="http://schemas.microsoft.com/office/word/2018/wordml/cex" xmlns:w16cid="http://schemas.microsoft.com/office/word/2016/wordml/cid" xmlns:w16="http://schemas.microsoft.com/office/word/2018/wordml" xmlns:w16du="http://schemas.microsoft.com/office/word/2023/wordml/word16du" xmlns:w16sdtdh="http://schemas.microsoft.com/office/word/2020/wordml/sdtdatahash" xmlns:w16sdtfl="http://schemas.microsoft.com/office/word/2024/wordml/sdtformatlock" xmlns:w16se="http://schemas.microsoft.com/office/word/2015/wordml/symex" xmlns:wpg="http://schemas.microsoft.com/office/word/2010/wordprocessingGroup" xmlns:wpi="http://schemas.microsoft.com/office/word/2010/wordprocessingInk" xmlns:wne="http://schemas.microsoft.com/office/word/2006/wordml" xmlns:wps="http://schemas.microsoft.com/office/word/2010/wordprocessingShape" mc:Ignorable="w14 w15 w16se w16cid w16 w16cex w16sdtdh w16sdtfl w16du wp14">
   <w:p>
     <w:pPr>
       <w:pBdr>
@@ -7293,7 +10267,7 @@
 </file>
 
 <file path=word/footer2.xml><?xml version="1.0" encoding="utf-8"?>
-<w:ftr xmlns:wpc="http://schemas.microsoft.com/office/word/2010/wordprocessingCanvas" xmlns:cx="http://schemas.microsoft.com/office/drawing/2014/chartex" xmlns:cx1="http://schemas.microsoft.com/office/drawing/2015/9/8/chartex" xmlns:mc="http://schemas.openxmlformats.org/markup-compatibility/2006" xmlns:o="urn:schemas-microsoft-com:office:office" xmlns:r="http://schemas.openxmlformats.org/officeDocument/2006/relationships" xmlns:m="http://schemas.openxmlformats.org/officeDocument/2006/math" xmlns:v="urn:schemas-microsoft-com:vml" xmlns:wp14="http://schemas.microsoft.com/office/word/2010/wordprocessingDrawing" xmlns:wp="http://schemas.openxmlformats.org/drawingml/2006/wordprocessingDrawing" xmlns:w10="urn:schemas-microsoft-com:office:word" xmlns:w="http://schemas.openxmlformats.org/wordprocessingml/2006/main" xmlns:w14="http://schemas.microsoft.com/office/word/2010/wordml" xmlns:w15="http://schemas.microsoft.com/office/word/2012/wordml" xmlns:w16se="http://schemas.microsoft.com/office/word/2015/wordml/symex" xmlns:wpg="http://schemas.microsoft.com/office/word/2010/wordprocessingGroup" xmlns:wpi="http://schemas.microsoft.com/office/word/2010/wordprocessingInk" xmlns:wne="http://schemas.microsoft.com/office/word/2006/wordml" xmlns:wps="http://schemas.microsoft.com/office/word/2010/wordprocessingShape" mc:Ignorable="w14 w15 w16se wp14">
+<w:ftr xmlns:wpc="http://schemas.microsoft.com/office/word/2010/wordprocessingCanvas" xmlns:cx="http://schemas.microsoft.com/office/drawing/2014/chartex" xmlns:cx1="http://schemas.microsoft.com/office/drawing/2015/9/8/chartex" xmlns:cx2="http://schemas.microsoft.com/office/drawing/2015/10/21/chartex" xmlns:cx3="http://schemas.microsoft.com/office/drawing/2016/5/9/chartex" xmlns:cx4="http://schemas.microsoft.com/office/drawing/2016/5/10/chartex" xmlns:cx5="http://schemas.microsoft.com/office/drawing/2016/5/11/chartex" xmlns:cx6="http://schemas.microsoft.com/office/drawing/2016/5/12/chartex" xmlns:cx7="http://schemas.microsoft.com/office/drawing/2016/5/13/chartex" xmlns:cx8="http://schemas.microsoft.com/office/drawing/2016/5/14/chartex" xmlns:mc="http://schemas.openxmlformats.org/markup-compatibility/2006" xmlns:aink="http://schemas.microsoft.com/office/drawing/2016/ink" xmlns:am3d="http://schemas.microsoft.com/office/drawing/2017/model3d" xmlns:o="urn:schemas-microsoft-com:office:office" xmlns:oel="http://schemas.microsoft.com/office/2019/extlst" xmlns:r="http://schemas.openxmlformats.org/officeDocument/2006/relationships" xmlns:m="http://schemas.openxmlformats.org/officeDocument/2006/math" xmlns:v="urn:schemas-microsoft-com:vml" xmlns:wp14="http://schemas.microsoft.com/office/word/2010/wordprocessingDrawing" xmlns:wp="http://schemas.openxmlformats.org/drawingml/2006/wordprocessingDrawing" xmlns:w10="urn:schemas-microsoft-com:office:word" xmlns:w="http://schemas.openxmlformats.org/wordprocessingml/2006/main" xmlns:w14="http://schemas.microsoft.com/office/word/2010/wordml" xmlns:w15="http://schemas.microsoft.com/office/word/2012/wordml" xmlns:w16cex="http://schemas.microsoft.com/office/word/2018/wordml/cex" xmlns:w16cid="http://schemas.microsoft.com/office/word/2016/wordml/cid" xmlns:w16="http://schemas.microsoft.com/office/word/2018/wordml" xmlns:w16du="http://schemas.microsoft.com/office/word/2023/wordml/word16du" xmlns:w16sdtdh="http://schemas.microsoft.com/office/word/2020/wordml/sdtdatahash" xmlns:w16sdtfl="http://schemas.microsoft.com/office/word/2024/wordml/sdtformatlock" xmlns:w16se="http://schemas.microsoft.com/office/word/2015/wordml/symex" xmlns:wpg="http://schemas.microsoft.com/office/word/2010/wordprocessingGroup" xmlns:wpi="http://schemas.microsoft.com/office/word/2010/wordprocessingInk" xmlns:wne="http://schemas.microsoft.com/office/word/2006/wordml" xmlns:wps="http://schemas.microsoft.com/office/word/2010/wordprocessingShape" mc:Ignorable="w14 w15 w16se w16cid w16 w16cex w16sdtdh w16sdtfl w16du wp14">
   <w:p>
     <w:pPr>
       <w:pBdr>
@@ -7464,7 +10438,7 @@
 </file>
 
 <file path=word/footnotes.xml><?xml version="1.0" encoding="utf-8"?>
-<w:footnotes xmlns:wpc="http://schemas.microsoft.com/office/word/2010/wordprocessingCanvas" xmlns:cx="http://schemas.microsoft.com/office/drawing/2014/chartex" xmlns:cx1="http://schemas.microsoft.com/office/drawing/2015/9/8/chartex" xmlns:mc="http://schemas.openxmlformats.org/markup-compatibility/2006" xmlns:o="urn:schemas-microsoft-com:office:office" xmlns:r="http://schemas.openxmlformats.org/officeDocument/2006/relationships" xmlns:m="http://schemas.openxmlformats.org/officeDocument/2006/math" xmlns:v="urn:schemas-microsoft-com:vml" xmlns:wp14="http://schemas.microsoft.com/office/word/2010/wordprocessingDrawing" xmlns:wp="http://schemas.openxmlformats.org/drawingml/2006/wordprocessingDrawing" xmlns:w10="urn:schemas-microsoft-com:office:word" xmlns:w="http://schemas.openxmlformats.org/wordprocessingml/2006/main" xmlns:w14="http://schemas.microsoft.com/office/word/2010/wordml" xmlns:w15="http://schemas.microsoft.com/office/word/2012/wordml" xmlns:w16se="http://schemas.microsoft.com/office/word/2015/wordml/symex" xmlns:wpg="http://schemas.microsoft.com/office/word/2010/wordprocessingGroup" xmlns:wpi="http://schemas.microsoft.com/office/word/2010/wordprocessingInk" xmlns:wne="http://schemas.microsoft.com/office/word/2006/wordml" xmlns:wps="http://schemas.microsoft.com/office/word/2010/wordprocessingShape" mc:Ignorable="w14 w15 w16se wp14">
+<w:footnotes xmlns:wpc="http://schemas.microsoft.com/office/word/2010/wordprocessingCanvas" xmlns:cx="http://schemas.microsoft.com/office/drawing/2014/chartex" xmlns:cx1="http://schemas.microsoft.com/office/drawing/2015/9/8/chartex" xmlns:cx2="http://schemas.microsoft.com/office/drawing/2015/10/21/chartex" xmlns:cx3="http://schemas.microsoft.com/office/drawing/2016/5/9/chartex" xmlns:cx4="http://schemas.microsoft.com/office/drawing/2016/5/10/chartex" xmlns:cx5="http://schemas.microsoft.com/office/drawing/2016/5/11/chartex" xmlns:cx6="http://schemas.microsoft.com/office/drawing/2016/5/12/chartex" xmlns:cx7="http://schemas.microsoft.com/office/drawing/2016/5/13/chartex" xmlns:cx8="http://schemas.microsoft.com/office/drawing/2016/5/14/chartex" xmlns:mc="http://schemas.openxmlformats.org/markup-compatibility/2006" xmlns:aink="http://schemas.microsoft.com/office/drawing/2016/ink" xmlns:am3d="http://schemas.microsoft.com/office/drawing/2017/model3d" xmlns:o="urn:schemas-microsoft-com:office:office" xmlns:oel="http://schemas.microsoft.com/office/2019/extlst" xmlns:r="http://schemas.openxmlformats.org/officeDocument/2006/relationships" xmlns:m="http://schemas.openxmlformats.org/officeDocument/2006/math" xmlns:v="urn:schemas-microsoft-com:vml" xmlns:wp14="http://schemas.microsoft.com/office/word/2010/wordprocessingDrawing" xmlns:wp="http://schemas.openxmlformats.org/drawingml/2006/wordprocessingDrawing" xmlns:w10="urn:schemas-microsoft-com:office:word" xmlns:w="http://schemas.openxmlformats.org/wordprocessingml/2006/main" xmlns:w14="http://schemas.microsoft.com/office/word/2010/wordml" xmlns:w15="http://schemas.microsoft.com/office/word/2012/wordml" xmlns:w16cex="http://schemas.microsoft.com/office/word/2018/wordml/cex" xmlns:w16cid="http://schemas.microsoft.com/office/word/2016/wordml/cid" xmlns:w16="http://schemas.microsoft.com/office/word/2018/wordml" xmlns:w16du="http://schemas.microsoft.com/office/word/2023/wordml/word16du" xmlns:w16sdtdh="http://schemas.microsoft.com/office/word/2020/wordml/sdtdatahash" xmlns:w16sdtfl="http://schemas.microsoft.com/office/word/2024/wordml/sdtformatlock" xmlns:w16se="http://schemas.microsoft.com/office/word/2015/wordml/symex" xmlns:wpg="http://schemas.microsoft.com/office/word/2010/wordprocessingGroup" xmlns:wpi="http://schemas.microsoft.com/office/word/2010/wordprocessingInk" xmlns:wne="http://schemas.microsoft.com/office/word/2006/wordml" xmlns:wps="http://schemas.microsoft.com/office/word/2010/wordprocessingShape" mc:Ignorable="w14 w15 w16se w16cid w16 w16cex w16sdtdh w16sdtfl w16du wp14">
   <w:footnote w:type="separator" w:id="-1">
     <w:p>
       <w:pPr>
@@ -7489,7 +10463,7 @@
 </file>
 
 <file path=word/header1.xml><?xml version="1.0" encoding="utf-8"?>
-<w:hdr xmlns:wpc="http://schemas.microsoft.com/office/word/2010/wordprocessingCanvas" xmlns:cx="http://schemas.microsoft.com/office/drawing/2014/chartex" xmlns:cx1="http://schemas.microsoft.com/office/drawing/2015/9/8/chartex" xmlns:mc="http://schemas.openxmlformats.org/markup-compatibility/2006" xmlns:o="urn:schemas-microsoft-com:office:office" xmlns:r="http://schemas.openxmlformats.org/officeDocument/2006/relationships" xmlns:m="http://schemas.openxmlformats.org/officeDocument/2006/math" xmlns:v="urn:schemas-microsoft-com:vml" xmlns:wp14="http://schemas.microsoft.com/office/word/2010/wordprocessingDrawing" xmlns:wp="http://schemas.openxmlformats.org/drawingml/2006/wordprocessingDrawing" xmlns:w10="urn:schemas-microsoft-com:office:word" xmlns:w="http://schemas.openxmlformats.org/wordprocessingml/2006/main" xmlns:w14="http://schemas.microsoft.com/office/word/2010/wordml" xmlns:w15="http://schemas.microsoft.com/office/word/2012/wordml" xmlns:w16se="http://schemas.microsoft.com/office/word/2015/wordml/symex" xmlns:wpg="http://schemas.microsoft.com/office/word/2010/wordprocessingGroup" xmlns:wpi="http://schemas.microsoft.com/office/word/2010/wordprocessingInk" xmlns:wne="http://schemas.microsoft.com/office/word/2006/wordml" xmlns:wps="http://schemas.microsoft.com/office/word/2010/wordprocessingShape" mc:Ignorable="w14 w15 w16se wp14">
+<w:hdr xmlns:wpc="http://schemas.microsoft.com/office/word/2010/wordprocessingCanvas" xmlns:cx="http://schemas.microsoft.com/office/drawing/2014/chartex" xmlns:cx1="http://schemas.microsoft.com/office/drawing/2015/9/8/chartex" xmlns:cx2="http://schemas.microsoft.com/office/drawing/2015/10/21/chartex" xmlns:cx3="http://schemas.microsoft.com/office/drawing/2016/5/9/chartex" xmlns:cx4="http://schemas.microsoft.com/office/drawing/2016/5/10/chartex" xmlns:cx5="http://schemas.microsoft.com/office/drawing/2016/5/11/chartex" xmlns:cx6="http://schemas.microsoft.com/office/drawing/2016/5/12/chartex" xmlns:cx7="http://schemas.microsoft.com/office/drawing/2016/5/13/chartex" xmlns:cx8="http://schemas.microsoft.com/office/drawing/2016/5/14/chartex" xmlns:mc="http://schemas.openxmlformats.org/markup-compatibility/2006" xmlns:aink="http://schemas.microsoft.com/office/drawing/2016/ink" xmlns:am3d="http://schemas.microsoft.com/office/drawing/2017/model3d" xmlns:o="urn:schemas-microsoft-com:office:office" xmlns:oel="http://schemas.microsoft.com/office/2019/extlst" xmlns:r="http://schemas.openxmlformats.org/officeDocument/2006/relationships" xmlns:m="http://schemas.openxmlformats.org/officeDocument/2006/math" xmlns:v="urn:schemas-microsoft-com:vml" xmlns:wp14="http://schemas.microsoft.com/office/word/2010/wordprocessingDrawing" xmlns:wp="http://schemas.openxmlformats.org/drawingml/2006/wordprocessingDrawing" xmlns:w10="urn:schemas-microsoft-com:office:word" xmlns:w="http://schemas.openxmlformats.org/wordprocessingml/2006/main" xmlns:w14="http://schemas.microsoft.com/office/word/2010/wordml" xmlns:w15="http://schemas.microsoft.com/office/word/2012/wordml" xmlns:w16cex="http://schemas.microsoft.com/office/word/2018/wordml/cex" xmlns:w16cid="http://schemas.microsoft.com/office/word/2016/wordml/cid" xmlns:w16="http://schemas.microsoft.com/office/word/2018/wordml" xmlns:w16du="http://schemas.microsoft.com/office/word/2023/wordml/word16du" xmlns:w16sdtdh="http://schemas.microsoft.com/office/word/2020/wordml/sdtdatahash" xmlns:w16sdtfl="http://schemas.microsoft.com/office/word/2024/wordml/sdtformatlock" xmlns:w16se="http://schemas.microsoft.com/office/word/2015/wordml/symex" xmlns:wpg="http://schemas.microsoft.com/office/word/2010/wordprocessingGroup" xmlns:wpi="http://schemas.microsoft.com/office/word/2010/wordprocessingInk" xmlns:wne="http://schemas.microsoft.com/office/word/2006/wordml" xmlns:wps="http://schemas.microsoft.com/office/word/2010/wordprocessingShape" mc:Ignorable="w14 w15 w16se w16cid w16 w16cex w16sdtdh w16sdtfl w16du wp14">
   <w:p>
     <w:pPr>
       <w:pStyle w:val="Header"/>
@@ -7502,7 +10476,7 @@
 </file>
 
 <file path=word/header2.xml><?xml version="1.0" encoding="utf-8"?>
-<w:hdr xmlns:wpc="http://schemas.microsoft.com/office/word/2010/wordprocessingCanvas" xmlns:cx="http://schemas.microsoft.com/office/drawing/2014/chartex" xmlns:cx1="http://schemas.microsoft.com/office/drawing/2015/9/8/chartex" xmlns:mc="http://schemas.openxmlformats.org/markup-compatibility/2006" xmlns:o="urn:schemas-microsoft-com:office:office" xmlns:r="http://schemas.openxmlformats.org/officeDocument/2006/relationships" xmlns:m="http://schemas.openxmlformats.org/officeDocument/2006/math" xmlns:v="urn:schemas-microsoft-com:vml" xmlns:wp14="http://schemas.microsoft.com/office/word/2010/wordprocessingDrawing" xmlns:wp="http://schemas.openxmlformats.org/drawingml/2006/wordprocessingDrawing" xmlns:w10="urn:schemas-microsoft-com:office:word" xmlns:w="http://schemas.openxmlformats.org/wordprocessingml/2006/main" xmlns:w14="http://schemas.microsoft.com/office/word/2010/wordml" xmlns:w15="http://schemas.microsoft.com/office/word/2012/wordml" xmlns:w16se="http://schemas.microsoft.com/office/word/2015/wordml/symex" xmlns:wpg="http://schemas.microsoft.com/office/word/2010/wordprocessingGroup" xmlns:wpi="http://schemas.microsoft.com/office/word/2010/wordprocessingInk" xmlns:wne="http://schemas.microsoft.com/office/word/2006/wordml" xmlns:wps="http://schemas.microsoft.com/office/word/2010/wordprocessingShape" mc:Ignorable="w14 w15 w16se wp14">
+<w:hdr xmlns:wpc="http://schemas.microsoft.com/office/word/2010/wordprocessingCanvas" xmlns:cx="http://schemas.microsoft.com/office/drawing/2014/chartex" xmlns:cx1="http://schemas.microsoft.com/office/drawing/2015/9/8/chartex" xmlns:cx2="http://schemas.microsoft.com/office/drawing/2015/10/21/chartex" xmlns:cx3="http://schemas.microsoft.com/office/drawing/2016/5/9/chartex" xmlns:cx4="http://schemas.microsoft.com/office/drawing/2016/5/10/chartex" xmlns:cx5="http://schemas.microsoft.com/office/drawing/2016/5/11/chartex" xmlns:cx6="http://schemas.microsoft.com/office/drawing/2016/5/12/chartex" xmlns:cx7="http://schemas.microsoft.com/office/drawing/2016/5/13/chartex" xmlns:cx8="http://schemas.microsoft.com/office/drawing/2016/5/14/chartex" xmlns:mc="http://schemas.openxmlformats.org/markup-compatibility/2006" xmlns:aink="http://schemas.microsoft.com/office/drawing/2016/ink" xmlns:am3d="http://schemas.microsoft.com/office/drawing/2017/model3d" xmlns:o="urn:schemas-microsoft-com:office:office" xmlns:oel="http://schemas.microsoft.com/office/2019/extlst" xmlns:r="http://schemas.openxmlformats.org/officeDocument/2006/relationships" xmlns:m="http://schemas.openxmlformats.org/officeDocument/2006/math" xmlns:v="urn:schemas-microsoft-com:vml" xmlns:wp14="http://schemas.microsoft.com/office/word/2010/wordprocessingDrawing" xmlns:wp="http://schemas.openxmlformats.org/drawingml/2006/wordprocessingDrawing" xmlns:w10="urn:schemas-microsoft-com:office:word" xmlns:w="http://schemas.openxmlformats.org/wordprocessingml/2006/main" xmlns:w14="http://schemas.microsoft.com/office/word/2010/wordml" xmlns:w15="http://schemas.microsoft.com/office/word/2012/wordml" xmlns:w16cex="http://schemas.microsoft.com/office/word/2018/wordml/cex" xmlns:w16cid="http://schemas.microsoft.com/office/word/2016/wordml/cid" xmlns:w16="http://schemas.microsoft.com/office/word/2018/wordml" xmlns:w16du="http://schemas.microsoft.com/office/word/2023/wordml/word16du" xmlns:w16sdtdh="http://schemas.microsoft.com/office/word/2020/wordml/sdtdatahash" xmlns:w16sdtfl="http://schemas.microsoft.com/office/word/2024/wordml/sdtformatlock" xmlns:w16se="http://schemas.microsoft.com/office/word/2015/wordml/symex" xmlns:wpg="http://schemas.microsoft.com/office/word/2010/wordprocessingGroup" xmlns:wpi="http://schemas.microsoft.com/office/word/2010/wordprocessingInk" xmlns:wne="http://schemas.microsoft.com/office/word/2006/wordml" xmlns:wps="http://schemas.microsoft.com/office/word/2010/wordprocessingShape" mc:Ignorable="w14 w15 w16se w16cid w16 w16cex w16sdtdh w16sdtfl w16du wp14">
   <w:p>
     <w:pPr>
       <w:pStyle w:val="Header"/>
@@ -7515,7 +10489,7 @@
 </file>
 
 <file path=word/styles.xml><?xml version="1.0" encoding="utf-8"?>
-<w:styles xmlns:mc="http://schemas.openxmlformats.org/markup-compatibility/2006" xmlns:r="http://schemas.openxmlformats.org/officeDocument/2006/relationships" xmlns:w="http://schemas.openxmlformats.org/wordprocessingml/2006/main" xmlns:w14="http://schemas.microsoft.com/office/word/2010/wordml" xmlns:w15="http://schemas.microsoft.com/office/word/2012/wordml" xmlns:w16se="http://schemas.microsoft.com/office/word/2015/wordml/symex" mc:Ignorable="w14 w15 w16se">
+<w:styles xmlns:mc="http://schemas.openxmlformats.org/markup-compatibility/2006" xmlns:r="http://schemas.openxmlformats.org/officeDocument/2006/relationships" xmlns:w="http://schemas.openxmlformats.org/wordprocessingml/2006/main" xmlns:w14="http://schemas.microsoft.com/office/word/2010/wordml" xmlns:w15="http://schemas.microsoft.com/office/word/2012/wordml" xmlns:w16cex="http://schemas.microsoft.com/office/word/2018/wordml/cex" xmlns:w16cid="http://schemas.microsoft.com/office/word/2016/wordml/cid" xmlns:w16="http://schemas.microsoft.com/office/word/2018/wordml" xmlns:w16du="http://schemas.microsoft.com/office/word/2023/wordml/word16du" xmlns:w16sdtdh="http://schemas.microsoft.com/office/word/2020/wordml/sdtdatahash" xmlns:w16sdtfl="http://schemas.microsoft.com/office/word/2024/wordml/sdtformatlock" xmlns:w16se="http://schemas.microsoft.com/office/word/2015/wordml/symex" mc:Ignorable="w14 w15 w16se w16cid w16 w16cex w16sdtdh w16sdtfl w16du">
   <w:docDefaults>
     <w:rPrDefault>
       <w:rPr>
@@ -7525,7 +10499,7 @@
     </w:rPrDefault>
     <w:pPrDefault/>
   </w:docDefaults>
-  <w:latentStyles w:defLockedState="0" w:defUIPriority="99" w:defSemiHidden="0" w:defUnhideWhenUsed="0" w:defQFormat="0" w:count="371">
+  <w:latentStyles w:defLockedState="0" w:defUIPriority="99" w:defSemiHidden="0" w:defUnhideWhenUsed="0" w:defQFormat="0" w:count="376">
     <w:lsdException w:name="Normal" w:uiPriority="0" w:qFormat="1"/>
     <w:lsdException w:name="heading 1" w:uiPriority="9" w:qFormat="1"/>
     <w:lsdException w:name="heading 2" w:semiHidden="1" w:uiPriority="9" w:unhideWhenUsed="1" w:qFormat="1"/>
@@ -7897,11 +10871,16 @@
     <w:lsdException w:name="List Table 5 Dark Accent 6" w:uiPriority="50"/>
     <w:lsdException w:name="List Table 6 Colorful Accent 6" w:uiPriority="51"/>
     <w:lsdException w:name="List Table 7 Colorful Accent 6" w:uiPriority="52"/>
+    <w:lsdException w:name="Mention" w:semiHidden="1" w:unhideWhenUsed="1"/>
+    <w:lsdException w:name="Smart Hyperlink" w:semiHidden="1" w:unhideWhenUsed="1"/>
+    <w:lsdException w:name="Hashtag" w:semiHidden="1" w:unhideWhenUsed="1"/>
+    <w:lsdException w:name="Unresolved Mention" w:semiHidden="1" w:unhideWhenUsed="1"/>
+    <w:lsdException w:name="Smart Link" w:semiHidden="1" w:unhideWhenUsed="1"/>
   </w:latentStyles>
   <w:style w:type="paragraph" w:default="1" w:styleId="Normal">
     <w:name w:val="Normal"/>
     <w:qFormat/>
-    <w:rsid w:val="00076C05"/>
+    <w:rsid w:val="005A2BA7"/>
     <w:pPr>
       <w:spacing w:before="120" w:line="276" w:lineRule="auto"/>
     </w:pPr>

</xml_diff>